<commit_message>
feat: CBG economics under SATAT pricing, SIAM FE mileage anchor
Rs/MJ procurement: ethanol 2.94 (+63% vs petrol displaced) vs SATAT CBG
1.16 (+23% vs spot RLNG; undercuts LNG above ~$14.8/MMBtu) — renewable
MJ via CBG is 2.5x cheaper than via ethanol. Rs/km on SIAM BS-VI FE
declarations (petrol 16.67 kmpl, CNG 27.40 km/kg, +40.3% same-nameplate
uplift): CNG 2.74 vs petrol E20 6.56. CBO 1->5%: Rs378->1,891 cr/yr,
pump +Rs0.12->0.59/kg, mileage -0.02->-0.11% — vs E20's silent 4%.
Paper gains section 6 (CBG economics); caveats now section 8.

Co-Authored-By: Claude Fable 5 <noreply@anthropic.com>
</commit_message>
<xml_diff>
--- a/docs/Energy_Blend_Volume_Dividend.docx
+++ b/docs/Energy_Blend_Volume_Dividend.docx
@@ -7318,7 +7318,1882 @@
           <w:sz w:val="28"/>
           <w:szCs w:val="28"/>
         </w:rPr>
-        <w:t xml:space="preserve">6. Price-adjustment scenarios: what would neutralise the mileage loss</w:t>
+        <w:t xml:space="preserve">6. CBG economics under SATAT pricing</w:t>
+      </w:r>
+    </w:p>
+    <w:p>
+      <w:pPr>
+        <w:spacing w:after="160" w:before="0"/>
+      </w:pPr>
+      <w:r>
+        <w:rPr>
+          <w:rFonts w:ascii="Calibri" w:cs="Calibri" w:eastAsia="Calibri" w:hAnsi="Calibri"/>
+          <w:color w:val="1a1a2e"/>
+          <w:sz w:val="21"/>
+          <w:szCs w:val="21"/>
+        </w:rPr>
+        <w:t xml:space="preserve">Anchoring mileage on the SIAM/ARAI BS-VI fuel-efficiency declarations (303 models): petrol 16.67 kmpl, diesel 17.91 kmpl, CNG 27.40 km/kg — and, decisively, the same nameplate travels +40.3% further per unit on CNG than on petrol (11 factory petrol/CNG pairs).</w:t>
+      </w:r>
+    </w:p>
+    <w:p>
+      <w:pPr>
+        <w:pStyle w:val="Heading2"/>
+        <w:spacing w:after="120" w:before="240"/>
+      </w:pPr>
+      <w:r>
+        <w:rPr>
+          <w:rFonts w:ascii="Calibri" w:cs="Calibri" w:eastAsia="Calibri" w:hAnsi="Calibri"/>
+          <w:b/>
+          <w:bCs/>
+          <w:color w:val="1a1a2e"/>
+          <w:sz w:val="24"/>
+          <w:szCs w:val="24"/>
+        </w:rPr>
+        <w:t xml:space="preserve">6a. What a megajoule costs to procure</w:t>
+      </w:r>
+    </w:p>
+    <w:tbl>
+      <w:tblPr>
+        <w:tblW w:type="dxa" w:w="7600"/>
+        <w:tblBorders>
+          <w:top w:val="single" w:color="c8d2dc" w:sz="2"/>
+          <w:left w:val="single" w:color="c8d2dc" w:sz="2"/>
+          <w:bottom w:val="single" w:color="c8d2dc" w:sz="2"/>
+          <w:right w:val="single" w:color="c8d2dc" w:sz="2"/>
+          <w:insideH w:val="single" w:color="c8d2dc" w:sz="2"/>
+          <w:insideV w:val="single" w:color="c8d2dc" w:sz="2"/>
+        </w:tblBorders>
+      </w:tblPr>
+      <w:tblGrid>
+        <w:gridCol w:w="3400"/>
+        <w:gridCol w:w="1200"/>
+        <w:gridCol w:w="3000"/>
+      </w:tblGrid>
+      <w:tr>
+        <w:trPr>
+          <w:tblHeader/>
+        </w:trPr>
+        <w:tc>
+          <w:tcPr>
+            <w:tcW w:type="dxa" w:w="3400"/>
+            <w:shd w:fill="0f4c81" w:val="clear"/>
+            <w:tcMar>
+              <w:top w:type="dxa" w:w="70"/>
+              <w:left w:type="dxa" w:w="110"/>
+              <w:bottom w:type="dxa" w:w="70"/>
+              <w:right w:type="dxa" w:w="110"/>
+            </w:tcMar>
+          </w:tcPr>
+          <w:p>
+            <w:pPr>
+              <w:jc w:val="left"/>
+            </w:pPr>
+            <w:r>
+              <w:rPr>
+                <w:rFonts w:ascii="Calibri" w:cs="Calibri" w:eastAsia="Calibri" w:hAnsi="Calibri"/>
+                <w:b/>
+                <w:bCs/>
+                <w:color w:val="ffffff"/>
+                <w:sz w:val="19"/>
+                <w:szCs w:val="19"/>
+              </w:rPr>
+              <w:t xml:space="preserve">Source</w:t>
+            </w:r>
+          </w:p>
+        </w:tc>
+        <w:tc>
+          <w:tcPr>
+            <w:tcW w:type="dxa" w:w="1200"/>
+            <w:shd w:fill="0f4c81" w:val="clear"/>
+            <w:tcMar>
+              <w:top w:type="dxa" w:w="70"/>
+              <w:left w:type="dxa" w:w="110"/>
+              <w:bottom w:type="dxa" w:w="70"/>
+              <w:right w:type="dxa" w:w="110"/>
+            </w:tcMar>
+          </w:tcPr>
+          <w:p>
+            <w:pPr>
+              <w:jc w:val="right"/>
+            </w:pPr>
+            <w:r>
+              <w:rPr>
+                <w:rFonts w:ascii="Calibri" w:cs="Calibri" w:eastAsia="Calibri" w:hAnsi="Calibri"/>
+                <w:b/>
+                <w:bCs/>
+                <w:color w:val="ffffff"/>
+                <w:sz w:val="19"/>
+                <w:szCs w:val="19"/>
+              </w:rPr>
+              <w:t xml:space="preserve">₹/MJ</w:t>
+            </w:r>
+          </w:p>
+        </w:tc>
+        <w:tc>
+          <w:tcPr>
+            <w:tcW w:type="dxa" w:w="3000"/>
+            <w:shd w:fill="0f4c81" w:val="clear"/>
+            <w:tcMar>
+              <w:top w:type="dxa" w:w="70"/>
+              <w:left w:type="dxa" w:w="110"/>
+              <w:bottom w:type="dxa" w:w="70"/>
+              <w:right w:type="dxa" w:w="110"/>
+            </w:tcMar>
+          </w:tcPr>
+          <w:p>
+            <w:pPr>
+              <w:jc w:val="right"/>
+            </w:pPr>
+            <w:r>
+              <w:rPr>
+                <w:rFonts w:ascii="Calibri" w:cs="Calibri" w:eastAsia="Calibri" w:hAnsi="Calibri"/>
+                <w:b/>
+                <w:bCs/>
+                <w:color w:val="ffffff"/>
+                <w:sz w:val="19"/>
+                <w:szCs w:val="19"/>
+              </w:rPr>
+              <w:t xml:space="preserve">Basis</w:t>
+            </w:r>
+          </w:p>
+        </w:tc>
+      </w:tr>
+      <w:tr>
+        <w:tc>
+          <w:tcPr>
+            <w:tcW w:type="dxa" w:w="3400"/>
+            <w:shd w:fill="ffffff" w:val="clear"/>
+            <w:tcMar>
+              <w:top w:type="dxa" w:w="70"/>
+              <w:left w:type="dxa" w:w="110"/>
+              <w:bottom w:type="dxa" w:w="70"/>
+              <w:right w:type="dxa" w:w="110"/>
+            </w:tcMar>
+          </w:tcPr>
+          <w:p>
+            <w:pPr>
+              <w:jc w:val="left"/>
+            </w:pPr>
+            <w:r>
+              <w:rPr>
+                <w:rFonts w:ascii="Calibri" w:cs="Calibri" w:eastAsia="Calibri" w:hAnsi="Calibri"/>
+                <w:b w:val="false"/>
+                <w:bCs w:val="false"/>
+                <w:color w:val="1a1a2e"/>
+                <w:sz w:val="19"/>
+                <w:szCs w:val="19"/>
+              </w:rPr>
+              <w:t xml:space="preserve">Petrol (refinery / trade parity)</w:t>
+            </w:r>
+          </w:p>
+        </w:tc>
+        <w:tc>
+          <w:tcPr>
+            <w:tcW w:type="dxa" w:w="1200"/>
+            <w:shd w:fill="ffffff" w:val="clear"/>
+            <w:tcMar>
+              <w:top w:type="dxa" w:w="70"/>
+              <w:left w:type="dxa" w:w="110"/>
+              <w:bottom w:type="dxa" w:w="70"/>
+              <w:right w:type="dxa" w:w="110"/>
+            </w:tcMar>
+          </w:tcPr>
+          <w:p>
+            <w:pPr>
+              <w:jc w:val="right"/>
+            </w:pPr>
+            <w:r>
+              <w:rPr>
+                <w:rFonts w:ascii="Calibri" w:cs="Calibri" w:eastAsia="Calibri" w:hAnsi="Calibri"/>
+                <w:b w:val="false"/>
+                <w:bCs w:val="false"/>
+                <w:color w:val="1a1a2e"/>
+                <w:sz w:val="19"/>
+                <w:szCs w:val="19"/>
+              </w:rPr>
+              <w:t xml:space="preserve">1.81</w:t>
+            </w:r>
+          </w:p>
+        </w:tc>
+        <w:tc>
+          <w:tcPr>
+            <w:tcW w:type="dxa" w:w="3000"/>
+            <w:shd w:fill="ffffff" w:val="clear"/>
+            <w:tcMar>
+              <w:top w:type="dxa" w:w="70"/>
+              <w:left w:type="dxa" w:w="110"/>
+              <w:bottom w:type="dxa" w:w="70"/>
+              <w:right w:type="dxa" w:w="110"/>
+            </w:tcMar>
+          </w:tcPr>
+          <w:p>
+            <w:pPr>
+              <w:jc w:val="right"/>
+            </w:pPr>
+            <w:r>
+              <w:rPr>
+                <w:rFonts w:ascii="Calibri" w:cs="Calibri" w:eastAsia="Calibri" w:hAnsi="Calibri"/>
+                <w:b w:val="false"/>
+                <w:bCs w:val="false"/>
+                <w:color w:val="1a1a2e"/>
+                <w:sz w:val="19"/>
+                <w:szCs w:val="19"/>
+              </w:rPr>
+              <w:t xml:space="preserve">₹58/L</w:t>
+            </w:r>
+          </w:p>
+        </w:tc>
+      </w:tr>
+      <w:tr>
+        <w:tc>
+          <w:tcPr>
+            <w:tcW w:type="dxa" w:w="3400"/>
+            <w:shd w:fill="eef3f8" w:val="clear"/>
+            <w:tcMar>
+              <w:top w:type="dxa" w:w="70"/>
+              <w:left w:type="dxa" w:w="110"/>
+              <w:bottom w:type="dxa" w:w="70"/>
+              <w:right w:type="dxa" w:w="110"/>
+            </w:tcMar>
+          </w:tcPr>
+          <w:p>
+            <w:pPr>
+              <w:jc w:val="left"/>
+            </w:pPr>
+            <w:r>
+              <w:rPr>
+                <w:rFonts w:ascii="Calibri" w:cs="Calibri" w:eastAsia="Calibri" w:hAnsi="Calibri"/>
+                <w:b w:val="false"/>
+                <w:bCs w:val="false"/>
+                <w:color w:val="1a1a2e"/>
+                <w:sz w:val="19"/>
+                <w:szCs w:val="19"/>
+              </w:rPr>
+              <w:t xml:space="preserve">Ethanol (OMC procurement)</w:t>
+            </w:r>
+          </w:p>
+        </w:tc>
+        <w:tc>
+          <w:tcPr>
+            <w:tcW w:type="dxa" w:w="1200"/>
+            <w:shd w:fill="eef3f8" w:val="clear"/>
+            <w:tcMar>
+              <w:top w:type="dxa" w:w="70"/>
+              <w:left w:type="dxa" w:w="110"/>
+              <w:bottom w:type="dxa" w:w="70"/>
+              <w:right w:type="dxa" w:w="110"/>
+            </w:tcMar>
+          </w:tcPr>
+          <w:p>
+            <w:pPr>
+              <w:jc w:val="right"/>
+            </w:pPr>
+            <w:r>
+              <w:rPr>
+                <w:rFonts w:ascii="Calibri" w:cs="Calibri" w:eastAsia="Calibri" w:hAnsi="Calibri"/>
+                <w:b w:val="false"/>
+                <w:bCs w:val="false"/>
+                <w:color w:val="1a1a2e"/>
+                <w:sz w:val="19"/>
+                <w:szCs w:val="19"/>
+              </w:rPr>
+              <w:t xml:space="preserve">2.94</w:t>
+            </w:r>
+          </w:p>
+        </w:tc>
+        <w:tc>
+          <w:tcPr>
+            <w:tcW w:type="dxa" w:w="3000"/>
+            <w:shd w:fill="eef3f8" w:val="clear"/>
+            <w:tcMar>
+              <w:top w:type="dxa" w:w="70"/>
+              <w:left w:type="dxa" w:w="110"/>
+              <w:bottom w:type="dxa" w:w="70"/>
+              <w:right w:type="dxa" w:w="110"/>
+            </w:tcMar>
+          </w:tcPr>
+          <w:p>
+            <w:pPr>
+              <w:jc w:val="right"/>
+            </w:pPr>
+            <w:r>
+              <w:rPr>
+                <w:rFonts w:ascii="Calibri" w:cs="Calibri" w:eastAsia="Calibri" w:hAnsi="Calibri"/>
+                <w:b w:val="false"/>
+                <w:bCs w:val="false"/>
+                <w:color w:val="1a1a2e"/>
+                <w:sz w:val="19"/>
+                <w:szCs w:val="19"/>
+              </w:rPr>
+              <w:t xml:space="preserve">₹62/L</w:t>
+            </w:r>
+          </w:p>
+        </w:tc>
+      </w:tr>
+      <w:tr>
+        <w:tc>
+          <w:tcPr>
+            <w:tcW w:type="dxa" w:w="3400"/>
+            <w:shd w:fill="ffffff" w:val="clear"/>
+            <w:tcMar>
+              <w:top w:type="dxa" w:w="70"/>
+              <w:left w:type="dxa" w:w="110"/>
+              <w:bottom w:type="dxa" w:w="70"/>
+              <w:right w:type="dxa" w:w="110"/>
+            </w:tcMar>
+          </w:tcPr>
+          <w:p>
+            <w:pPr>
+              <w:jc w:val="left"/>
+            </w:pPr>
+            <w:r>
+              <w:rPr>
+                <w:rFonts w:ascii="Calibri" w:cs="Calibri" w:eastAsia="Calibri" w:hAnsi="Calibri"/>
+                <w:b w:val="false"/>
+                <w:bCs w:val="false"/>
+                <w:color w:val="1a1a2e"/>
+                <w:sz w:val="19"/>
+                <w:szCs w:val="19"/>
+              </w:rPr>
+              <w:t xml:space="preserve">Domestic APM gas</w:t>
+            </w:r>
+          </w:p>
+        </w:tc>
+        <w:tc>
+          <w:tcPr>
+            <w:tcW w:type="dxa" w:w="1200"/>
+            <w:shd w:fill="ffffff" w:val="clear"/>
+            <w:tcMar>
+              <w:top w:type="dxa" w:w="70"/>
+              <w:left w:type="dxa" w:w="110"/>
+              <w:bottom w:type="dxa" w:w="70"/>
+              <w:right w:type="dxa" w:w="110"/>
+            </w:tcMar>
+          </w:tcPr>
+          <w:p>
+            <w:pPr>
+              <w:jc w:val="right"/>
+            </w:pPr>
+            <w:r>
+              <w:rPr>
+                <w:rFonts w:ascii="Calibri" w:cs="Calibri" w:eastAsia="Calibri" w:hAnsi="Calibri"/>
+                <w:b w:val="false"/>
+                <w:bCs w:val="false"/>
+                <w:color w:val="1a1a2e"/>
+                <w:sz w:val="19"/>
+                <w:szCs w:val="19"/>
+              </w:rPr>
+              <w:t xml:space="preserve">0.51</w:t>
+            </w:r>
+          </w:p>
+        </w:tc>
+        <w:tc>
+          <w:tcPr>
+            <w:tcW w:type="dxa" w:w="3000"/>
+            <w:shd w:fill="ffffff" w:val="clear"/>
+            <w:tcMar>
+              <w:top w:type="dxa" w:w="70"/>
+              <w:left w:type="dxa" w:w="110"/>
+              <w:bottom w:type="dxa" w:w="70"/>
+              <w:right w:type="dxa" w:w="110"/>
+            </w:tcMar>
+          </w:tcPr>
+          <w:p>
+            <w:pPr>
+              <w:jc w:val="right"/>
+            </w:pPr>
+            <w:r>
+              <w:rPr>
+                <w:rFonts w:ascii="Calibri" w:cs="Calibri" w:eastAsia="Calibri" w:hAnsi="Calibri"/>
+                <w:b w:val="false"/>
+                <w:bCs w:val="false"/>
+                <w:color w:val="1a1a2e"/>
+                <w:sz w:val="19"/>
+                <w:szCs w:val="19"/>
+              </w:rPr>
+              <w:t xml:space="preserve">~₹24/kg CNG-eq</w:t>
+            </w:r>
+          </w:p>
+        </w:tc>
+      </w:tr>
+      <w:tr>
+        <w:tc>
+          <w:tcPr>
+            <w:tcW w:type="dxa" w:w="3400"/>
+            <w:shd w:fill="eef3f8" w:val="clear"/>
+            <w:tcMar>
+              <w:top w:type="dxa" w:w="70"/>
+              <w:left w:type="dxa" w:w="110"/>
+              <w:bottom w:type="dxa" w:w="70"/>
+              <w:right w:type="dxa" w:w="110"/>
+            </w:tcMar>
+          </w:tcPr>
+          <w:p>
+            <w:pPr>
+              <w:jc w:val="left"/>
+            </w:pPr>
+            <w:r>
+              <w:rPr>
+                <w:rFonts w:ascii="Calibri" w:cs="Calibri" w:eastAsia="Calibri" w:hAnsi="Calibri"/>
+                <w:b w:val="false"/>
+                <w:bCs w:val="false"/>
+                <w:color w:val="1a1a2e"/>
+                <w:sz w:val="19"/>
+                <w:szCs w:val="19"/>
+              </w:rPr>
+              <w:t xml:space="preserve">Imported spot RLNG</w:t>
+            </w:r>
+          </w:p>
+        </w:tc>
+        <w:tc>
+          <w:tcPr>
+            <w:tcW w:type="dxa" w:w="1200"/>
+            <w:shd w:fill="eef3f8" w:val="clear"/>
+            <w:tcMar>
+              <w:top w:type="dxa" w:w="70"/>
+              <w:left w:type="dxa" w:w="110"/>
+              <w:bottom w:type="dxa" w:w="70"/>
+              <w:right w:type="dxa" w:w="110"/>
+            </w:tcMar>
+          </w:tcPr>
+          <w:p>
+            <w:pPr>
+              <w:jc w:val="right"/>
+            </w:pPr>
+            <w:r>
+              <w:rPr>
+                <w:rFonts w:ascii="Calibri" w:cs="Calibri" w:eastAsia="Calibri" w:hAnsi="Calibri"/>
+                <w:b w:val="false"/>
+                <w:bCs w:val="false"/>
+                <w:color w:val="1a1a2e"/>
+                <w:sz w:val="19"/>
+                <w:szCs w:val="19"/>
+              </w:rPr>
+              <w:t xml:space="preserve">0.94</w:t>
+            </w:r>
+          </w:p>
+        </w:tc>
+        <w:tc>
+          <w:tcPr>
+            <w:tcW w:type="dxa" w:w="3000"/>
+            <w:shd w:fill="eef3f8" w:val="clear"/>
+            <w:tcMar>
+              <w:top w:type="dxa" w:w="70"/>
+              <w:left w:type="dxa" w:w="110"/>
+              <w:bottom w:type="dxa" w:w="70"/>
+              <w:right w:type="dxa" w:w="110"/>
+            </w:tcMar>
+          </w:tcPr>
+          <w:p>
+            <w:pPr>
+              <w:jc w:val="right"/>
+            </w:pPr>
+            <w:r>
+              <w:rPr>
+                <w:rFonts w:ascii="Calibri" w:cs="Calibri" w:eastAsia="Calibri" w:hAnsi="Calibri"/>
+                <w:b w:val="false"/>
+                <w:bCs w:val="false"/>
+                <w:color w:val="1a1a2e"/>
+                <w:sz w:val="19"/>
+                <w:szCs w:val="19"/>
+              </w:rPr>
+              <w:t xml:space="preserve">~₹45/kg CNG-eq ($12/MMBtu)</w:t>
+            </w:r>
+          </w:p>
+        </w:tc>
+      </w:tr>
+      <w:tr>
+        <w:tc>
+          <w:tcPr>
+            <w:tcW w:type="dxa" w:w="3400"/>
+            <w:shd w:fill="ffffff" w:val="clear"/>
+            <w:tcMar>
+              <w:top w:type="dxa" w:w="70"/>
+              <w:left w:type="dxa" w:w="110"/>
+              <w:bottom w:type="dxa" w:w="70"/>
+              <w:right w:type="dxa" w:w="110"/>
+            </w:tcMar>
+          </w:tcPr>
+          <w:p>
+            <w:pPr>
+              <w:jc w:val="left"/>
+            </w:pPr>
+            <w:r>
+              <w:rPr>
+                <w:rFonts w:ascii="Calibri" w:cs="Calibri" w:eastAsia="Calibri" w:hAnsi="Calibri"/>
+                <w:b w:val="false"/>
+                <w:bCs w:val="false"/>
+                <w:color w:val="1a1a2e"/>
+                <w:sz w:val="19"/>
+                <w:szCs w:val="19"/>
+              </w:rPr>
+              <w:t xml:space="preserve">CBG (SATAT assured)</w:t>
+            </w:r>
+          </w:p>
+        </w:tc>
+        <w:tc>
+          <w:tcPr>
+            <w:tcW w:type="dxa" w:w="1200"/>
+            <w:shd w:fill="ffffff" w:val="clear"/>
+            <w:tcMar>
+              <w:top w:type="dxa" w:w="70"/>
+              <w:left w:type="dxa" w:w="110"/>
+              <w:bottom w:type="dxa" w:w="70"/>
+              <w:right w:type="dxa" w:w="110"/>
+            </w:tcMar>
+          </w:tcPr>
+          <w:p>
+            <w:pPr>
+              <w:jc w:val="right"/>
+            </w:pPr>
+            <w:r>
+              <w:rPr>
+                <w:rFonts w:ascii="Calibri" w:cs="Calibri" w:eastAsia="Calibri" w:hAnsi="Calibri"/>
+                <w:b w:val="false"/>
+                <w:bCs w:val="false"/>
+                <w:color w:val="1a1a2e"/>
+                <w:sz w:val="19"/>
+                <w:szCs w:val="19"/>
+              </w:rPr>
+              <w:t xml:space="preserve">1.16</w:t>
+            </w:r>
+          </w:p>
+        </w:tc>
+        <w:tc>
+          <w:tcPr>
+            <w:tcW w:type="dxa" w:w="3000"/>
+            <w:shd w:fill="ffffff" w:val="clear"/>
+            <w:tcMar>
+              <w:top w:type="dxa" w:w="70"/>
+              <w:left w:type="dxa" w:w="110"/>
+              <w:bottom w:type="dxa" w:w="70"/>
+              <w:right w:type="dxa" w:w="110"/>
+            </w:tcMar>
+          </w:tcPr>
+          <w:p>
+            <w:pPr>
+              <w:jc w:val="right"/>
+            </w:pPr>
+            <w:r>
+              <w:rPr>
+                <w:rFonts w:ascii="Calibri" w:cs="Calibri" w:eastAsia="Calibri" w:hAnsi="Calibri"/>
+                <w:b w:val="false"/>
+                <w:bCs w:val="false"/>
+                <w:color w:val="1a1a2e"/>
+                <w:sz w:val="19"/>
+                <w:szCs w:val="19"/>
+              </w:rPr>
+              <w:t xml:space="preserve">₹54/kg ex-plant + 5% GST</w:t>
+            </w:r>
+          </w:p>
+        </w:tc>
+      </w:tr>
+    </w:tbl>
+    <w:p>
+      <w:pPr>
+        <w:spacing w:after="120" w:before="0"/>
+      </w:pPr>
+      <w:r>
+        <w:rPr>
+          <w:rFonts w:ascii="Calibri" w:cs="Calibri" w:eastAsia="Calibri" w:hAnsi="Calibri"/>
+          <w:color w:val="1a1a2e"/>
+          <w:sz w:val="21"/>
+          <w:szCs w:val="21"/>
+        </w:rPr>
+        <w:t xml:space="preserve"/>
+      </w:r>
+    </w:p>
+    <w:p>
+      <w:pPr>
+        <w:spacing w:after="160" w:before="0"/>
+      </w:pPr>
+      <w:r>
+        <w:rPr>
+          <w:rFonts w:ascii="Calibri" w:cs="Calibri" w:eastAsia="Calibri" w:hAnsi="Calibri"/>
+          <w:color w:val="1a1a2e"/>
+          <w:sz w:val="21"/>
+          <w:szCs w:val="21"/>
+        </w:rPr>
+        <w:t xml:space="preserve">Ethanol's renewable premium over the petrol it displaces is +63% per MJ — before the mileage-dilution levy on the consumer. CBG's premium over the spot RLNG it displaces is +23% per MJ, and it undercuts imported gas outright whenever spot LNG runs above ~$14.8/MMBtu. Per megajoule of renewable energy bought, SATAT CBG (₹1.16) is 2.5× cheaper than ethanol (₹2.94), with no volumetric side effects.</w:t>
+      </w:r>
+    </w:p>
+    <w:p>
+      <w:pPr>
+        <w:pStyle w:val="Heading2"/>
+        <w:spacing w:after="120" w:before="240"/>
+      </w:pPr>
+      <w:r>
+        <w:rPr>
+          <w:rFonts w:ascii="Calibri" w:cs="Calibri" w:eastAsia="Calibri" w:hAnsi="Calibri"/>
+          <w:b/>
+          <w:bCs/>
+          <w:color w:val="1a1a2e"/>
+          <w:sz w:val="24"/>
+          <w:szCs w:val="24"/>
+        </w:rPr>
+        <w:t xml:space="preserve">6b. Cost per km on SIAM/ARAI declared FE (Delhi prices)</w:t>
+      </w:r>
+    </w:p>
+    <w:tbl>
+      <w:tblPr>
+        <w:tblW w:type="dxa" w:w="7300"/>
+        <w:tblBorders>
+          <w:top w:val="single" w:color="c8d2dc" w:sz="2"/>
+          <w:left w:val="single" w:color="c8d2dc" w:sz="2"/>
+          <w:bottom w:val="single" w:color="c8d2dc" w:sz="2"/>
+          <w:right w:val="single" w:color="c8d2dc" w:sz="2"/>
+          <w:insideH w:val="single" w:color="c8d2dc" w:sz="2"/>
+          <w:insideV w:val="single" w:color="c8d2dc" w:sz="2"/>
+        </w:tblBorders>
+      </w:tblPr>
+      <w:tblGrid>
+        <w:gridCol w:w="2400"/>
+        <w:gridCol w:w="1300"/>
+        <w:gridCol w:w="3600"/>
+      </w:tblGrid>
+      <w:tr>
+        <w:trPr>
+          <w:tblHeader/>
+        </w:trPr>
+        <w:tc>
+          <w:tcPr>
+            <w:tcW w:type="dxa" w:w="2400"/>
+            <w:shd w:fill="0f4c81" w:val="clear"/>
+            <w:tcMar>
+              <w:top w:type="dxa" w:w="70"/>
+              <w:left w:type="dxa" w:w="110"/>
+              <w:bottom w:type="dxa" w:w="70"/>
+              <w:right w:type="dxa" w:w="110"/>
+            </w:tcMar>
+          </w:tcPr>
+          <w:p>
+            <w:pPr>
+              <w:jc w:val="left"/>
+            </w:pPr>
+            <w:r>
+              <w:rPr>
+                <w:rFonts w:ascii="Calibri" w:cs="Calibri" w:eastAsia="Calibri" w:hAnsi="Calibri"/>
+                <w:b/>
+                <w:bCs/>
+                <w:color w:val="ffffff"/>
+                <w:sz w:val="19"/>
+                <w:szCs w:val="19"/>
+              </w:rPr>
+              <w:t xml:space="preserve">Fuel</w:t>
+            </w:r>
+          </w:p>
+        </w:tc>
+        <w:tc>
+          <w:tcPr>
+            <w:tcW w:type="dxa" w:w="1300"/>
+            <w:shd w:fill="0f4c81" w:val="clear"/>
+            <w:tcMar>
+              <w:top w:type="dxa" w:w="70"/>
+              <w:left w:type="dxa" w:w="110"/>
+              <w:bottom w:type="dxa" w:w="70"/>
+              <w:right w:type="dxa" w:w="110"/>
+            </w:tcMar>
+          </w:tcPr>
+          <w:p>
+            <w:pPr>
+              <w:jc w:val="right"/>
+            </w:pPr>
+            <w:r>
+              <w:rPr>
+                <w:rFonts w:ascii="Calibri" w:cs="Calibri" w:eastAsia="Calibri" w:hAnsi="Calibri"/>
+                <w:b/>
+                <w:bCs/>
+                <w:color w:val="ffffff"/>
+                <w:sz w:val="19"/>
+                <w:szCs w:val="19"/>
+              </w:rPr>
+              <w:t xml:space="preserve">₹/km</w:t>
+            </w:r>
+          </w:p>
+        </w:tc>
+        <w:tc>
+          <w:tcPr>
+            <w:tcW w:type="dxa" w:w="3600"/>
+            <w:shd w:fill="0f4c81" w:val="clear"/>
+            <w:tcMar>
+              <w:top w:type="dxa" w:w="70"/>
+              <w:left w:type="dxa" w:w="110"/>
+              <w:bottom w:type="dxa" w:w="70"/>
+              <w:right w:type="dxa" w:w="110"/>
+            </w:tcMar>
+          </w:tcPr>
+          <w:p>
+            <w:pPr>
+              <w:jc w:val="right"/>
+            </w:pPr>
+            <w:r>
+              <w:rPr>
+                <w:rFonts w:ascii="Calibri" w:cs="Calibri" w:eastAsia="Calibri" w:hAnsi="Calibri"/>
+                <w:b/>
+                <w:bCs/>
+                <w:color w:val="ffffff"/>
+                <w:sz w:val="19"/>
+                <w:szCs w:val="19"/>
+              </w:rPr>
+              <w:t xml:space="preserve">Mileage basis</w:t>
+            </w:r>
+          </w:p>
+        </w:tc>
+      </w:tr>
+      <w:tr>
+        <w:tc>
+          <w:tcPr>
+            <w:tcW w:type="dxa" w:w="2400"/>
+            <w:shd w:fill="ffffff" w:val="clear"/>
+            <w:tcMar>
+              <w:top w:type="dxa" w:w="70"/>
+              <w:left w:type="dxa" w:w="110"/>
+              <w:bottom w:type="dxa" w:w="70"/>
+              <w:right w:type="dxa" w:w="110"/>
+            </w:tcMar>
+          </w:tcPr>
+          <w:p>
+            <w:pPr>
+              <w:jc w:val="left"/>
+            </w:pPr>
+            <w:r>
+              <w:rPr>
+                <w:rFonts w:ascii="Calibri" w:cs="Calibri" w:eastAsia="Calibri" w:hAnsi="Calibri"/>
+                <w:b w:val="false"/>
+                <w:bCs w:val="false"/>
+                <w:color w:val="1a1a2e"/>
+                <w:sz w:val="19"/>
+                <w:szCs w:val="19"/>
+              </w:rPr>
+              <w:t xml:space="preserve">Petrol E0</w:t>
+            </w:r>
+          </w:p>
+        </w:tc>
+        <w:tc>
+          <w:tcPr>
+            <w:tcW w:type="dxa" w:w="1300"/>
+            <w:shd w:fill="ffffff" w:val="clear"/>
+            <w:tcMar>
+              <w:top w:type="dxa" w:w="70"/>
+              <w:left w:type="dxa" w:w="110"/>
+              <w:bottom w:type="dxa" w:w="70"/>
+              <w:right w:type="dxa" w:w="110"/>
+            </w:tcMar>
+          </w:tcPr>
+          <w:p>
+            <w:pPr>
+              <w:jc w:val="right"/>
+            </w:pPr>
+            <w:r>
+              <w:rPr>
+                <w:rFonts w:ascii="Calibri" w:cs="Calibri" w:eastAsia="Calibri" w:hAnsi="Calibri"/>
+                <w:b w:val="false"/>
+                <w:bCs w:val="false"/>
+                <w:color w:val="1a1a2e"/>
+                <w:sz w:val="19"/>
+                <w:szCs w:val="19"/>
+              </w:rPr>
+              <w:t xml:space="preserve">6.30</w:t>
+            </w:r>
+          </w:p>
+        </w:tc>
+        <w:tc>
+          <w:tcPr>
+            <w:tcW w:type="dxa" w:w="3600"/>
+            <w:shd w:fill="ffffff" w:val="clear"/>
+            <w:tcMar>
+              <w:top w:type="dxa" w:w="70"/>
+              <w:left w:type="dxa" w:w="110"/>
+              <w:bottom w:type="dxa" w:w="70"/>
+              <w:right w:type="dxa" w:w="110"/>
+            </w:tcMar>
+          </w:tcPr>
+          <w:p>
+            <w:pPr>
+              <w:jc w:val="right"/>
+            </w:pPr>
+            <w:r>
+              <w:rPr>
+                <w:rFonts w:ascii="Calibri" w:cs="Calibri" w:eastAsia="Calibri" w:hAnsi="Calibri"/>
+                <w:b w:val="false"/>
+                <w:bCs w:val="false"/>
+                <w:color w:val="1a1a2e"/>
+                <w:sz w:val="19"/>
+                <w:szCs w:val="19"/>
+              </w:rPr>
+              <w:t xml:space="preserve">16.67 kmpl (SIAM declared)</w:t>
+            </w:r>
+          </w:p>
+        </w:tc>
+      </w:tr>
+      <w:tr>
+        <w:tc>
+          <w:tcPr>
+            <w:tcW w:type="dxa" w:w="2400"/>
+            <w:shd w:fill="eef3f8" w:val="clear"/>
+            <w:tcMar>
+              <w:top w:type="dxa" w:w="70"/>
+              <w:left w:type="dxa" w:w="110"/>
+              <w:bottom w:type="dxa" w:w="70"/>
+              <w:right w:type="dxa" w:w="110"/>
+            </w:tcMar>
+          </w:tcPr>
+          <w:p>
+            <w:pPr>
+              <w:jc w:val="left"/>
+            </w:pPr>
+            <w:r>
+              <w:rPr>
+                <w:rFonts w:ascii="Calibri" w:cs="Calibri" w:eastAsia="Calibri" w:hAnsi="Calibri"/>
+                <w:b w:val="false"/>
+                <w:bCs w:val="false"/>
+                <w:color w:val="1a1a2e"/>
+                <w:sz w:val="19"/>
+                <w:szCs w:val="19"/>
+              </w:rPr>
+              <w:t xml:space="preserve">Petrol E20</w:t>
+            </w:r>
+          </w:p>
+        </w:tc>
+        <w:tc>
+          <w:tcPr>
+            <w:tcW w:type="dxa" w:w="1300"/>
+            <w:shd w:fill="eef3f8" w:val="clear"/>
+            <w:tcMar>
+              <w:top w:type="dxa" w:w="70"/>
+              <w:left w:type="dxa" w:w="110"/>
+              <w:bottom w:type="dxa" w:w="70"/>
+              <w:right w:type="dxa" w:w="110"/>
+            </w:tcMar>
+          </w:tcPr>
+          <w:p>
+            <w:pPr>
+              <w:jc w:val="right"/>
+            </w:pPr>
+            <w:r>
+              <w:rPr>
+                <w:rFonts w:ascii="Calibri" w:cs="Calibri" w:eastAsia="Calibri" w:hAnsi="Calibri"/>
+                <w:b w:val="false"/>
+                <w:bCs w:val="false"/>
+                <w:color w:val="1a1a2e"/>
+                <w:sz w:val="19"/>
+                <w:szCs w:val="19"/>
+              </w:rPr>
+              <w:t xml:space="preserve">6.56</w:t>
+            </w:r>
+          </w:p>
+        </w:tc>
+        <w:tc>
+          <w:tcPr>
+            <w:tcW w:type="dxa" w:w="3600"/>
+            <w:shd w:fill="eef3f8" w:val="clear"/>
+            <w:tcMar>
+              <w:top w:type="dxa" w:w="70"/>
+              <w:left w:type="dxa" w:w="110"/>
+              <w:bottom w:type="dxa" w:w="70"/>
+              <w:right w:type="dxa" w:w="110"/>
+            </w:tcMar>
+          </w:tcPr>
+          <w:p>
+            <w:pPr>
+              <w:jc w:val="right"/>
+            </w:pPr>
+            <w:r>
+              <w:rPr>
+                <w:rFonts w:ascii="Calibri" w:cs="Calibri" w:eastAsia="Calibri" w:hAnsi="Calibri"/>
+                <w:b w:val="false"/>
+                <w:bCs w:val="false"/>
+                <w:color w:val="1a1a2e"/>
+                <w:sz w:val="19"/>
+                <w:szCs w:val="19"/>
+              </w:rPr>
+              <w:t xml:space="preserve">E20 real-world −4%</w:t>
+            </w:r>
+          </w:p>
+        </w:tc>
+      </w:tr>
+      <w:tr>
+        <w:tc>
+          <w:tcPr>
+            <w:tcW w:type="dxa" w:w="2400"/>
+            <w:shd w:fill="ffffff" w:val="clear"/>
+            <w:tcMar>
+              <w:top w:type="dxa" w:w="70"/>
+              <w:left w:type="dxa" w:w="110"/>
+              <w:bottom w:type="dxa" w:w="70"/>
+              <w:right w:type="dxa" w:w="110"/>
+            </w:tcMar>
+          </w:tcPr>
+          <w:p>
+            <w:pPr>
+              <w:jc w:val="left"/>
+            </w:pPr>
+            <w:r>
+              <w:rPr>
+                <w:rFonts w:ascii="Calibri" w:cs="Calibri" w:eastAsia="Calibri" w:hAnsi="Calibri"/>
+                <w:b w:val="false"/>
+                <w:bCs w:val="false"/>
+                <w:color w:val="1a1a2e"/>
+                <w:sz w:val="19"/>
+                <w:szCs w:val="19"/>
+              </w:rPr>
+              <w:t xml:space="preserve">Petrol E30</w:t>
+            </w:r>
+          </w:p>
+        </w:tc>
+        <w:tc>
+          <w:tcPr>
+            <w:tcW w:type="dxa" w:w="1300"/>
+            <w:shd w:fill="ffffff" w:val="clear"/>
+            <w:tcMar>
+              <w:top w:type="dxa" w:w="70"/>
+              <w:left w:type="dxa" w:w="110"/>
+              <w:bottom w:type="dxa" w:w="70"/>
+              <w:right w:type="dxa" w:w="110"/>
+            </w:tcMar>
+          </w:tcPr>
+          <w:p>
+            <w:pPr>
+              <w:jc w:val="right"/>
+            </w:pPr>
+            <w:r>
+              <w:rPr>
+                <w:rFonts w:ascii="Calibri" w:cs="Calibri" w:eastAsia="Calibri" w:hAnsi="Calibri"/>
+                <w:b w:val="false"/>
+                <w:bCs w:val="false"/>
+                <w:color w:val="1a1a2e"/>
+                <w:sz w:val="19"/>
+                <w:szCs w:val="19"/>
+              </w:rPr>
+              <w:t xml:space="preserve">6.77</w:t>
+            </w:r>
+          </w:p>
+        </w:tc>
+        <w:tc>
+          <w:tcPr>
+            <w:tcW w:type="dxa" w:w="3600"/>
+            <w:shd w:fill="ffffff" w:val="clear"/>
+            <w:tcMar>
+              <w:top w:type="dxa" w:w="70"/>
+              <w:left w:type="dxa" w:w="110"/>
+              <w:bottom w:type="dxa" w:w="70"/>
+              <w:right w:type="dxa" w:w="110"/>
+            </w:tcMar>
+          </w:tcPr>
+          <w:p>
+            <w:pPr>
+              <w:jc w:val="right"/>
+            </w:pPr>
+            <w:r>
+              <w:rPr>
+                <w:rFonts w:ascii="Calibri" w:cs="Calibri" w:eastAsia="Calibri" w:hAnsi="Calibri"/>
+                <w:b w:val="false"/>
+                <w:bCs w:val="false"/>
+                <w:color w:val="1a1a2e"/>
+                <w:sz w:val="19"/>
+                <w:szCs w:val="19"/>
+              </w:rPr>
+              <w:t xml:space="preserve">E30 real-world −7%</w:t>
+            </w:r>
+          </w:p>
+        </w:tc>
+      </w:tr>
+      <w:tr>
+        <w:tc>
+          <w:tcPr>
+            <w:tcW w:type="dxa" w:w="2400"/>
+            <w:shd w:fill="eef3f8" w:val="clear"/>
+            <w:tcMar>
+              <w:top w:type="dxa" w:w="70"/>
+              <w:left w:type="dxa" w:w="110"/>
+              <w:bottom w:type="dxa" w:w="70"/>
+              <w:right w:type="dxa" w:w="110"/>
+            </w:tcMar>
+          </w:tcPr>
+          <w:p>
+            <w:pPr>
+              <w:jc w:val="left"/>
+            </w:pPr>
+            <w:r>
+              <w:rPr>
+                <w:rFonts w:ascii="Calibri" w:cs="Calibri" w:eastAsia="Calibri" w:hAnsi="Calibri"/>
+                <w:b w:val="false"/>
+                <w:bCs w:val="false"/>
+                <w:color w:val="1a1a2e"/>
+                <w:sz w:val="19"/>
+                <w:szCs w:val="19"/>
+              </w:rPr>
+              <w:t xml:space="preserve">Diesel B0</w:t>
+            </w:r>
+          </w:p>
+        </w:tc>
+        <w:tc>
+          <w:tcPr>
+            <w:tcW w:type="dxa" w:w="1300"/>
+            <w:shd w:fill="eef3f8" w:val="clear"/>
+            <w:tcMar>
+              <w:top w:type="dxa" w:w="70"/>
+              <w:left w:type="dxa" w:w="110"/>
+              <w:bottom w:type="dxa" w:w="70"/>
+              <w:right w:type="dxa" w:w="110"/>
+            </w:tcMar>
+          </w:tcPr>
+          <w:p>
+            <w:pPr>
+              <w:jc w:val="right"/>
+            </w:pPr>
+            <w:r>
+              <w:rPr>
+                <w:rFonts w:ascii="Calibri" w:cs="Calibri" w:eastAsia="Calibri" w:hAnsi="Calibri"/>
+                <w:b w:val="false"/>
+                <w:bCs w:val="false"/>
+                <w:color w:val="1a1a2e"/>
+                <w:sz w:val="19"/>
+                <w:szCs w:val="19"/>
+              </w:rPr>
+              <w:t xml:space="preserve">5.14</w:t>
+            </w:r>
+          </w:p>
+        </w:tc>
+        <w:tc>
+          <w:tcPr>
+            <w:tcW w:type="dxa" w:w="3600"/>
+            <w:shd w:fill="eef3f8" w:val="clear"/>
+            <w:tcMar>
+              <w:top w:type="dxa" w:w="70"/>
+              <w:left w:type="dxa" w:w="110"/>
+              <w:bottom w:type="dxa" w:w="70"/>
+              <w:right w:type="dxa" w:w="110"/>
+            </w:tcMar>
+          </w:tcPr>
+          <w:p>
+            <w:pPr>
+              <w:jc w:val="right"/>
+            </w:pPr>
+            <w:r>
+              <w:rPr>
+                <w:rFonts w:ascii="Calibri" w:cs="Calibri" w:eastAsia="Calibri" w:hAnsi="Calibri"/>
+                <w:b w:val="false"/>
+                <w:bCs w:val="false"/>
+                <w:color w:val="1a1a2e"/>
+                <w:sz w:val="19"/>
+                <w:szCs w:val="19"/>
+              </w:rPr>
+              <w:t xml:space="preserve">17.91 kmpl (SIAM declared)</w:t>
+            </w:r>
+          </w:p>
+        </w:tc>
+      </w:tr>
+      <w:tr>
+        <w:tc>
+          <w:tcPr>
+            <w:tcW w:type="dxa" w:w="2400"/>
+            <w:shd w:fill="ffffff" w:val="clear"/>
+            <w:tcMar>
+              <w:top w:type="dxa" w:w="70"/>
+              <w:left w:type="dxa" w:w="110"/>
+              <w:bottom w:type="dxa" w:w="70"/>
+              <w:right w:type="dxa" w:w="110"/>
+            </w:tcMar>
+          </w:tcPr>
+          <w:p>
+            <w:pPr>
+              <w:jc w:val="left"/>
+            </w:pPr>
+            <w:r>
+              <w:rPr>
+                <w:rFonts w:ascii="Calibri" w:cs="Calibri" w:eastAsia="Calibri" w:hAnsi="Calibri"/>
+                <w:b w:val="false"/>
+                <w:bCs w:val="false"/>
+                <w:color w:val="1a1a2e"/>
+                <w:sz w:val="19"/>
+                <w:szCs w:val="19"/>
+              </w:rPr>
+              <w:t xml:space="preserve">Diesel B20</w:t>
+            </w:r>
+          </w:p>
+        </w:tc>
+        <w:tc>
+          <w:tcPr>
+            <w:tcW w:type="dxa" w:w="1300"/>
+            <w:shd w:fill="ffffff" w:val="clear"/>
+            <w:tcMar>
+              <w:top w:type="dxa" w:w="70"/>
+              <w:left w:type="dxa" w:w="110"/>
+              <w:bottom w:type="dxa" w:w="70"/>
+              <w:right w:type="dxa" w:w="110"/>
+            </w:tcMar>
+          </w:tcPr>
+          <w:p>
+            <w:pPr>
+              <w:jc w:val="right"/>
+            </w:pPr>
+            <w:r>
+              <w:rPr>
+                <w:rFonts w:ascii="Calibri" w:cs="Calibri" w:eastAsia="Calibri" w:hAnsi="Calibri"/>
+                <w:b w:val="false"/>
+                <w:bCs w:val="false"/>
+                <w:color w:val="1a1a2e"/>
+                <w:sz w:val="19"/>
+                <w:szCs w:val="19"/>
+              </w:rPr>
+              <w:t xml:space="preserve">5.23</w:t>
+            </w:r>
+          </w:p>
+        </w:tc>
+        <w:tc>
+          <w:tcPr>
+            <w:tcW w:type="dxa" w:w="3600"/>
+            <w:shd w:fill="ffffff" w:val="clear"/>
+            <w:tcMar>
+              <w:top w:type="dxa" w:w="70"/>
+              <w:left w:type="dxa" w:w="110"/>
+              <w:bottom w:type="dxa" w:w="70"/>
+              <w:right w:type="dxa" w:w="110"/>
+            </w:tcMar>
+          </w:tcPr>
+          <w:p>
+            <w:pPr>
+              <w:jc w:val="right"/>
+            </w:pPr>
+            <w:r>
+              <w:rPr>
+                <w:rFonts w:ascii="Calibri" w:cs="Calibri" w:eastAsia="Calibri" w:hAnsi="Calibri"/>
+                <w:b w:val="false"/>
+                <w:bCs w:val="false"/>
+                <w:color w:val="1a1a2e"/>
+                <w:sz w:val="19"/>
+                <w:szCs w:val="19"/>
+              </w:rPr>
+              <w:t xml:space="preserve">B20 energy basis −1.7%</w:t>
+            </w:r>
+          </w:p>
+        </w:tc>
+      </w:tr>
+      <w:tr>
+        <w:tc>
+          <w:tcPr>
+            <w:tcW w:type="dxa" w:w="2400"/>
+            <w:shd w:fill="eef3f8" w:val="clear"/>
+            <w:tcMar>
+              <w:top w:type="dxa" w:w="70"/>
+              <w:left w:type="dxa" w:w="110"/>
+              <w:bottom w:type="dxa" w:w="70"/>
+              <w:right w:type="dxa" w:w="110"/>
+            </w:tcMar>
+          </w:tcPr>
+          <w:p>
+            <w:pPr>
+              <w:jc w:val="left"/>
+            </w:pPr>
+            <w:r>
+              <w:rPr>
+                <w:rFonts w:ascii="Calibri" w:cs="Calibri" w:eastAsia="Calibri" w:hAnsi="Calibri"/>
+                <w:b w:val="false"/>
+                <w:bCs w:val="false"/>
+                <w:color w:val="1a1a2e"/>
+                <w:sz w:val="19"/>
+                <w:szCs w:val="19"/>
+              </w:rPr>
+              <w:t xml:space="preserve">CNG</w:t>
+            </w:r>
+          </w:p>
+        </w:tc>
+        <w:tc>
+          <w:tcPr>
+            <w:tcW w:type="dxa" w:w="1300"/>
+            <w:shd w:fill="eef3f8" w:val="clear"/>
+            <w:tcMar>
+              <w:top w:type="dxa" w:w="70"/>
+              <w:left w:type="dxa" w:w="110"/>
+              <w:bottom w:type="dxa" w:w="70"/>
+              <w:right w:type="dxa" w:w="110"/>
+            </w:tcMar>
+          </w:tcPr>
+          <w:p>
+            <w:pPr>
+              <w:jc w:val="right"/>
+            </w:pPr>
+            <w:r>
+              <w:rPr>
+                <w:rFonts w:ascii="Calibri" w:cs="Calibri" w:eastAsia="Calibri" w:hAnsi="Calibri"/>
+                <w:b w:val="false"/>
+                <w:bCs w:val="false"/>
+                <w:color w:val="1a1a2e"/>
+                <w:sz w:val="19"/>
+                <w:szCs w:val="19"/>
+              </w:rPr>
+              <w:t xml:space="preserve">2.74</w:t>
+            </w:r>
+          </w:p>
+        </w:tc>
+        <w:tc>
+          <w:tcPr>
+            <w:tcW w:type="dxa" w:w="3600"/>
+            <w:shd w:fill="eef3f8" w:val="clear"/>
+            <w:tcMar>
+              <w:top w:type="dxa" w:w="70"/>
+              <w:left w:type="dxa" w:w="110"/>
+              <w:bottom w:type="dxa" w:w="70"/>
+              <w:right w:type="dxa" w:w="110"/>
+            </w:tcMar>
+          </w:tcPr>
+          <w:p>
+            <w:pPr>
+              <w:jc w:val="right"/>
+            </w:pPr>
+            <w:r>
+              <w:rPr>
+                <w:rFonts w:ascii="Calibri" w:cs="Calibri" w:eastAsia="Calibri" w:hAnsi="Calibri"/>
+                <w:b w:val="false"/>
+                <w:bCs w:val="false"/>
+                <w:color w:val="1a1a2e"/>
+                <w:sz w:val="19"/>
+                <w:szCs w:val="19"/>
+              </w:rPr>
+              <w:t xml:space="preserve">27.40 km/kg (SIAM declared)</w:t>
+            </w:r>
+          </w:p>
+        </w:tc>
+      </w:tr>
+      <w:tr>
+        <w:tc>
+          <w:tcPr>
+            <w:tcW w:type="dxa" w:w="2400"/>
+            <w:shd w:fill="ffffff" w:val="clear"/>
+            <w:tcMar>
+              <w:top w:type="dxa" w:w="70"/>
+              <w:left w:type="dxa" w:w="110"/>
+              <w:bottom w:type="dxa" w:w="70"/>
+              <w:right w:type="dxa" w:w="110"/>
+            </w:tcMar>
+          </w:tcPr>
+          <w:p>
+            <w:pPr>
+              <w:jc w:val="left"/>
+            </w:pPr>
+            <w:r>
+              <w:rPr>
+                <w:rFonts w:ascii="Calibri" w:cs="Calibri" w:eastAsia="Calibri" w:hAnsi="Calibri"/>
+                <w:b w:val="false"/>
+                <w:bCs w:val="false"/>
+                <w:color w:val="1a1a2e"/>
+                <w:sz w:val="19"/>
+                <w:szCs w:val="19"/>
+              </w:rPr>
+              <w:t xml:space="preserve">CBG (any % in CNG)</w:t>
+            </w:r>
+          </w:p>
+        </w:tc>
+        <w:tc>
+          <w:tcPr>
+            <w:tcW w:type="dxa" w:w="1300"/>
+            <w:shd w:fill="ffffff" w:val="clear"/>
+            <w:tcMar>
+              <w:top w:type="dxa" w:w="70"/>
+              <w:left w:type="dxa" w:w="110"/>
+              <w:bottom w:type="dxa" w:w="70"/>
+              <w:right w:type="dxa" w:w="110"/>
+            </w:tcMar>
+          </w:tcPr>
+          <w:p>
+            <w:pPr>
+              <w:jc w:val="right"/>
+            </w:pPr>
+            <w:r>
+              <w:rPr>
+                <w:rFonts w:ascii="Calibri" w:cs="Calibri" w:eastAsia="Calibri" w:hAnsi="Calibri"/>
+                <w:b w:val="false"/>
+                <w:bCs w:val="false"/>
+                <w:color w:val="1a1a2e"/>
+                <w:sz w:val="19"/>
+                <w:szCs w:val="19"/>
+              </w:rPr>
+              <w:t xml:space="preserve">2.80</w:t>
+            </w:r>
+          </w:p>
+        </w:tc>
+        <w:tc>
+          <w:tcPr>
+            <w:tcW w:type="dxa" w:w="3600"/>
+            <w:shd w:fill="ffffff" w:val="clear"/>
+            <w:tcMar>
+              <w:top w:type="dxa" w:w="70"/>
+              <w:left w:type="dxa" w:w="110"/>
+              <w:bottom w:type="dxa" w:w="70"/>
+              <w:right w:type="dxa" w:w="110"/>
+            </w:tcMar>
+          </w:tcPr>
+          <w:p>
+            <w:pPr>
+              <w:jc w:val="right"/>
+            </w:pPr>
+            <w:r>
+              <w:rPr>
+                <w:rFonts w:ascii="Calibri" w:cs="Calibri" w:eastAsia="Calibri" w:hAnsi="Calibri"/>
+                <w:b w:val="false"/>
+                <w:bCs w:val="false"/>
+                <w:color w:val="1a1a2e"/>
+                <w:sz w:val="19"/>
+                <w:szCs w:val="19"/>
+              </w:rPr>
+              <w:t xml:space="preserve">energy-scaled 46.5 / 47.5 MJ/kg</w:t>
+            </w:r>
+          </w:p>
+        </w:tc>
+      </w:tr>
+    </w:tbl>
+    <w:p>
+      <w:pPr>
+        <w:spacing w:after="120" w:before="0"/>
+      </w:pPr>
+      <w:r>
+        <w:rPr>
+          <w:rFonts w:ascii="Calibri" w:cs="Calibri" w:eastAsia="Calibri" w:hAnsi="Calibri"/>
+          <w:color w:val="1a1a2e"/>
+          <w:sz w:val="21"/>
+          <w:szCs w:val="21"/>
+        </w:rPr>
+        <w:t xml:space="preserve"/>
+      </w:r>
+    </w:p>
+    <w:p>
+      <w:pPr>
+        <w:spacing w:after="160" w:before="0"/>
+      </w:pPr>
+      <w:r>
+        <w:rPr>
+          <w:rFonts w:ascii="Calibri" w:cs="Calibri" w:eastAsia="Calibri" w:hAnsi="Calibri"/>
+          <w:color w:val="1a1a2e"/>
+          <w:sz w:val="21"/>
+          <w:szCs w:val="21"/>
+        </w:rPr>
+        <w:t xml:space="preserve">CNG runs at ~43% of petrol's cost per km — the +40.3% distance uplift compounding the per-unit price gap. The blend walk moves petrol the wrong way (₹6.30 → ₹6.77/km from E0 to E30) while CBG blending leaves the CNG ₹/km essentially untouched: even 100% CBG at the IS 16087 purity floor costs 2.1% in mileage, and at obligation-level shares it rounds to zero.</w:t>
+      </w:r>
+    </w:p>
+    <w:p>
+      <w:pPr>
+        <w:pStyle w:val="Heading2"/>
+        <w:spacing w:after="120" w:before="240"/>
+      </w:pPr>
+      <w:r>
+        <w:rPr>
+          <w:rFonts w:ascii="Calibri" w:cs="Calibri" w:eastAsia="Calibri" w:hAnsi="Calibri"/>
+          <w:b/>
+          <w:bCs/>
+          <w:color w:val="1a1a2e"/>
+          <w:sz w:val="24"/>
+          <w:szCs w:val="24"/>
+        </w:rPr>
+        <w:t xml:space="preserve">6c. The CBG Blending Obligation: national cost, zero consumer levy</w:t>
+      </w:r>
+    </w:p>
+    <w:p>
+      <w:pPr>
+        <w:spacing w:after="160" w:before="0"/>
+      </w:pPr>
+      <w:r>
+        <w:rPr>
+          <w:rFonts w:ascii="Calibri" w:cs="Calibri" w:eastAsia="Calibri" w:hAnsi="Calibri"/>
+          <w:color w:val="1a1a2e"/>
+          <w:sz w:val="21"/>
+          <w:szCs w:val="21"/>
+        </w:rPr>
+        <w:t xml:space="preserve">CBO mandates 1% CBG in CGD gas from FY25-26, stepping toward ~5% by FY28-29. On the 6.67-MMT CNG(T) pool, at SATAT ₹54/kg (+5% GST) versus spot RLNG ~₹45/kg as the displaced marginal molecule:</w:t>
+      </w:r>
+    </w:p>
+    <w:tbl>
+      <w:tblPr>
+        <w:tblW w:type="dxa" w:w="8400"/>
+        <w:tblBorders>
+          <w:top w:val="single" w:color="c8d2dc" w:sz="2"/>
+          <w:left w:val="single" w:color="c8d2dc" w:sz="2"/>
+          <w:bottom w:val="single" w:color="c8d2dc" w:sz="2"/>
+          <w:right w:val="single" w:color="c8d2dc" w:sz="2"/>
+          <w:insideH w:val="single" w:color="c8d2dc" w:sz="2"/>
+          <w:insideV w:val="single" w:color="c8d2dc" w:sz="2"/>
+        </w:tblBorders>
+      </w:tblPr>
+      <w:tblGrid>
+        <w:gridCol w:w="1800"/>
+        <w:gridCol w:w="1700"/>
+        <w:gridCol w:w="1900"/>
+        <w:gridCol w:w="1600"/>
+        <w:gridCol w:w="1400"/>
+      </w:tblGrid>
+      <w:tr>
+        <w:trPr>
+          <w:tblHeader/>
+        </w:trPr>
+        <w:tc>
+          <w:tcPr>
+            <w:tcW w:type="dxa" w:w="1800"/>
+            <w:shd w:fill="0f4c81" w:val="clear"/>
+            <w:tcMar>
+              <w:top w:type="dxa" w:w="70"/>
+              <w:left w:type="dxa" w:w="110"/>
+              <w:bottom w:type="dxa" w:w="70"/>
+              <w:right w:type="dxa" w:w="110"/>
+            </w:tcMar>
+          </w:tcPr>
+          <w:p>
+            <w:pPr>
+              <w:jc w:val="left"/>
+            </w:pPr>
+            <w:r>
+              <w:rPr>
+                <w:rFonts w:ascii="Calibri" w:cs="Calibri" w:eastAsia="Calibri" w:hAnsi="Calibri"/>
+                <w:b/>
+                <w:bCs/>
+                <w:color w:val="ffffff"/>
+                <w:sz w:val="19"/>
+                <w:szCs w:val="19"/>
+              </w:rPr>
+              <w:t xml:space="preserve">CBO share</w:t>
+            </w:r>
+          </w:p>
+        </w:tc>
+        <w:tc>
+          <w:tcPr>
+            <w:tcW w:type="dxa" w:w="1700"/>
+            <w:shd w:fill="0f4c81" w:val="clear"/>
+            <w:tcMar>
+              <w:top w:type="dxa" w:w="70"/>
+              <w:left w:type="dxa" w:w="110"/>
+              <w:bottom w:type="dxa" w:w="70"/>
+              <w:right w:type="dxa" w:w="110"/>
+            </w:tcMar>
+          </w:tcPr>
+          <w:p>
+            <w:pPr>
+              <w:jc w:val="right"/>
+            </w:pPr>
+            <w:r>
+              <w:rPr>
+                <w:rFonts w:ascii="Calibri" w:cs="Calibri" w:eastAsia="Calibri" w:hAnsi="Calibri"/>
+                <w:b/>
+                <w:bCs/>
+                <w:color w:val="ffffff"/>
+                <w:sz w:val="19"/>
+                <w:szCs w:val="19"/>
+              </w:rPr>
+              <w:t xml:space="preserve">CBG needed (t/yr)</w:t>
+            </w:r>
+          </w:p>
+        </w:tc>
+        <w:tc>
+          <w:tcPr>
+            <w:tcW w:type="dxa" w:w="1900"/>
+            <w:shd w:fill="0f4c81" w:val="clear"/>
+            <w:tcMar>
+              <w:top w:type="dxa" w:w="70"/>
+              <w:left w:type="dxa" w:w="110"/>
+              <w:bottom w:type="dxa" w:w="70"/>
+              <w:right w:type="dxa" w:w="110"/>
+            </w:tcMar>
+          </w:tcPr>
+          <w:p>
+            <w:pPr>
+              <w:jc w:val="right"/>
+            </w:pPr>
+            <w:r>
+              <w:rPr>
+                <w:rFonts w:ascii="Calibri" w:cs="Calibri" w:eastAsia="Calibri" w:hAnsi="Calibri"/>
+                <w:b/>
+                <w:bCs/>
+                <w:color w:val="ffffff"/>
+                <w:sz w:val="19"/>
+                <w:szCs w:val="19"/>
+              </w:rPr>
+              <w:t xml:space="preserve">Procurement (₹ cr/yr)</w:t>
+            </w:r>
+          </w:p>
+        </w:tc>
+        <w:tc>
+          <w:tcPr>
+            <w:tcW w:type="dxa" w:w="1600"/>
+            <w:shd w:fill="0f4c81" w:val="clear"/>
+            <w:tcMar>
+              <w:top w:type="dxa" w:w="70"/>
+              <w:left w:type="dxa" w:w="110"/>
+              <w:bottom w:type="dxa" w:w="70"/>
+              <w:right w:type="dxa" w:w="110"/>
+            </w:tcMar>
+          </w:tcPr>
+          <w:p>
+            <w:pPr>
+              <w:jc w:val="right"/>
+            </w:pPr>
+            <w:r>
+              <w:rPr>
+                <w:rFonts w:ascii="Calibri" w:cs="Calibri" w:eastAsia="Calibri" w:hAnsi="Calibri"/>
+                <w:b/>
+                <w:bCs/>
+                <w:color w:val="ffffff"/>
+                <w:sz w:val="19"/>
+                <w:szCs w:val="19"/>
+              </w:rPr>
+              <w:t xml:space="preserve">Pump-price delta</w:t>
+            </w:r>
+          </w:p>
+        </w:tc>
+        <w:tc>
+          <w:tcPr>
+            <w:tcW w:type="dxa" w:w="1400"/>
+            <w:shd w:fill="0f4c81" w:val="clear"/>
+            <w:tcMar>
+              <w:top w:type="dxa" w:w="70"/>
+              <w:left w:type="dxa" w:w="110"/>
+              <w:bottom w:type="dxa" w:w="70"/>
+              <w:right w:type="dxa" w:w="110"/>
+            </w:tcMar>
+          </w:tcPr>
+          <w:p>
+            <w:pPr>
+              <w:jc w:val="right"/>
+            </w:pPr>
+            <w:r>
+              <w:rPr>
+                <w:rFonts w:ascii="Calibri" w:cs="Calibri" w:eastAsia="Calibri" w:hAnsi="Calibri"/>
+                <w:b/>
+                <w:bCs/>
+                <w:color w:val="ffffff"/>
+                <w:sz w:val="19"/>
+                <w:szCs w:val="19"/>
+              </w:rPr>
+              <w:t xml:space="preserve">Mileage delta</w:t>
+            </w:r>
+          </w:p>
+        </w:tc>
+      </w:tr>
+      <w:tr>
+        <w:tc>
+          <w:tcPr>
+            <w:tcW w:type="dxa" w:w="1800"/>
+            <w:shd w:fill="ffffff" w:val="clear"/>
+            <w:tcMar>
+              <w:top w:type="dxa" w:w="70"/>
+              <w:left w:type="dxa" w:w="110"/>
+              <w:bottom w:type="dxa" w:w="70"/>
+              <w:right w:type="dxa" w:w="110"/>
+            </w:tcMar>
+          </w:tcPr>
+          <w:p>
+            <w:pPr>
+              <w:jc w:val="left"/>
+            </w:pPr>
+            <w:r>
+              <w:rPr>
+                <w:rFonts w:ascii="Calibri" w:cs="Calibri" w:eastAsia="Calibri" w:hAnsi="Calibri"/>
+                <w:b w:val="false"/>
+                <w:bCs w:val="false"/>
+                <w:color w:val="1a1a2e"/>
+                <w:sz w:val="19"/>
+                <w:szCs w:val="19"/>
+              </w:rPr>
+              <w:t xml:space="preserve">1% (FY25-26)</w:t>
+            </w:r>
+          </w:p>
+        </w:tc>
+        <w:tc>
+          <w:tcPr>
+            <w:tcW w:type="dxa" w:w="1700"/>
+            <w:shd w:fill="ffffff" w:val="clear"/>
+            <w:tcMar>
+              <w:top w:type="dxa" w:w="70"/>
+              <w:left w:type="dxa" w:w="110"/>
+              <w:bottom w:type="dxa" w:w="70"/>
+              <w:right w:type="dxa" w:w="110"/>
+            </w:tcMar>
+          </w:tcPr>
+          <w:p>
+            <w:pPr>
+              <w:jc w:val="right"/>
+            </w:pPr>
+            <w:r>
+              <w:rPr>
+                <w:rFonts w:ascii="Calibri" w:cs="Calibri" w:eastAsia="Calibri" w:hAnsi="Calibri"/>
+                <w:b w:val="false"/>
+                <w:bCs w:val="false"/>
+                <w:color w:val="1a1a2e"/>
+                <w:sz w:val="19"/>
+                <w:szCs w:val="19"/>
+              </w:rPr>
+              <w:t xml:space="preserve">66,700</w:t>
+            </w:r>
+          </w:p>
+        </w:tc>
+        <w:tc>
+          <w:tcPr>
+            <w:tcW w:type="dxa" w:w="1900"/>
+            <w:shd w:fill="ffffff" w:val="clear"/>
+            <w:tcMar>
+              <w:top w:type="dxa" w:w="70"/>
+              <w:left w:type="dxa" w:w="110"/>
+              <w:bottom w:type="dxa" w:w="70"/>
+              <w:right w:type="dxa" w:w="110"/>
+            </w:tcMar>
+          </w:tcPr>
+          <w:p>
+            <w:pPr>
+              <w:jc w:val="right"/>
+            </w:pPr>
+            <w:r>
+              <w:rPr>
+                <w:rFonts w:ascii="Calibri" w:cs="Calibri" w:eastAsia="Calibri" w:hAnsi="Calibri"/>
+                <w:b w:val="false"/>
+                <w:bCs w:val="false"/>
+                <w:color w:val="1a1a2e"/>
+                <w:sz w:val="19"/>
+                <w:szCs w:val="19"/>
+              </w:rPr>
+              <w:t xml:space="preserve">378</w:t>
+            </w:r>
+          </w:p>
+        </w:tc>
+        <w:tc>
+          <w:tcPr>
+            <w:tcW w:type="dxa" w:w="1600"/>
+            <w:shd w:fill="ffffff" w:val="clear"/>
+            <w:tcMar>
+              <w:top w:type="dxa" w:w="70"/>
+              <w:left w:type="dxa" w:w="110"/>
+              <w:bottom w:type="dxa" w:w="70"/>
+              <w:right w:type="dxa" w:w="110"/>
+            </w:tcMar>
+          </w:tcPr>
+          <w:p>
+            <w:pPr>
+              <w:jc w:val="right"/>
+            </w:pPr>
+            <w:r>
+              <w:rPr>
+                <w:rFonts w:ascii="Calibri" w:cs="Calibri" w:eastAsia="Calibri" w:hAnsi="Calibri"/>
+                <w:b w:val="false"/>
+                <w:bCs w:val="false"/>
+                <w:color w:val="1a1a2e"/>
+                <w:sz w:val="19"/>
+                <w:szCs w:val="19"/>
+              </w:rPr>
+              <w:t xml:space="preserve">+₹0.12/kg</w:t>
+            </w:r>
+          </w:p>
+        </w:tc>
+        <w:tc>
+          <w:tcPr>
+            <w:tcW w:type="dxa" w:w="1400"/>
+            <w:shd w:fill="ffffff" w:val="clear"/>
+            <w:tcMar>
+              <w:top w:type="dxa" w:w="70"/>
+              <w:left w:type="dxa" w:w="110"/>
+              <w:bottom w:type="dxa" w:w="70"/>
+              <w:right w:type="dxa" w:w="110"/>
+            </w:tcMar>
+          </w:tcPr>
+          <w:p>
+            <w:pPr>
+              <w:jc w:val="right"/>
+            </w:pPr>
+            <w:r>
+              <w:rPr>
+                <w:rFonts w:ascii="Calibri" w:cs="Calibri" w:eastAsia="Calibri" w:hAnsi="Calibri"/>
+                <w:b w:val="false"/>
+                <w:bCs w:val="false"/>
+                <w:color w:val="1a1a2e"/>
+                <w:sz w:val="19"/>
+                <w:szCs w:val="19"/>
+              </w:rPr>
+              <w:t xml:space="preserve">−0.02%</w:t>
+            </w:r>
+          </w:p>
+        </w:tc>
+      </w:tr>
+      <w:tr>
+        <w:tc>
+          <w:tcPr>
+            <w:tcW w:type="dxa" w:w="1800"/>
+            <w:shd w:fill="eef3f8" w:val="clear"/>
+            <w:tcMar>
+              <w:top w:type="dxa" w:w="70"/>
+              <w:left w:type="dxa" w:w="110"/>
+              <w:bottom w:type="dxa" w:w="70"/>
+              <w:right w:type="dxa" w:w="110"/>
+            </w:tcMar>
+          </w:tcPr>
+          <w:p>
+            <w:pPr>
+              <w:jc w:val="left"/>
+            </w:pPr>
+            <w:r>
+              <w:rPr>
+                <w:rFonts w:ascii="Calibri" w:cs="Calibri" w:eastAsia="Calibri" w:hAnsi="Calibri"/>
+                <w:b w:val="false"/>
+                <w:bCs w:val="false"/>
+                <w:color w:val="1a1a2e"/>
+                <w:sz w:val="19"/>
+                <w:szCs w:val="19"/>
+              </w:rPr>
+              <w:t xml:space="preserve">5% (FY28-29)</w:t>
+            </w:r>
+          </w:p>
+        </w:tc>
+        <w:tc>
+          <w:tcPr>
+            <w:tcW w:type="dxa" w:w="1700"/>
+            <w:shd w:fill="eef3f8" w:val="clear"/>
+            <w:tcMar>
+              <w:top w:type="dxa" w:w="70"/>
+              <w:left w:type="dxa" w:w="110"/>
+              <w:bottom w:type="dxa" w:w="70"/>
+              <w:right w:type="dxa" w:w="110"/>
+            </w:tcMar>
+          </w:tcPr>
+          <w:p>
+            <w:pPr>
+              <w:jc w:val="right"/>
+            </w:pPr>
+            <w:r>
+              <w:rPr>
+                <w:rFonts w:ascii="Calibri" w:cs="Calibri" w:eastAsia="Calibri" w:hAnsi="Calibri"/>
+                <w:b w:val="false"/>
+                <w:bCs w:val="false"/>
+                <w:color w:val="1a1a2e"/>
+                <w:sz w:val="19"/>
+                <w:szCs w:val="19"/>
+              </w:rPr>
+              <w:t xml:space="preserve">333,500</w:t>
+            </w:r>
+          </w:p>
+        </w:tc>
+        <w:tc>
+          <w:tcPr>
+            <w:tcW w:type="dxa" w:w="1900"/>
+            <w:shd w:fill="eef3f8" w:val="clear"/>
+            <w:tcMar>
+              <w:top w:type="dxa" w:w="70"/>
+              <w:left w:type="dxa" w:w="110"/>
+              <w:bottom w:type="dxa" w:w="70"/>
+              <w:right w:type="dxa" w:w="110"/>
+            </w:tcMar>
+          </w:tcPr>
+          <w:p>
+            <w:pPr>
+              <w:jc w:val="right"/>
+            </w:pPr>
+            <w:r>
+              <w:rPr>
+                <w:rFonts w:ascii="Calibri" w:cs="Calibri" w:eastAsia="Calibri" w:hAnsi="Calibri"/>
+                <w:b w:val="false"/>
+                <w:bCs w:val="false"/>
+                <w:color w:val="1a1a2e"/>
+                <w:sz w:val="19"/>
+                <w:szCs w:val="19"/>
+              </w:rPr>
+              <w:t xml:space="preserve">1,891</w:t>
+            </w:r>
+          </w:p>
+        </w:tc>
+        <w:tc>
+          <w:tcPr>
+            <w:tcW w:type="dxa" w:w="1600"/>
+            <w:shd w:fill="eef3f8" w:val="clear"/>
+            <w:tcMar>
+              <w:top w:type="dxa" w:w="70"/>
+              <w:left w:type="dxa" w:w="110"/>
+              <w:bottom w:type="dxa" w:w="70"/>
+              <w:right w:type="dxa" w:w="110"/>
+            </w:tcMar>
+          </w:tcPr>
+          <w:p>
+            <w:pPr>
+              <w:jc w:val="right"/>
+            </w:pPr>
+            <w:r>
+              <w:rPr>
+                <w:rFonts w:ascii="Calibri" w:cs="Calibri" w:eastAsia="Calibri" w:hAnsi="Calibri"/>
+                <w:b w:val="false"/>
+                <w:bCs w:val="false"/>
+                <w:color w:val="1a1a2e"/>
+                <w:sz w:val="19"/>
+                <w:szCs w:val="19"/>
+              </w:rPr>
+              <w:t xml:space="preserve">+₹0.59/kg</w:t>
+            </w:r>
+          </w:p>
+        </w:tc>
+        <w:tc>
+          <w:tcPr>
+            <w:tcW w:type="dxa" w:w="1400"/>
+            <w:shd w:fill="eef3f8" w:val="clear"/>
+            <w:tcMar>
+              <w:top w:type="dxa" w:w="70"/>
+              <w:left w:type="dxa" w:w="110"/>
+              <w:bottom w:type="dxa" w:w="70"/>
+              <w:right w:type="dxa" w:w="110"/>
+            </w:tcMar>
+          </w:tcPr>
+          <w:p>
+            <w:pPr>
+              <w:jc w:val="right"/>
+            </w:pPr>
+            <w:r>
+              <w:rPr>
+                <w:rFonts w:ascii="Calibri" w:cs="Calibri" w:eastAsia="Calibri" w:hAnsi="Calibri"/>
+                <w:b w:val="false"/>
+                <w:bCs w:val="false"/>
+                <w:color w:val="1a1a2e"/>
+                <w:sz w:val="19"/>
+                <w:szCs w:val="19"/>
+              </w:rPr>
+              <w:t xml:space="preserve">−0.11%</w:t>
+            </w:r>
+          </w:p>
+        </w:tc>
+      </w:tr>
+    </w:tbl>
+    <w:p>
+      <w:pPr>
+        <w:spacing w:after="120" w:before="0"/>
+      </w:pPr>
+      <w:r>
+        <w:rPr>
+          <w:rFonts w:ascii="Calibri" w:cs="Calibri" w:eastAsia="Calibri" w:hAnsi="Calibri"/>
+          <w:color w:val="1a1a2e"/>
+          <w:sz w:val="21"/>
+          <w:szCs w:val="21"/>
+        </w:rPr>
+        <w:t xml:space="preserve"/>
+      </w:r>
+    </w:p>
+    <w:p>
+      <w:pPr>
+        <w:spacing w:after="160" w:before="0"/>
+      </w:pPr>
+      <w:r>
+        <w:rPr>
+          <w:rFonts w:ascii="Calibri" w:cs="Calibri" w:eastAsia="Calibri" w:hAnsi="Calibri"/>
+          <w:color w:val="1a1a2e"/>
+          <w:sz w:val="21"/>
+          <w:szCs w:val="21"/>
+        </w:rPr>
+        <w:t xml:space="preserve">Even the full 5% obligation moves the CNG pump by ~₹0.59/kg (≈0.8%) and mileage by ~0.1% — against E20's silent 4% mileage cut and ₹22,700 crore/yr volume dividend. Where CBG does need support, the subsidy sits on-budget and ex-plant — SATAT price assurance, GOBARdhan capex grants, and fermented-organic-manure offtake under FCO Schedule VIII — rather than hidden in the fuel gauge. Caveat: ₹54/kg is an assured floor, not proof of plant viability; feedstock economics (press-mud cheapest, agri-residue dearest) still decide whether plants get built.</w:t>
+      </w:r>
+    </w:p>
+    <w:p>
+      <w:pPr>
+        <w:pStyle w:val="Heading1"/>
+        <w:spacing w:after="160" w:before="320"/>
+      </w:pPr>
+      <w:r>
+        <w:rPr>
+          <w:rFonts w:ascii="Calibri" w:cs="Calibri" w:eastAsia="Calibri" w:hAnsi="Calibri"/>
+          <w:b/>
+          <w:bCs/>
+          <w:color w:val="0f4c81"/>
+          <w:sz w:val="28"/>
+          <w:szCs w:val="28"/>
+        </w:rPr>
+        <w:t xml:space="preserve">7. Price-adjustment scenarios: what would neutralise the mileage loss</w:t>
       </w:r>
     </w:p>
     <w:p>
@@ -9021,7 +10896,45 @@
           <w:sz w:val="28"/>
           <w:szCs w:val="28"/>
         </w:rPr>
-        <w:t xml:space="preserve">7. Caveats and sources</w:t>
+        <w:t xml:space="preserve">8. Caveats and sources</w:t>
+      </w:r>
+    </w:p>
+    <w:p>
+      <w:pPr>
+        <w:pStyle w:val="ListParagraph"/>
+        <w:numPr>
+          <w:ilvl w:val="0"/>
+          <w:numId w:val="2"/>
+        </w:numPr>
+        <w:spacing w:after="100"/>
+      </w:pPr>
+      <w:r>
+        <w:rPr>
+          <w:rFonts w:ascii="Calibri" w:cs="Calibri" w:eastAsia="Calibri" w:hAnsi="Calibri"/>
+          <w:color w:val="1a1a2e"/>
+          <w:sz w:val="21"/>
+          <w:szCs w:val="21"/>
+        </w:rPr>
+        <w:t xml:space="preserve">Vehicle mileage: SIAM/ARAI BS-VI FE declarations (form 2344, 303 four-wheeler models, Apr 2020) from the vehicle_fuel_mileage repo — type-approval figures, used for relative fuel-type gaps; the +40.3% petrol→CNG uplift is anchored on 11 same-nameplate pairs.</w:t>
+      </w:r>
+    </w:p>
+    <w:p>
+      <w:pPr>
+        <w:pStyle w:val="ListParagraph"/>
+        <w:numPr>
+          <w:ilvl w:val="0"/>
+          <w:numId w:val="2"/>
+        </w:numPr>
+        <w:spacing w:after="100"/>
+      </w:pPr>
+      <w:r>
+        <w:rPr>
+          <w:rFonts w:ascii="Calibri" w:cs="Calibri" w:eastAsia="Calibri" w:hAnsi="Calibri"/>
+          <w:color w:val="1a1a2e"/>
+          <w:sz w:val="21"/>
+          <w:szCs w:val="21"/>
+        </w:rPr>
+        <w:t xml:space="preserve">CBG/SATAT: MoPNG assured ex-plant price ₹54/kg (+5% GST); CBO 1% of CGD gas FY25-26 → ~5% FY28-29; gas comparators APM $6.5/MMBtu, spot RLNG $12/MMBtu at ₹83/$.</w:t>
       </w:r>
     </w:p>
     <w:p>

</xml_diff>

<commit_message>
docs: paper sections 8-9 (supply match, RON95) + 2 slides + glossary
Paper: descriptive methodology/assumptions/caveats paragraphs per section,
all abbreviations spelled out, 16-row glossary. Slides 10 (supply check
utilisation chart) and 11 (RON95 two-route table + net -1.8% stat);
closing gains the RON95 recommendation. Table widths fixed to page.

Co-Authored-By: Claude Fable 5 <noreply@anthropic.com>
</commit_message>
<xml_diff>
--- a/docs/Energy_Blend_Volume_Dividend.docx
+++ b/docs/Energy_Blend_Volume_Dividend.docx
@@ -10896,7 +10896,2688 @@
           <w:sz w:val="28"/>
           <w:szCs w:val="28"/>
         </w:rPr>
-        <w:t xml:space="preserve">8. Caveats and sources</w:t>
+        <w:t xml:space="preserve">8. Ethanol supply: can the distilleries serve the blend walk?</w:t>
+      </w:r>
+    </w:p>
+    <w:p>
+      <w:pPr>
+        <w:spacing w:after="160" w:before="0"/>
+      </w:pPr>
+      <w:r>
+        <w:rPr>
+          <w:rFonts w:ascii="Calibri" w:cs="Calibri" w:eastAsia="Calibri" w:hAnsi="Calibri"/>
+          <w:color w:val="1a1a2e"/>
+          <w:sz w:val="21"/>
+          <w:szCs w:val="21"/>
+        </w:rPr>
+        <w:t xml:space="preserve">Methodology. Demand per blend is computed from this paper's own pool arithmetic — the FY 2024-25 blended petrol pool (54.05 billion litres) is held at constant distance-demand, each blend's real-world mileage drop re-inflates the litres dispensed, and the ethanol fraction of those litres is the fuel-ethanol requirement. To this we add non-fuel ethanol demand (potable liquor and industrial chemicals). Supply is taken from three independent sources: (i) CareEdge Ratings — the credit-rating agency formerly CARE Ratings — in its 14 May 2026 study 'E85 Impact: Ethanol Overcapacity to Persist as Flex-fuel Transition to Remain Gradual'; (ii) the sanction register of the Department of Food &amp; Public Distribution (DFPD) Ethanol Interest Subvention Scheme (ISS), extracted in the companion E20→E30 stakeholder workbook; and (iii) the National Cooperative Development Corporation (NCDC) disbursement split for the Ministry of Cooperation's Cooperative Sugar Mill (CSM) strengthening scheme, as reported to the Rajya Sabha.</w:t>
+      </w:r>
+    </w:p>
+    <w:tbl>
+      <w:tblPr>
+        <w:tblW w:type="dxa" w:w="9800"/>
+        <w:tblBorders>
+          <w:top w:val="single" w:color="c8d2dc" w:sz="2"/>
+          <w:left w:val="single" w:color="c8d2dc" w:sz="2"/>
+          <w:bottom w:val="single" w:color="c8d2dc" w:sz="2"/>
+          <w:right w:val="single" w:color="c8d2dc" w:sz="2"/>
+          <w:insideH w:val="single" w:color="c8d2dc" w:sz="2"/>
+          <w:insideV w:val="single" w:color="c8d2dc" w:sz="2"/>
+        </w:tblBorders>
+      </w:tblPr>
+      <w:tblGrid>
+        <w:gridCol w:w="4000"/>
+        <w:gridCol w:w="2900"/>
+        <w:gridCol w:w="2900"/>
+      </w:tblGrid>
+      <w:tr>
+        <w:trPr>
+          <w:tblHeader/>
+        </w:trPr>
+        <w:tc>
+          <w:tcPr>
+            <w:tcW w:type="dxa" w:w="4000"/>
+            <w:shd w:fill="0f4c81" w:val="clear"/>
+            <w:tcMar>
+              <w:top w:type="dxa" w:w="70"/>
+              <w:left w:type="dxa" w:w="110"/>
+              <w:bottom w:type="dxa" w:w="70"/>
+              <w:right w:type="dxa" w:w="110"/>
+            </w:tcMar>
+          </w:tcPr>
+          <w:p>
+            <w:pPr>
+              <w:jc w:val="left"/>
+            </w:pPr>
+            <w:r>
+              <w:rPr>
+                <w:rFonts w:ascii="Calibri" w:cs="Calibri" w:eastAsia="Calibri" w:hAnsi="Calibri"/>
+                <w:b/>
+                <w:bCs/>
+                <w:color w:val="ffffff"/>
+                <w:sz w:val="19"/>
+                <w:szCs w:val="19"/>
+              </w:rPr>
+              <w:t xml:space="preserve">Supply-side item</w:t>
+            </w:r>
+          </w:p>
+        </w:tc>
+        <w:tc>
+          <w:tcPr>
+            <w:tcW w:type="dxa" w:w="2900"/>
+            <w:shd w:fill="0f4c81" w:val="clear"/>
+            <w:tcMar>
+              <w:top w:type="dxa" w:w="70"/>
+              <w:left w:type="dxa" w:w="110"/>
+              <w:bottom w:type="dxa" w:w="70"/>
+              <w:right w:type="dxa" w:w="110"/>
+            </w:tcMar>
+          </w:tcPr>
+          <w:p>
+            <w:pPr>
+              <w:jc w:val="right"/>
+            </w:pPr>
+            <w:r>
+              <w:rPr>
+                <w:rFonts w:ascii="Calibri" w:cs="Calibri" w:eastAsia="Calibri" w:hAnsi="Calibri"/>
+                <w:b/>
+                <w:bCs/>
+                <w:color w:val="ffffff"/>
+                <w:sz w:val="19"/>
+                <w:szCs w:val="19"/>
+              </w:rPr>
+              <w:t xml:space="preserve">Value</w:t>
+            </w:r>
+          </w:p>
+        </w:tc>
+        <w:tc>
+          <w:tcPr>
+            <w:tcW w:type="dxa" w:w="2900"/>
+            <w:shd w:fill="0f4c81" w:val="clear"/>
+            <w:tcMar>
+              <w:top w:type="dxa" w:w="70"/>
+              <w:left w:type="dxa" w:w="110"/>
+              <w:bottom w:type="dxa" w:w="70"/>
+              <w:right w:type="dxa" w:w="110"/>
+            </w:tcMar>
+          </w:tcPr>
+          <w:p>
+            <w:pPr>
+              <w:jc w:val="right"/>
+            </w:pPr>
+            <w:r>
+              <w:rPr>
+                <w:rFonts w:ascii="Calibri" w:cs="Calibri" w:eastAsia="Calibri" w:hAnsi="Calibri"/>
+                <w:b/>
+                <w:bCs/>
+                <w:color w:val="ffffff"/>
+                <w:sz w:val="19"/>
+                <w:szCs w:val="19"/>
+              </w:rPr>
+              <w:t xml:space="preserve">Source</w:t>
+            </w:r>
+          </w:p>
+        </w:tc>
+      </w:tr>
+      <w:tr>
+        <w:tc>
+          <w:tcPr>
+            <w:tcW w:type="dxa" w:w="4000"/>
+            <w:shd w:fill="ffffff" w:val="clear"/>
+            <w:tcMar>
+              <w:top w:type="dxa" w:w="70"/>
+              <w:left w:type="dxa" w:w="110"/>
+              <w:bottom w:type="dxa" w:w="70"/>
+              <w:right w:type="dxa" w:w="110"/>
+            </w:tcMar>
+          </w:tcPr>
+          <w:p>
+            <w:pPr>
+              <w:jc w:val="left"/>
+            </w:pPr>
+            <w:r>
+              <w:rPr>
+                <w:rFonts w:ascii="Calibri" w:cs="Calibri" w:eastAsia="Calibri" w:hAnsi="Calibri"/>
+                <w:b w:val="false"/>
+                <w:bCs w:val="false"/>
+                <w:color w:val="1a1a2e"/>
+                <w:sz w:val="19"/>
+                <w:szCs w:val="19"/>
+              </w:rPr>
+              <w:t xml:space="preserve">Installed distillery capacity, ESY* 2025-26</w:t>
+            </w:r>
+          </w:p>
+        </w:tc>
+        <w:tc>
+          <w:tcPr>
+            <w:tcW w:type="dxa" w:w="2900"/>
+            <w:shd w:fill="ffffff" w:val="clear"/>
+            <w:tcMar>
+              <w:top w:type="dxa" w:w="70"/>
+              <w:left w:type="dxa" w:w="110"/>
+              <w:bottom w:type="dxa" w:w="70"/>
+              <w:right w:type="dxa" w:w="110"/>
+            </w:tcMar>
+          </w:tcPr>
+          <w:p>
+            <w:pPr>
+              <w:jc w:val="right"/>
+            </w:pPr>
+            <w:r>
+              <w:rPr>
+                <w:rFonts w:ascii="Calibri" w:cs="Calibri" w:eastAsia="Calibri" w:hAnsi="Calibri"/>
+                <w:b w:val="false"/>
+                <w:bCs w:val="false"/>
+                <w:color w:val="1a1a2e"/>
+                <w:sz w:val="19"/>
+                <w:szCs w:val="19"/>
+              </w:rPr>
+              <w:t xml:space="preserve">~2,000 crore litres/yr</w:t>
+            </w:r>
+          </w:p>
+        </w:tc>
+        <w:tc>
+          <w:tcPr>
+            <w:tcW w:type="dxa" w:w="2900"/>
+            <w:shd w:fill="ffffff" w:val="clear"/>
+            <w:tcMar>
+              <w:top w:type="dxa" w:w="70"/>
+              <w:left w:type="dxa" w:w="110"/>
+              <w:bottom w:type="dxa" w:w="70"/>
+              <w:right w:type="dxa" w:w="110"/>
+            </w:tcMar>
+          </w:tcPr>
+          <w:p>
+            <w:pPr>
+              <w:jc w:val="right"/>
+            </w:pPr>
+            <w:r>
+              <w:rPr>
+                <w:rFonts w:ascii="Calibri" w:cs="Calibri" w:eastAsia="Calibri" w:hAnsi="Calibri"/>
+                <w:b w:val="false"/>
+                <w:bCs w:val="false"/>
+                <w:color w:val="1a1a2e"/>
+                <w:sz w:val="19"/>
+                <w:szCs w:val="19"/>
+              </w:rPr>
+              <w:t xml:space="preserve">CareEdge May-2026</w:t>
+            </w:r>
+          </w:p>
+        </w:tc>
+      </w:tr>
+      <w:tr>
+        <w:tc>
+          <w:tcPr>
+            <w:tcW w:type="dxa" w:w="4000"/>
+            <w:shd w:fill="eef3f8" w:val="clear"/>
+            <w:tcMar>
+              <w:top w:type="dxa" w:w="70"/>
+              <w:left w:type="dxa" w:w="110"/>
+              <w:bottom w:type="dxa" w:w="70"/>
+              <w:right w:type="dxa" w:w="110"/>
+            </w:tcMar>
+          </w:tcPr>
+          <w:p>
+            <w:pPr>
+              <w:jc w:val="left"/>
+            </w:pPr>
+            <w:r>
+              <w:rPr>
+                <w:rFonts w:ascii="Calibri" w:cs="Calibri" w:eastAsia="Calibri" w:hAnsi="Calibri"/>
+                <w:b w:val="false"/>
+                <w:bCs w:val="false"/>
+                <w:color w:val="1a1a2e"/>
+                <w:sz w:val="19"/>
+                <w:szCs w:val="19"/>
+              </w:rPr>
+              <w:t xml:space="preserve">Additions expected operational by FY27</w:t>
+            </w:r>
+          </w:p>
+        </w:tc>
+        <w:tc>
+          <w:tcPr>
+            <w:tcW w:type="dxa" w:w="2900"/>
+            <w:shd w:fill="eef3f8" w:val="clear"/>
+            <w:tcMar>
+              <w:top w:type="dxa" w:w="70"/>
+              <w:left w:type="dxa" w:w="110"/>
+              <w:bottom w:type="dxa" w:w="70"/>
+              <w:right w:type="dxa" w:w="110"/>
+            </w:tcMar>
+          </w:tcPr>
+          <w:p>
+            <w:pPr>
+              <w:jc w:val="right"/>
+            </w:pPr>
+            <w:r>
+              <w:rPr>
+                <w:rFonts w:ascii="Calibri" w:cs="Calibri" w:eastAsia="Calibri" w:hAnsi="Calibri"/>
+                <w:b w:val="false"/>
+                <w:bCs w:val="false"/>
+                <w:color w:val="1a1a2e"/>
+                <w:sz w:val="19"/>
+                <w:szCs w:val="19"/>
+              </w:rPr>
+              <w:t xml:space="preserve">+400 crore litres/yr</w:t>
+            </w:r>
+          </w:p>
+        </w:tc>
+        <w:tc>
+          <w:tcPr>
+            <w:tcW w:type="dxa" w:w="2900"/>
+            <w:shd w:fill="eef3f8" w:val="clear"/>
+            <w:tcMar>
+              <w:top w:type="dxa" w:w="70"/>
+              <w:left w:type="dxa" w:w="110"/>
+              <w:bottom w:type="dxa" w:w="70"/>
+              <w:right w:type="dxa" w:w="110"/>
+            </w:tcMar>
+          </w:tcPr>
+          <w:p>
+            <w:pPr>
+              <w:jc w:val="right"/>
+            </w:pPr>
+            <w:r>
+              <w:rPr>
+                <w:rFonts w:ascii="Calibri" w:cs="Calibri" w:eastAsia="Calibri" w:hAnsi="Calibri"/>
+                <w:b w:val="false"/>
+                <w:bCs w:val="false"/>
+                <w:color w:val="1a1a2e"/>
+                <w:sz w:val="19"/>
+                <w:szCs w:val="19"/>
+              </w:rPr>
+              <w:t xml:space="preserve">CareEdge May-2026</w:t>
+            </w:r>
+          </w:p>
+        </w:tc>
+      </w:tr>
+      <w:tr>
+        <w:tc>
+          <w:tcPr>
+            <w:tcW w:type="dxa" w:w="4000"/>
+            <w:shd w:fill="ffffff" w:val="clear"/>
+            <w:tcMar>
+              <w:top w:type="dxa" w:w="70"/>
+              <w:left w:type="dxa" w:w="110"/>
+              <w:bottom w:type="dxa" w:w="70"/>
+              <w:right w:type="dxa" w:w="110"/>
+            </w:tcMar>
+          </w:tcPr>
+          <w:p>
+            <w:pPr>
+              <w:jc w:val="left"/>
+            </w:pPr>
+            <w:r>
+              <w:rPr>
+                <w:rFonts w:ascii="Calibri" w:cs="Calibri" w:eastAsia="Calibri" w:hAnsi="Calibri"/>
+                <w:b w:val="false"/>
+                <w:bCs w:val="false"/>
+                <w:color w:val="1a1a2e"/>
+                <w:sz w:val="19"/>
+                <w:szCs w:val="19"/>
+              </w:rPr>
+              <w:t xml:space="preserve">DFPD ISS sanction register (approved, not all built)</w:t>
+            </w:r>
+          </w:p>
+        </w:tc>
+        <w:tc>
+          <w:tcPr>
+            <w:tcW w:type="dxa" w:w="2900"/>
+            <w:shd w:fill="ffffff" w:val="clear"/>
+            <w:tcMar>
+              <w:top w:type="dxa" w:w="70"/>
+              <w:left w:type="dxa" w:w="110"/>
+              <w:bottom w:type="dxa" w:w="70"/>
+              <w:right w:type="dxa" w:w="110"/>
+            </w:tcMar>
+          </w:tcPr>
+          <w:p>
+            <w:pPr>
+              <w:jc w:val="right"/>
+            </w:pPr>
+            <w:r>
+              <w:rPr>
+                <w:rFonts w:ascii="Calibri" w:cs="Calibri" w:eastAsia="Calibri" w:hAnsi="Calibri"/>
+                <w:b w:val="false"/>
+                <w:bCs w:val="false"/>
+                <w:color w:val="1a1a2e"/>
+                <w:sz w:val="19"/>
+                <w:szCs w:val="19"/>
+              </w:rPr>
+              <w:t xml:space="preserve">1,212 projects · 1,37,282 KLPD† = 4,530 cr L/yr</w:t>
+            </w:r>
+          </w:p>
+        </w:tc>
+        <w:tc>
+          <w:tcPr>
+            <w:tcW w:type="dxa" w:w="2900"/>
+            <w:shd w:fill="ffffff" w:val="clear"/>
+            <w:tcMar>
+              <w:top w:type="dxa" w:w="70"/>
+              <w:left w:type="dxa" w:w="110"/>
+              <w:bottom w:type="dxa" w:w="70"/>
+              <w:right w:type="dxa" w:w="110"/>
+            </w:tcMar>
+          </w:tcPr>
+          <w:p>
+            <w:pPr>
+              <w:jc w:val="right"/>
+            </w:pPr>
+            <w:r>
+              <w:rPr>
+                <w:rFonts w:ascii="Calibri" w:cs="Calibri" w:eastAsia="Calibri" w:hAnsi="Calibri"/>
+                <w:b w:val="false"/>
+                <w:bCs w:val="false"/>
+                <w:color w:val="1a1a2e"/>
+                <w:sz w:val="19"/>
+                <w:szCs w:val="19"/>
+              </w:rPr>
+              <w:t xml:space="preserve">DFPD annexures</w:t>
+            </w:r>
+          </w:p>
+        </w:tc>
+      </w:tr>
+      <w:tr>
+        <w:tc>
+          <w:tcPr>
+            <w:tcW w:type="dxa" w:w="4000"/>
+            <w:shd w:fill="eef3f8" w:val="clear"/>
+            <w:tcMar>
+              <w:top w:type="dxa" w:w="70"/>
+              <w:left w:type="dxa" w:w="110"/>
+              <w:bottom w:type="dxa" w:w="70"/>
+              <w:right w:type="dxa" w:w="110"/>
+            </w:tcMar>
+          </w:tcPr>
+          <w:p>
+            <w:pPr>
+              <w:jc w:val="left"/>
+            </w:pPr>
+            <w:r>
+              <w:rPr>
+                <w:rFonts w:ascii="Calibri" w:cs="Calibri" w:eastAsia="Calibri" w:hAnsi="Calibri"/>
+                <w:b w:val="false"/>
+                <w:bCs w:val="false"/>
+                <w:color w:val="1a1a2e"/>
+                <w:sz w:val="19"/>
+                <w:szCs w:val="19"/>
+              </w:rPr>
+              <w:t xml:space="preserve">Ethanol offered that OMCs currently absorb</w:t>
+            </w:r>
+          </w:p>
+        </w:tc>
+        <w:tc>
+          <w:tcPr>
+            <w:tcW w:type="dxa" w:w="2900"/>
+            <w:shd w:fill="eef3f8" w:val="clear"/>
+            <w:tcMar>
+              <w:top w:type="dxa" w:w="70"/>
+              <w:left w:type="dxa" w:w="110"/>
+              <w:bottom w:type="dxa" w:w="70"/>
+              <w:right w:type="dxa" w:w="110"/>
+            </w:tcMar>
+          </w:tcPr>
+          <w:p>
+            <w:pPr>
+              <w:jc w:val="right"/>
+            </w:pPr>
+            <w:r>
+              <w:rPr>
+                <w:rFonts w:ascii="Calibri" w:cs="Calibri" w:eastAsia="Calibri" w:hAnsi="Calibri"/>
+                <w:b w:val="false"/>
+                <w:bCs w:val="false"/>
+                <w:color w:val="1a1a2e"/>
+                <w:sz w:val="19"/>
+                <w:szCs w:val="19"/>
+              </w:rPr>
+              <w:t xml:space="preserve">~60%</w:t>
+            </w:r>
+          </w:p>
+        </w:tc>
+        <w:tc>
+          <w:tcPr>
+            <w:tcW w:type="dxa" w:w="2900"/>
+            <w:shd w:fill="eef3f8" w:val="clear"/>
+            <w:tcMar>
+              <w:top w:type="dxa" w:w="70"/>
+              <w:left w:type="dxa" w:w="110"/>
+              <w:bottom w:type="dxa" w:w="70"/>
+              <w:right w:type="dxa" w:w="110"/>
+            </w:tcMar>
+          </w:tcPr>
+          <w:p>
+            <w:pPr>
+              <w:jc w:val="right"/>
+            </w:pPr>
+            <w:r>
+              <w:rPr>
+                <w:rFonts w:ascii="Calibri" w:cs="Calibri" w:eastAsia="Calibri" w:hAnsi="Calibri"/>
+                <w:b w:val="false"/>
+                <w:bCs w:val="false"/>
+                <w:color w:val="1a1a2e"/>
+                <w:sz w:val="19"/>
+                <w:szCs w:val="19"/>
+              </w:rPr>
+              <w:t xml:space="preserve">CareEdge May-2026</w:t>
+            </w:r>
+          </w:p>
+        </w:tc>
+      </w:tr>
+      <w:tr>
+        <w:tc>
+          <w:tcPr>
+            <w:tcW w:type="dxa" w:w="4000"/>
+            <w:shd w:fill="ffffff" w:val="clear"/>
+            <w:tcMar>
+              <w:top w:type="dxa" w:w="70"/>
+              <w:left w:type="dxa" w:w="110"/>
+              <w:bottom w:type="dxa" w:w="70"/>
+              <w:right w:type="dxa" w:w="110"/>
+            </w:tcMar>
+          </w:tcPr>
+          <w:p>
+            <w:pPr>
+              <w:jc w:val="left"/>
+            </w:pPr>
+            <w:r>
+              <w:rPr>
+                <w:rFonts w:ascii="Calibri" w:cs="Calibri" w:eastAsia="Calibri" w:hAnsi="Calibri"/>
+                <w:b w:val="false"/>
+                <w:bCs w:val="false"/>
+                <w:color w:val="1a1a2e"/>
+                <w:sz w:val="19"/>
+                <w:szCs w:val="19"/>
+              </w:rPr>
+              <w:t xml:space="preserve">Non-fuel demand (potable + industrial)</w:t>
+            </w:r>
+          </w:p>
+        </w:tc>
+        <w:tc>
+          <w:tcPr>
+            <w:tcW w:type="dxa" w:w="2900"/>
+            <w:shd w:fill="ffffff" w:val="clear"/>
+            <w:tcMar>
+              <w:top w:type="dxa" w:w="70"/>
+              <w:left w:type="dxa" w:w="110"/>
+              <w:bottom w:type="dxa" w:w="70"/>
+              <w:right w:type="dxa" w:w="110"/>
+            </w:tcMar>
+          </w:tcPr>
+          <w:p>
+            <w:pPr>
+              <w:jc w:val="right"/>
+            </w:pPr>
+            <w:r>
+              <w:rPr>
+                <w:rFonts w:ascii="Calibri" w:cs="Calibri" w:eastAsia="Calibri" w:hAnsi="Calibri"/>
+                <w:b w:val="false"/>
+                <w:bCs w:val="false"/>
+                <w:color w:val="1a1a2e"/>
+                <w:sz w:val="19"/>
+                <w:szCs w:val="19"/>
+              </w:rPr>
+              <w:t xml:space="preserve">300–350 crore litres/yr</w:t>
+            </w:r>
+          </w:p>
+        </w:tc>
+        <w:tc>
+          <w:tcPr>
+            <w:tcW w:type="dxa" w:w="2900"/>
+            <w:shd w:fill="ffffff" w:val="clear"/>
+            <w:tcMar>
+              <w:top w:type="dxa" w:w="70"/>
+              <w:left w:type="dxa" w:w="110"/>
+              <w:bottom w:type="dxa" w:w="70"/>
+              <w:right w:type="dxa" w:w="110"/>
+            </w:tcMar>
+          </w:tcPr>
+          <w:p>
+            <w:pPr>
+              <w:jc w:val="right"/>
+            </w:pPr>
+            <w:r>
+              <w:rPr>
+                <w:rFonts w:ascii="Calibri" w:cs="Calibri" w:eastAsia="Calibri" w:hAnsi="Calibri"/>
+                <w:b w:val="false"/>
+                <w:bCs w:val="false"/>
+                <w:color w:val="1a1a2e"/>
+                <w:sz w:val="19"/>
+                <w:szCs w:val="19"/>
+              </w:rPr>
+              <w:t xml:space="preserve">CareEdge May-2026</w:t>
+            </w:r>
+          </w:p>
+        </w:tc>
+      </w:tr>
+      <w:tr>
+        <w:tc>
+          <w:tcPr>
+            <w:tcW w:type="dxa" w:w="4000"/>
+            <w:shd w:fill="eef3f8" w:val="clear"/>
+            <w:tcMar>
+              <w:top w:type="dxa" w:w="70"/>
+              <w:left w:type="dxa" w:w="110"/>
+              <w:bottom w:type="dxa" w:w="70"/>
+              <w:right w:type="dxa" w:w="110"/>
+            </w:tcMar>
+          </w:tcPr>
+          <w:p>
+            <w:pPr>
+              <w:jc w:val="left"/>
+            </w:pPr>
+            <w:r>
+              <w:rPr>
+                <w:rFonts w:ascii="Calibri" w:cs="Calibri" w:eastAsia="Calibri" w:hAnsi="Calibri"/>
+                <w:b w:val="false"/>
+                <w:bCs w:val="false"/>
+                <w:color w:val="1a1a2e"/>
+                <w:sz w:val="19"/>
+                <w:szCs w:val="19"/>
+              </w:rPr>
+              <w:t xml:space="preserve">FCI‡ rice leg, effective</w:t>
+            </w:r>
+          </w:p>
+        </w:tc>
+        <w:tc>
+          <w:tcPr>
+            <w:tcW w:type="dxa" w:w="2900"/>
+            <w:shd w:fill="eef3f8" w:val="clear"/>
+            <w:tcMar>
+              <w:top w:type="dxa" w:w="70"/>
+              <w:left w:type="dxa" w:w="110"/>
+              <w:bottom w:type="dxa" w:w="70"/>
+              <w:right w:type="dxa" w:w="110"/>
+            </w:tcMar>
+          </w:tcPr>
+          <w:p>
+            <w:pPr>
+              <w:jc w:val="right"/>
+            </w:pPr>
+            <w:r>
+              <w:rPr>
+                <w:rFonts w:ascii="Calibri" w:cs="Calibri" w:eastAsia="Calibri" w:hAnsi="Calibri"/>
+                <w:b w:val="false"/>
+                <w:bCs w:val="false"/>
+                <w:color w:val="1a1a2e"/>
+                <w:sz w:val="19"/>
+                <w:szCs w:val="19"/>
+              </w:rPr>
+              <w:t xml:space="preserve">~211 crore litres/yr (≈3.9 blend points)</w:t>
+            </w:r>
+          </w:p>
+        </w:tc>
+        <w:tc>
+          <w:tcPr>
+            <w:tcW w:type="dxa" w:w="2900"/>
+            <w:shd w:fill="eef3f8" w:val="clear"/>
+            <w:tcMar>
+              <w:top w:type="dxa" w:w="70"/>
+              <w:left w:type="dxa" w:w="110"/>
+              <w:bottom w:type="dxa" w:w="70"/>
+              <w:right w:type="dxa" w:w="110"/>
+            </w:tcMar>
+          </w:tcPr>
+          <w:p>
+            <w:pPr>
+              <w:jc w:val="right"/>
+            </w:pPr>
+            <w:r>
+              <w:rPr>
+                <w:rFonts w:ascii="Calibri" w:cs="Calibri" w:eastAsia="Calibri" w:hAnsi="Calibri"/>
+                <w:b w:val="false"/>
+                <w:bCs w:val="false"/>
+                <w:color w:val="1a1a2e"/>
+                <w:sz w:val="19"/>
+                <w:szCs w:val="19"/>
+              </w:rPr>
+              <w:t xml:space="preserve">7.2 MMT/yr allocation × 65% lifting × 450 L/tonne</w:t>
+            </w:r>
+          </w:p>
+        </w:tc>
+      </w:tr>
+      <w:tr>
+        <w:tc>
+          <w:tcPr>
+            <w:tcW w:type="dxa" w:w="4000"/>
+            <w:shd w:fill="ffffff" w:val="clear"/>
+            <w:tcMar>
+              <w:top w:type="dxa" w:w="70"/>
+              <w:left w:type="dxa" w:w="110"/>
+              <w:bottom w:type="dxa" w:w="70"/>
+              <w:right w:type="dxa" w:w="110"/>
+            </w:tcMar>
+          </w:tcPr>
+          <w:p>
+            <w:pPr>
+              <w:jc w:val="left"/>
+            </w:pPr>
+            <w:r>
+              <w:rPr>
+                <w:rFonts w:ascii="Calibri" w:cs="Calibri" w:eastAsia="Calibri" w:hAnsi="Calibri"/>
+                <w:b w:val="false"/>
+                <w:bCs w:val="false"/>
+                <w:color w:val="1a1a2e"/>
+                <w:sz w:val="19"/>
+                <w:szCs w:val="19"/>
+              </w:rPr>
+              <w:t xml:space="preserve">State skew</w:t>
+            </w:r>
+          </w:p>
+        </w:tc>
+        <w:tc>
+          <w:tcPr>
+            <w:tcW w:type="dxa" w:w="2900"/>
+            <w:shd w:fill="ffffff" w:val="clear"/>
+            <w:tcMar>
+              <w:top w:type="dxa" w:w="70"/>
+              <w:left w:type="dxa" w:w="110"/>
+              <w:bottom w:type="dxa" w:w="70"/>
+              <w:right w:type="dxa" w:w="110"/>
+            </w:tcMar>
+          </w:tcPr>
+          <w:p>
+            <w:pPr>
+              <w:jc w:val="right"/>
+            </w:pPr>
+            <w:r>
+              <w:rPr>
+                <w:rFonts w:ascii="Calibri" w:cs="Calibri" w:eastAsia="Calibri" w:hAnsi="Calibri"/>
+                <w:b w:val="false"/>
+                <w:bCs w:val="false"/>
+                <w:color w:val="1a1a2e"/>
+                <w:sz w:val="19"/>
+                <w:szCs w:val="19"/>
+              </w:rPr>
+              <w:t xml:space="preserve">Maharashtra +277 / Tamil Nadu −77 cr L</w:t>
+            </w:r>
+          </w:p>
+        </w:tc>
+        <w:tc>
+          <w:tcPr>
+            <w:tcW w:type="dxa" w:w="2900"/>
+            <w:shd w:fill="ffffff" w:val="clear"/>
+            <w:tcMar>
+              <w:top w:type="dxa" w:w="70"/>
+              <w:left w:type="dxa" w:w="110"/>
+              <w:bottom w:type="dxa" w:w="70"/>
+              <w:right w:type="dxa" w:w="110"/>
+            </w:tcMar>
+          </w:tcPr>
+          <w:p>
+            <w:pPr>
+              <w:jc w:val="right"/>
+            </w:pPr>
+            <w:r>
+              <w:rPr>
+                <w:rFonts w:ascii="Calibri" w:cs="Calibri" w:eastAsia="Calibri" w:hAnsi="Calibri"/>
+                <w:b w:val="false"/>
+                <w:bCs w:val="false"/>
+                <w:color w:val="1a1a2e"/>
+                <w:sz w:val="19"/>
+                <w:szCs w:val="19"/>
+              </w:rPr>
+              <w:t xml:space="preserve">CareEdge May-2026</w:t>
+            </w:r>
+          </w:p>
+        </w:tc>
+      </w:tr>
+    </w:tbl>
+    <w:p>
+      <w:pPr>
+        <w:spacing w:after="160" w:before="0"/>
+      </w:pPr>
+      <w:r>
+        <w:rPr>
+          <w:rFonts w:ascii="Calibri" w:cs="Calibri" w:eastAsia="Calibri" w:hAnsi="Calibri"/>
+          <w:i/>
+          <w:iCs/>
+          <w:color w:val="5a5a6e"/>
+          <w:sz w:val="18"/>
+          <w:szCs w:val="18"/>
+        </w:rPr>
+        <w:t xml:space="preserve">*ESY = Ethanol Supply Year (November–October). †KLPD = kilolitres per day; annualised at 330 operating days. ‡FCI = Food Corporation of India, which sells surplus rice to distilleries under the Open Market Sale Scheme (Domestic).</w:t>
+      </w:r>
+    </w:p>
+    <w:p>
+      <w:pPr>
+        <w:spacing w:after="120" w:before="0"/>
+      </w:pPr>
+      <w:r>
+        <w:rPr>
+          <w:rFonts w:ascii="Calibri" w:cs="Calibri" w:eastAsia="Calibri" w:hAnsi="Calibri"/>
+          <w:color w:val="1a1a2e"/>
+          <w:sz w:val="21"/>
+          <w:szCs w:val="21"/>
+        </w:rPr>
+        <w:t xml:space="preserve"/>
+      </w:r>
+    </w:p>
+    <w:p>
+      <w:pPr>
+        <w:spacing w:after="160" w:before="0"/>
+      </w:pPr>
+      <w:r>
+        <w:rPr>
+          <w:rFonts w:ascii="Calibri" w:cs="Calibri" w:eastAsia="Calibri" w:hAnsi="Calibri"/>
+          <w:color w:val="1a1a2e"/>
+          <w:sz w:val="21"/>
+          <w:szCs w:val="21"/>
+        </w:rPr>
+        <w:t xml:space="preserve">Result — the higher blends are the cure for the overcapacity, not a casualty of it. Capacity utilisation (fuel + non-fuel demand ÷ capacity) by blend, on today's 2,000 crore litres and on the 2,400 available by FY27:</w:t>
+      </w:r>
+    </w:p>
+    <w:tbl>
+      <w:tblPr>
+        <w:tblW w:type="dxa" w:w="9800"/>
+        <w:tblBorders>
+          <w:top w:val="single" w:color="c8d2dc" w:sz="2"/>
+          <w:left w:val="single" w:color="c8d2dc" w:sz="2"/>
+          <w:bottom w:val="single" w:color="c8d2dc" w:sz="2"/>
+          <w:right w:val="single" w:color="c8d2dc" w:sz="2"/>
+          <w:insideH w:val="single" w:color="c8d2dc" w:sz="2"/>
+          <w:insideV w:val="single" w:color="c8d2dc" w:sz="2"/>
+        </w:tblBorders>
+      </w:tblPr>
+      <w:tblGrid>
+        <w:gridCol w:w="1500"/>
+        <w:gridCol w:w="1300"/>
+        <w:gridCol w:w="1400"/>
+        <w:gridCol w:w="1300"/>
+        <w:gridCol w:w="1200"/>
+        <w:gridCol w:w="3100"/>
+      </w:tblGrid>
+      <w:tr>
+        <w:trPr>
+          <w:tblHeader/>
+        </w:trPr>
+        <w:tc>
+          <w:tcPr>
+            <w:tcW w:type="dxa" w:w="1500"/>
+            <w:shd w:fill="0f4c81" w:val="clear"/>
+            <w:tcMar>
+              <w:top w:type="dxa" w:w="70"/>
+              <w:left w:type="dxa" w:w="110"/>
+              <w:bottom w:type="dxa" w:w="70"/>
+              <w:right w:type="dxa" w:w="110"/>
+            </w:tcMar>
+          </w:tcPr>
+          <w:p>
+            <w:pPr>
+              <w:jc w:val="left"/>
+            </w:pPr>
+            <w:r>
+              <w:rPr>
+                <w:rFonts w:ascii="Calibri" w:cs="Calibri" w:eastAsia="Calibri" w:hAnsi="Calibri"/>
+                <w:b/>
+                <w:bCs/>
+                <w:color w:val="ffffff"/>
+                <w:sz w:val="19"/>
+                <w:szCs w:val="19"/>
+              </w:rPr>
+              <w:t xml:space="preserve">Blend</w:t>
+            </w:r>
+          </w:p>
+        </w:tc>
+        <w:tc>
+          <w:tcPr>
+            <w:tcW w:type="dxa" w:w="1300"/>
+            <w:shd w:fill="0f4c81" w:val="clear"/>
+            <w:tcMar>
+              <w:top w:type="dxa" w:w="70"/>
+              <w:left w:type="dxa" w:w="110"/>
+              <w:bottom w:type="dxa" w:w="70"/>
+              <w:right w:type="dxa" w:w="110"/>
+            </w:tcMar>
+          </w:tcPr>
+          <w:p>
+            <w:pPr>
+              <w:jc w:val="right"/>
+            </w:pPr>
+            <w:r>
+              <w:rPr>
+                <w:rFonts w:ascii="Calibri" w:cs="Calibri" w:eastAsia="Calibri" w:hAnsi="Calibri"/>
+                <w:b/>
+                <w:bCs/>
+                <w:color w:val="ffffff"/>
+                <w:sz w:val="19"/>
+                <w:szCs w:val="19"/>
+              </w:rPr>
+              <w:t xml:space="preserve">Fuel ethanol (cr L)</w:t>
+            </w:r>
+          </w:p>
+        </w:tc>
+        <w:tc>
+          <w:tcPr>
+            <w:tcW w:type="dxa" w:w="1400"/>
+            <w:shd w:fill="0f4c81" w:val="clear"/>
+            <w:tcMar>
+              <w:top w:type="dxa" w:w="70"/>
+              <w:left w:type="dxa" w:w="110"/>
+              <w:bottom w:type="dxa" w:w="70"/>
+              <w:right w:type="dxa" w:w="110"/>
+            </w:tcMar>
+          </w:tcPr>
+          <w:p>
+            <w:pPr>
+              <w:jc w:val="right"/>
+            </w:pPr>
+            <w:r>
+              <w:rPr>
+                <w:rFonts w:ascii="Calibri" w:cs="Calibri" w:eastAsia="Calibri" w:hAnsi="Calibri"/>
+                <w:b/>
+                <w:bCs/>
+                <w:color w:val="ffffff"/>
+                <w:sz w:val="19"/>
+                <w:szCs w:val="19"/>
+              </w:rPr>
+              <w:t xml:space="preserve">Total incl. non-fuel</w:t>
+            </w:r>
+          </w:p>
+        </w:tc>
+        <w:tc>
+          <w:tcPr>
+            <w:tcW w:type="dxa" w:w="1300"/>
+            <w:shd w:fill="0f4c81" w:val="clear"/>
+            <w:tcMar>
+              <w:top w:type="dxa" w:w="70"/>
+              <w:left w:type="dxa" w:w="110"/>
+              <w:bottom w:type="dxa" w:w="70"/>
+              <w:right w:type="dxa" w:w="110"/>
+            </w:tcMar>
+          </w:tcPr>
+          <w:p>
+            <w:pPr>
+              <w:jc w:val="right"/>
+            </w:pPr>
+            <w:r>
+              <w:rPr>
+                <w:rFonts w:ascii="Calibri" w:cs="Calibri" w:eastAsia="Calibri" w:hAnsi="Calibri"/>
+                <w:b/>
+                <w:bCs/>
+                <w:color w:val="ffffff"/>
+                <w:sz w:val="19"/>
+                <w:szCs w:val="19"/>
+              </w:rPr>
+              <w:t xml:space="preserve">Utilisation on 2,000</w:t>
+            </w:r>
+          </w:p>
+        </w:tc>
+        <w:tc>
+          <w:tcPr>
+            <w:tcW w:type="dxa" w:w="1200"/>
+            <w:shd w:fill="0f4c81" w:val="clear"/>
+            <w:tcMar>
+              <w:top w:type="dxa" w:w="70"/>
+              <w:left w:type="dxa" w:w="110"/>
+              <w:bottom w:type="dxa" w:w="70"/>
+              <w:right w:type="dxa" w:w="110"/>
+            </w:tcMar>
+          </w:tcPr>
+          <w:p>
+            <w:pPr>
+              <w:jc w:val="right"/>
+            </w:pPr>
+            <w:r>
+              <w:rPr>
+                <w:rFonts w:ascii="Calibri" w:cs="Calibri" w:eastAsia="Calibri" w:hAnsi="Calibri"/>
+                <w:b/>
+                <w:bCs/>
+                <w:color w:val="ffffff"/>
+                <w:sz w:val="19"/>
+                <w:szCs w:val="19"/>
+              </w:rPr>
+              <w:t xml:space="preserve">On 2,400 (FY27)</w:t>
+            </w:r>
+          </w:p>
+        </w:tc>
+        <w:tc>
+          <w:tcPr>
+            <w:tcW w:type="dxa" w:w="3100"/>
+            <w:shd w:fill="0f4c81" w:val="clear"/>
+            <w:tcMar>
+              <w:top w:type="dxa" w:w="70"/>
+              <w:left w:type="dxa" w:w="110"/>
+              <w:bottom w:type="dxa" w:w="70"/>
+              <w:right w:type="dxa" w:w="110"/>
+            </w:tcMar>
+          </w:tcPr>
+          <w:p>
+            <w:pPr>
+              <w:jc w:val="right"/>
+            </w:pPr>
+            <w:r>
+              <w:rPr>
+                <w:rFonts w:ascii="Calibri" w:cs="Calibri" w:eastAsia="Calibri" w:hAnsi="Calibri"/>
+                <w:b/>
+                <w:bCs/>
+                <w:color w:val="ffffff"/>
+                <w:sz w:val="19"/>
+                <w:szCs w:val="19"/>
+              </w:rPr>
+              <w:t xml:space="preserve">Verdict</w:t>
+            </w:r>
+          </w:p>
+        </w:tc>
+      </w:tr>
+      <w:tr>
+        <w:tc>
+          <w:tcPr>
+            <w:tcW w:type="dxa" w:w="1500"/>
+            <w:shd w:fill="ffffff" w:val="clear"/>
+            <w:tcMar>
+              <w:top w:type="dxa" w:w="70"/>
+              <w:left w:type="dxa" w:w="110"/>
+              <w:bottom w:type="dxa" w:w="70"/>
+              <w:right w:type="dxa" w:w="110"/>
+            </w:tcMar>
+          </w:tcPr>
+          <w:p>
+            <w:pPr>
+              <w:jc w:val="left"/>
+            </w:pPr>
+            <w:r>
+              <w:rPr>
+                <w:rFonts w:ascii="Calibri" w:cs="Calibri" w:eastAsia="Calibri" w:hAnsi="Calibri"/>
+                <w:b w:val="false"/>
+                <w:bCs w:val="false"/>
+                <w:color w:val="1a1a2e"/>
+                <w:sz w:val="19"/>
+                <w:szCs w:val="19"/>
+              </w:rPr>
+              <w:t xml:space="preserve">E20 (today)</w:t>
+            </w:r>
+          </w:p>
+        </w:tc>
+        <w:tc>
+          <w:tcPr>
+            <w:tcW w:type="dxa" w:w="1300"/>
+            <w:shd w:fill="ffffff" w:val="clear"/>
+            <w:tcMar>
+              <w:top w:type="dxa" w:w="70"/>
+              <w:left w:type="dxa" w:w="110"/>
+              <w:bottom w:type="dxa" w:w="70"/>
+              <w:right w:type="dxa" w:w="110"/>
+            </w:tcMar>
+          </w:tcPr>
+          <w:p>
+            <w:pPr>
+              <w:jc w:val="right"/>
+            </w:pPr>
+            <w:r>
+              <w:rPr>
+                <w:rFonts w:ascii="Calibri" w:cs="Calibri" w:eastAsia="Calibri" w:hAnsi="Calibri"/>
+                <w:b w:val="false"/>
+                <w:bCs w:val="false"/>
+                <w:color w:val="1a1a2e"/>
+                <w:sz w:val="19"/>
+                <w:szCs w:val="19"/>
+              </w:rPr>
+              <w:t xml:space="preserve">1,081</w:t>
+            </w:r>
+          </w:p>
+        </w:tc>
+        <w:tc>
+          <w:tcPr>
+            <w:tcW w:type="dxa" w:w="1400"/>
+            <w:shd w:fill="ffffff" w:val="clear"/>
+            <w:tcMar>
+              <w:top w:type="dxa" w:w="70"/>
+              <w:left w:type="dxa" w:w="110"/>
+              <w:bottom w:type="dxa" w:w="70"/>
+              <w:right w:type="dxa" w:w="110"/>
+            </w:tcMar>
+          </w:tcPr>
+          <w:p>
+            <w:pPr>
+              <w:jc w:val="right"/>
+            </w:pPr>
+            <w:r>
+              <w:rPr>
+                <w:rFonts w:ascii="Calibri" w:cs="Calibri" w:eastAsia="Calibri" w:hAnsi="Calibri"/>
+                <w:b w:val="false"/>
+                <w:bCs w:val="false"/>
+                <w:color w:val="1a1a2e"/>
+                <w:sz w:val="19"/>
+                <w:szCs w:val="19"/>
+              </w:rPr>
+              <w:t xml:space="preserve">1,406</w:t>
+            </w:r>
+          </w:p>
+        </w:tc>
+        <w:tc>
+          <w:tcPr>
+            <w:tcW w:type="dxa" w:w="1300"/>
+            <w:shd w:fill="ffffff" w:val="clear"/>
+            <w:tcMar>
+              <w:top w:type="dxa" w:w="70"/>
+              <w:left w:type="dxa" w:w="110"/>
+              <w:bottom w:type="dxa" w:w="70"/>
+              <w:right w:type="dxa" w:w="110"/>
+            </w:tcMar>
+          </w:tcPr>
+          <w:p>
+            <w:pPr>
+              <w:jc w:val="right"/>
+            </w:pPr>
+            <w:r>
+              <w:rPr>
+                <w:rFonts w:ascii="Calibri" w:cs="Calibri" w:eastAsia="Calibri" w:hAnsi="Calibri"/>
+                <w:b w:val="false"/>
+                <w:bCs w:val="false"/>
+                <w:color w:val="1a1a2e"/>
+                <w:sz w:val="19"/>
+                <w:szCs w:val="19"/>
+              </w:rPr>
+              <w:t xml:space="preserve">70%</w:t>
+            </w:r>
+          </w:p>
+        </w:tc>
+        <w:tc>
+          <w:tcPr>
+            <w:tcW w:type="dxa" w:w="1200"/>
+            <w:shd w:fill="ffffff" w:val="clear"/>
+            <w:tcMar>
+              <w:top w:type="dxa" w:w="70"/>
+              <w:left w:type="dxa" w:w="110"/>
+              <w:bottom w:type="dxa" w:w="70"/>
+              <w:right w:type="dxa" w:w="110"/>
+            </w:tcMar>
+          </w:tcPr>
+          <w:p>
+            <w:pPr>
+              <w:jc w:val="right"/>
+            </w:pPr>
+            <w:r>
+              <w:rPr>
+                <w:rFonts w:ascii="Calibri" w:cs="Calibri" w:eastAsia="Calibri" w:hAnsi="Calibri"/>
+                <w:b w:val="false"/>
+                <w:bCs w:val="false"/>
+                <w:color w:val="1a1a2e"/>
+                <w:sz w:val="19"/>
+                <w:szCs w:val="19"/>
+              </w:rPr>
+              <w:t xml:space="preserve">59%</w:t>
+            </w:r>
+          </w:p>
+        </w:tc>
+        <w:tc>
+          <w:tcPr>
+            <w:tcW w:type="dxa" w:w="3100"/>
+            <w:shd w:fill="ffffff" w:val="clear"/>
+            <w:tcMar>
+              <w:top w:type="dxa" w:w="70"/>
+              <w:left w:type="dxa" w:w="110"/>
+              <w:bottom w:type="dxa" w:w="70"/>
+              <w:right w:type="dxa" w:w="110"/>
+            </w:tcMar>
+          </w:tcPr>
+          <w:p>
+            <w:pPr>
+              <w:jc w:val="right"/>
+            </w:pPr>
+            <w:r>
+              <w:rPr>
+                <w:rFonts w:ascii="Calibri" w:cs="Calibri" w:eastAsia="Calibri" w:hAnsi="Calibri"/>
+                <w:b w:val="false"/>
+                <w:bCs w:val="false"/>
+                <w:color w:val="1a1a2e"/>
+                <w:sz w:val="19"/>
+                <w:szCs w:val="19"/>
+              </w:rPr>
+              <w:t xml:space="preserve">structural overcapacity — CareEdge's ~60% absorption</w:t>
+            </w:r>
+          </w:p>
+        </w:tc>
+      </w:tr>
+      <w:tr>
+        <w:tc>
+          <w:tcPr>
+            <w:tcW w:type="dxa" w:w="1500"/>
+            <w:shd w:fill="eef3f8" w:val="clear"/>
+            <w:tcMar>
+              <w:top w:type="dxa" w:w="70"/>
+              <w:left w:type="dxa" w:w="110"/>
+              <w:bottom w:type="dxa" w:w="70"/>
+              <w:right w:type="dxa" w:w="110"/>
+            </w:tcMar>
+          </w:tcPr>
+          <w:p>
+            <w:pPr>
+              <w:jc w:val="left"/>
+            </w:pPr>
+            <w:r>
+              <w:rPr>
+                <w:rFonts w:ascii="Calibri" w:cs="Calibri" w:eastAsia="Calibri" w:hAnsi="Calibri"/>
+                <w:b w:val="false"/>
+                <w:bCs w:val="false"/>
+                <w:color w:val="1a1a2e"/>
+                <w:sz w:val="19"/>
+                <w:szCs w:val="19"/>
+              </w:rPr>
+              <w:t xml:space="preserve">E25</w:t>
+            </w:r>
+          </w:p>
+        </w:tc>
+        <w:tc>
+          <w:tcPr>
+            <w:tcW w:type="dxa" w:w="1300"/>
+            <w:shd w:fill="eef3f8" w:val="clear"/>
+            <w:tcMar>
+              <w:top w:type="dxa" w:w="70"/>
+              <w:left w:type="dxa" w:w="110"/>
+              <w:bottom w:type="dxa" w:w="70"/>
+              <w:right w:type="dxa" w:w="110"/>
+            </w:tcMar>
+          </w:tcPr>
+          <w:p>
+            <w:pPr>
+              <w:jc w:val="right"/>
+            </w:pPr>
+            <w:r>
+              <w:rPr>
+                <w:rFonts w:ascii="Calibri" w:cs="Calibri" w:eastAsia="Calibri" w:hAnsi="Calibri"/>
+                <w:b w:val="false"/>
+                <w:bCs w:val="false"/>
+                <w:color w:val="1a1a2e"/>
+                <w:sz w:val="19"/>
+                <w:szCs w:val="19"/>
+              </w:rPr>
+              <w:t xml:space="preserve">1,373</w:t>
+            </w:r>
+          </w:p>
+        </w:tc>
+        <w:tc>
+          <w:tcPr>
+            <w:tcW w:type="dxa" w:w="1400"/>
+            <w:shd w:fill="eef3f8" w:val="clear"/>
+            <w:tcMar>
+              <w:top w:type="dxa" w:w="70"/>
+              <w:left w:type="dxa" w:w="110"/>
+              <w:bottom w:type="dxa" w:w="70"/>
+              <w:right w:type="dxa" w:w="110"/>
+            </w:tcMar>
+          </w:tcPr>
+          <w:p>
+            <w:pPr>
+              <w:jc w:val="right"/>
+            </w:pPr>
+            <w:r>
+              <w:rPr>
+                <w:rFonts w:ascii="Calibri" w:cs="Calibri" w:eastAsia="Calibri" w:hAnsi="Calibri"/>
+                <w:b w:val="false"/>
+                <w:bCs w:val="false"/>
+                <w:color w:val="1a1a2e"/>
+                <w:sz w:val="19"/>
+                <w:szCs w:val="19"/>
+              </w:rPr>
+              <w:t xml:space="preserve">1,698</w:t>
+            </w:r>
+          </w:p>
+        </w:tc>
+        <w:tc>
+          <w:tcPr>
+            <w:tcW w:type="dxa" w:w="1300"/>
+            <w:shd w:fill="eef3f8" w:val="clear"/>
+            <w:tcMar>
+              <w:top w:type="dxa" w:w="70"/>
+              <w:left w:type="dxa" w:w="110"/>
+              <w:bottom w:type="dxa" w:w="70"/>
+              <w:right w:type="dxa" w:w="110"/>
+            </w:tcMar>
+          </w:tcPr>
+          <w:p>
+            <w:pPr>
+              <w:jc w:val="right"/>
+            </w:pPr>
+            <w:r>
+              <w:rPr>
+                <w:rFonts w:ascii="Calibri" w:cs="Calibri" w:eastAsia="Calibri" w:hAnsi="Calibri"/>
+                <w:b w:val="false"/>
+                <w:bCs w:val="false"/>
+                <w:color w:val="1a1a2e"/>
+                <w:sz w:val="19"/>
+                <w:szCs w:val="19"/>
+              </w:rPr>
+              <w:t xml:space="preserve">85%</w:t>
+            </w:r>
+          </w:p>
+        </w:tc>
+        <w:tc>
+          <w:tcPr>
+            <w:tcW w:type="dxa" w:w="1200"/>
+            <w:shd w:fill="eef3f8" w:val="clear"/>
+            <w:tcMar>
+              <w:top w:type="dxa" w:w="70"/>
+              <w:left w:type="dxa" w:w="110"/>
+              <w:bottom w:type="dxa" w:w="70"/>
+              <w:right w:type="dxa" w:w="110"/>
+            </w:tcMar>
+          </w:tcPr>
+          <w:p>
+            <w:pPr>
+              <w:jc w:val="right"/>
+            </w:pPr>
+            <w:r>
+              <w:rPr>
+                <w:rFonts w:ascii="Calibri" w:cs="Calibri" w:eastAsia="Calibri" w:hAnsi="Calibri"/>
+                <w:b w:val="false"/>
+                <w:bCs w:val="false"/>
+                <w:color w:val="1a1a2e"/>
+                <w:sz w:val="19"/>
+                <w:szCs w:val="19"/>
+              </w:rPr>
+              <w:t xml:space="preserve">71%</w:t>
+            </w:r>
+          </w:p>
+        </w:tc>
+        <w:tc>
+          <w:tcPr>
+            <w:tcW w:type="dxa" w:w="3100"/>
+            <w:shd w:fill="eef3f8" w:val="clear"/>
+            <w:tcMar>
+              <w:top w:type="dxa" w:w="70"/>
+              <w:left w:type="dxa" w:w="110"/>
+              <w:bottom w:type="dxa" w:w="70"/>
+              <w:right w:type="dxa" w:w="110"/>
+            </w:tcMar>
+          </w:tcPr>
+          <w:p>
+            <w:pPr>
+              <w:jc w:val="right"/>
+            </w:pPr>
+            <w:r>
+              <w:rPr>
+                <w:rFonts w:ascii="Calibri" w:cs="Calibri" w:eastAsia="Calibri" w:hAnsi="Calibri"/>
+                <w:b w:val="false"/>
+                <w:bCs w:val="false"/>
+                <w:color w:val="1a1a2e"/>
+                <w:sz w:val="19"/>
+                <w:szCs w:val="19"/>
+              </w:rPr>
+              <w:t xml:space="preserve">mid consolidation band</w:t>
+            </w:r>
+          </w:p>
+        </w:tc>
+      </w:tr>
+      <w:tr>
+        <w:tc>
+          <w:tcPr>
+            <w:tcW w:type="dxa" w:w="1500"/>
+            <w:shd w:fill="ffffff" w:val="clear"/>
+            <w:tcMar>
+              <w:top w:type="dxa" w:w="70"/>
+              <w:left w:type="dxa" w:w="110"/>
+              <w:bottom w:type="dxa" w:w="70"/>
+              <w:right w:type="dxa" w:w="110"/>
+            </w:tcMar>
+          </w:tcPr>
+          <w:p>
+            <w:pPr>
+              <w:jc w:val="left"/>
+            </w:pPr>
+            <w:r>
+              <w:rPr>
+                <w:rFonts w:ascii="Calibri" w:cs="Calibri" w:eastAsia="Calibri" w:hAnsi="Calibri"/>
+                <w:b w:val="false"/>
+                <w:bCs w:val="false"/>
+                <w:color w:val="1a1a2e"/>
+                <w:sz w:val="19"/>
+                <w:szCs w:val="19"/>
+              </w:rPr>
+              <w:t xml:space="preserve">E27</w:t>
+            </w:r>
+          </w:p>
+        </w:tc>
+        <w:tc>
+          <w:tcPr>
+            <w:tcW w:type="dxa" w:w="1300"/>
+            <w:shd w:fill="ffffff" w:val="clear"/>
+            <w:tcMar>
+              <w:top w:type="dxa" w:w="70"/>
+              <w:left w:type="dxa" w:w="110"/>
+              <w:bottom w:type="dxa" w:w="70"/>
+              <w:right w:type="dxa" w:w="110"/>
+            </w:tcMar>
+          </w:tcPr>
+          <w:p>
+            <w:pPr>
+              <w:jc w:val="right"/>
+            </w:pPr>
+            <w:r>
+              <w:rPr>
+                <w:rFonts w:ascii="Calibri" w:cs="Calibri" w:eastAsia="Calibri" w:hAnsi="Calibri"/>
+                <w:b w:val="false"/>
+                <w:bCs w:val="false"/>
+                <w:color w:val="1a1a2e"/>
+                <w:sz w:val="19"/>
+                <w:szCs w:val="19"/>
+              </w:rPr>
+              <w:t xml:space="preserve">1,494</w:t>
+            </w:r>
+          </w:p>
+        </w:tc>
+        <w:tc>
+          <w:tcPr>
+            <w:tcW w:type="dxa" w:w="1400"/>
+            <w:shd w:fill="ffffff" w:val="clear"/>
+            <w:tcMar>
+              <w:top w:type="dxa" w:w="70"/>
+              <w:left w:type="dxa" w:w="110"/>
+              <w:bottom w:type="dxa" w:w="70"/>
+              <w:right w:type="dxa" w:w="110"/>
+            </w:tcMar>
+          </w:tcPr>
+          <w:p>
+            <w:pPr>
+              <w:jc w:val="right"/>
+            </w:pPr>
+            <w:r>
+              <w:rPr>
+                <w:rFonts w:ascii="Calibri" w:cs="Calibri" w:eastAsia="Calibri" w:hAnsi="Calibri"/>
+                <w:b w:val="false"/>
+                <w:bCs w:val="false"/>
+                <w:color w:val="1a1a2e"/>
+                <w:sz w:val="19"/>
+                <w:szCs w:val="19"/>
+              </w:rPr>
+              <w:t xml:space="preserve">1,819</w:t>
+            </w:r>
+          </w:p>
+        </w:tc>
+        <w:tc>
+          <w:tcPr>
+            <w:tcW w:type="dxa" w:w="1300"/>
+            <w:shd w:fill="ffffff" w:val="clear"/>
+            <w:tcMar>
+              <w:top w:type="dxa" w:w="70"/>
+              <w:left w:type="dxa" w:w="110"/>
+              <w:bottom w:type="dxa" w:w="70"/>
+              <w:right w:type="dxa" w:w="110"/>
+            </w:tcMar>
+          </w:tcPr>
+          <w:p>
+            <w:pPr>
+              <w:jc w:val="right"/>
+            </w:pPr>
+            <w:r>
+              <w:rPr>
+                <w:rFonts w:ascii="Calibri" w:cs="Calibri" w:eastAsia="Calibri" w:hAnsi="Calibri"/>
+                <w:b w:val="false"/>
+                <w:bCs w:val="false"/>
+                <w:color w:val="1a1a2e"/>
+                <w:sz w:val="19"/>
+                <w:szCs w:val="19"/>
+              </w:rPr>
+              <w:t xml:space="preserve">91%</w:t>
+            </w:r>
+          </w:p>
+        </w:tc>
+        <w:tc>
+          <w:tcPr>
+            <w:tcW w:type="dxa" w:w="1200"/>
+            <w:shd w:fill="ffffff" w:val="clear"/>
+            <w:tcMar>
+              <w:top w:type="dxa" w:w="70"/>
+              <w:left w:type="dxa" w:w="110"/>
+              <w:bottom w:type="dxa" w:w="70"/>
+              <w:right w:type="dxa" w:w="110"/>
+            </w:tcMar>
+          </w:tcPr>
+          <w:p>
+            <w:pPr>
+              <w:jc w:val="right"/>
+            </w:pPr>
+            <w:r>
+              <w:rPr>
+                <w:rFonts w:ascii="Calibri" w:cs="Calibri" w:eastAsia="Calibri" w:hAnsi="Calibri"/>
+                <w:b w:val="false"/>
+                <w:bCs w:val="false"/>
+                <w:color w:val="1a1a2e"/>
+                <w:sz w:val="19"/>
+                <w:szCs w:val="19"/>
+              </w:rPr>
+              <w:t xml:space="preserve">76%</w:t>
+            </w:r>
+          </w:p>
+        </w:tc>
+        <w:tc>
+          <w:tcPr>
+            <w:tcW w:type="dxa" w:w="3100"/>
+            <w:shd w:fill="ffffff" w:val="clear"/>
+            <w:tcMar>
+              <w:top w:type="dxa" w:w="70"/>
+              <w:left w:type="dxa" w:w="110"/>
+              <w:bottom w:type="dxa" w:w="70"/>
+              <w:right w:type="dxa" w:w="110"/>
+            </w:tcMar>
+          </w:tcPr>
+          <w:p>
+            <w:pPr>
+              <w:jc w:val="right"/>
+            </w:pPr>
+            <w:r>
+              <w:rPr>
+                <w:rFonts w:ascii="Calibri" w:cs="Calibri" w:eastAsia="Calibri" w:hAnsi="Calibri"/>
+                <w:b w:val="false"/>
+                <w:bCs w:val="false"/>
+                <w:color w:val="1a1a2e"/>
+                <w:sz w:val="19"/>
+                <w:szCs w:val="19"/>
+              </w:rPr>
+              <w:t xml:space="preserve">sweet spot — absorbs state surpluses, no new build</w:t>
+            </w:r>
+          </w:p>
+        </w:tc>
+      </w:tr>
+      <w:tr>
+        <w:tc>
+          <w:tcPr>
+            <w:tcW w:type="dxa" w:w="1500"/>
+            <w:shd w:fill="eef3f8" w:val="clear"/>
+            <w:tcMar>
+              <w:top w:type="dxa" w:w="70"/>
+              <w:left w:type="dxa" w:w="110"/>
+              <w:bottom w:type="dxa" w:w="70"/>
+              <w:right w:type="dxa" w:w="110"/>
+            </w:tcMar>
+          </w:tcPr>
+          <w:p>
+            <w:pPr>
+              <w:jc w:val="left"/>
+            </w:pPr>
+            <w:r>
+              <w:rPr>
+                <w:rFonts w:ascii="Calibri" w:cs="Calibri" w:eastAsia="Calibri" w:hAnsi="Calibri"/>
+                <w:b w:val="false"/>
+                <w:bCs w:val="false"/>
+                <w:color w:val="1a1a2e"/>
+                <w:sz w:val="19"/>
+                <w:szCs w:val="19"/>
+              </w:rPr>
+              <w:t xml:space="preserve">E30 (today's pool)</w:t>
+            </w:r>
+          </w:p>
+        </w:tc>
+        <w:tc>
+          <w:tcPr>
+            <w:tcW w:type="dxa" w:w="1300"/>
+            <w:shd w:fill="eef3f8" w:val="clear"/>
+            <w:tcMar>
+              <w:top w:type="dxa" w:w="70"/>
+              <w:left w:type="dxa" w:w="110"/>
+              <w:bottom w:type="dxa" w:w="70"/>
+              <w:right w:type="dxa" w:w="110"/>
+            </w:tcMar>
+          </w:tcPr>
+          <w:p>
+            <w:pPr>
+              <w:jc w:val="right"/>
+            </w:pPr>
+            <w:r>
+              <w:rPr>
+                <w:rFonts w:ascii="Calibri" w:cs="Calibri" w:eastAsia="Calibri" w:hAnsi="Calibri"/>
+                <w:b w:val="false"/>
+                <w:bCs w:val="false"/>
+                <w:color w:val="1a1a2e"/>
+                <w:sz w:val="19"/>
+                <w:szCs w:val="19"/>
+              </w:rPr>
+              <w:t xml:space="preserve">1,674</w:t>
+            </w:r>
+          </w:p>
+        </w:tc>
+        <w:tc>
+          <w:tcPr>
+            <w:tcW w:type="dxa" w:w="1400"/>
+            <w:shd w:fill="eef3f8" w:val="clear"/>
+            <w:tcMar>
+              <w:top w:type="dxa" w:w="70"/>
+              <w:left w:type="dxa" w:w="110"/>
+              <w:bottom w:type="dxa" w:w="70"/>
+              <w:right w:type="dxa" w:w="110"/>
+            </w:tcMar>
+          </w:tcPr>
+          <w:p>
+            <w:pPr>
+              <w:jc w:val="right"/>
+            </w:pPr>
+            <w:r>
+              <w:rPr>
+                <w:rFonts w:ascii="Calibri" w:cs="Calibri" w:eastAsia="Calibri" w:hAnsi="Calibri"/>
+                <w:b w:val="false"/>
+                <w:bCs w:val="false"/>
+                <w:color w:val="1a1a2e"/>
+                <w:sz w:val="19"/>
+                <w:szCs w:val="19"/>
+              </w:rPr>
+              <w:t xml:space="preserve">1,999</w:t>
+            </w:r>
+          </w:p>
+        </w:tc>
+        <w:tc>
+          <w:tcPr>
+            <w:tcW w:type="dxa" w:w="1300"/>
+            <w:shd w:fill="eef3f8" w:val="clear"/>
+            <w:tcMar>
+              <w:top w:type="dxa" w:w="70"/>
+              <w:left w:type="dxa" w:w="110"/>
+              <w:bottom w:type="dxa" w:w="70"/>
+              <w:right w:type="dxa" w:w="110"/>
+            </w:tcMar>
+          </w:tcPr>
+          <w:p>
+            <w:pPr>
+              <w:jc w:val="right"/>
+            </w:pPr>
+            <w:r>
+              <w:rPr>
+                <w:rFonts w:ascii="Calibri" w:cs="Calibri" w:eastAsia="Calibri" w:hAnsi="Calibri"/>
+                <w:b w:val="false"/>
+                <w:bCs w:val="false"/>
+                <w:color w:val="1a1a2e"/>
+                <w:sz w:val="19"/>
+                <w:szCs w:val="19"/>
+              </w:rPr>
+              <w:t xml:space="preserve">100%</w:t>
+            </w:r>
+          </w:p>
+        </w:tc>
+        <w:tc>
+          <w:tcPr>
+            <w:tcW w:type="dxa" w:w="1200"/>
+            <w:shd w:fill="eef3f8" w:val="clear"/>
+            <w:tcMar>
+              <w:top w:type="dxa" w:w="70"/>
+              <w:left w:type="dxa" w:w="110"/>
+              <w:bottom w:type="dxa" w:w="70"/>
+              <w:right w:type="dxa" w:w="110"/>
+            </w:tcMar>
+          </w:tcPr>
+          <w:p>
+            <w:pPr>
+              <w:jc w:val="right"/>
+            </w:pPr>
+            <w:r>
+              <w:rPr>
+                <w:rFonts w:ascii="Calibri" w:cs="Calibri" w:eastAsia="Calibri" w:hAnsi="Calibri"/>
+                <w:b w:val="false"/>
+                <w:bCs w:val="false"/>
+                <w:color w:val="1a1a2e"/>
+                <w:sz w:val="19"/>
+                <w:szCs w:val="19"/>
+              </w:rPr>
+              <w:t xml:space="preserve">83%</w:t>
+            </w:r>
+          </w:p>
+        </w:tc>
+        <w:tc>
+          <w:tcPr>
+            <w:tcW w:type="dxa" w:w="3100"/>
+            <w:shd w:fill="eef3f8" w:val="clear"/>
+            <w:tcMar>
+              <w:top w:type="dxa" w:w="70"/>
+              <w:left w:type="dxa" w:w="110"/>
+              <w:bottom w:type="dxa" w:w="70"/>
+              <w:right w:type="dxa" w:w="110"/>
+            </w:tcMar>
+          </w:tcPr>
+          <w:p>
+            <w:pPr>
+              <w:jc w:val="right"/>
+            </w:pPr>
+            <w:r>
+              <w:rPr>
+                <w:rFonts w:ascii="Calibri" w:cs="Calibri" w:eastAsia="Calibri" w:hAnsi="Calibri"/>
+                <w:b w:val="false"/>
+                <w:bCs w:val="false"/>
+                <w:color w:val="1a1a2e"/>
+                <w:sz w:val="19"/>
+                <w:szCs w:val="19"/>
+              </w:rPr>
+              <w:t xml:space="preserve">fits; leans on marginal maize</w:t>
+            </w:r>
+          </w:p>
+        </w:tc>
+      </w:tr>
+      <w:tr>
+        <w:tc>
+          <w:tcPr>
+            <w:tcW w:type="dxa" w:w="1500"/>
+            <w:shd w:fill="ffffff" w:val="clear"/>
+            <w:tcMar>
+              <w:top w:type="dxa" w:w="70"/>
+              <w:left w:type="dxa" w:w="110"/>
+              <w:bottom w:type="dxa" w:w="70"/>
+              <w:right w:type="dxa" w:w="110"/>
+            </w:tcMar>
+          </w:tcPr>
+          <w:p>
+            <w:pPr>
+              <w:jc w:val="left"/>
+            </w:pPr>
+            <w:r>
+              <w:rPr>
+                <w:rFonts w:ascii="Calibri" w:cs="Calibri" w:eastAsia="Calibri" w:hAnsi="Calibri"/>
+                <w:b w:val="false"/>
+                <w:bCs w:val="false"/>
+                <w:color w:val="1a1a2e"/>
+                <w:sz w:val="19"/>
+                <w:szCs w:val="19"/>
+              </w:rPr>
+              <w:t xml:space="preserve">E30 demand-grown, FY30-31</w:t>
+            </w:r>
+          </w:p>
+        </w:tc>
+        <w:tc>
+          <w:tcPr>
+            <w:tcW w:type="dxa" w:w="1300"/>
+            <w:shd w:fill="ffffff" w:val="clear"/>
+            <w:tcMar>
+              <w:top w:type="dxa" w:w="70"/>
+              <w:left w:type="dxa" w:w="110"/>
+              <w:bottom w:type="dxa" w:w="70"/>
+              <w:right w:type="dxa" w:w="110"/>
+            </w:tcMar>
+          </w:tcPr>
+          <w:p>
+            <w:pPr>
+              <w:jc w:val="right"/>
+            </w:pPr>
+            <w:r>
+              <w:rPr>
+                <w:rFonts w:ascii="Calibri" w:cs="Calibri" w:eastAsia="Calibri" w:hAnsi="Calibri"/>
+                <w:b w:val="false"/>
+                <w:bCs w:val="false"/>
+                <w:color w:val="1a1a2e"/>
+                <w:sz w:val="19"/>
+                <w:szCs w:val="19"/>
+              </w:rPr>
+              <w:t xml:space="preserve">2,173</w:t>
+            </w:r>
+          </w:p>
+        </w:tc>
+        <w:tc>
+          <w:tcPr>
+            <w:tcW w:type="dxa" w:w="1400"/>
+            <w:shd w:fill="ffffff" w:val="clear"/>
+            <w:tcMar>
+              <w:top w:type="dxa" w:w="70"/>
+              <w:left w:type="dxa" w:w="110"/>
+              <w:bottom w:type="dxa" w:w="70"/>
+              <w:right w:type="dxa" w:w="110"/>
+            </w:tcMar>
+          </w:tcPr>
+          <w:p>
+            <w:pPr>
+              <w:jc w:val="right"/>
+            </w:pPr>
+            <w:r>
+              <w:rPr>
+                <w:rFonts w:ascii="Calibri" w:cs="Calibri" w:eastAsia="Calibri" w:hAnsi="Calibri"/>
+                <w:b w:val="false"/>
+                <w:bCs w:val="false"/>
+                <w:color w:val="1a1a2e"/>
+                <w:sz w:val="19"/>
+                <w:szCs w:val="19"/>
+              </w:rPr>
+              <w:t xml:space="preserve">2,498</w:t>
+            </w:r>
+          </w:p>
+        </w:tc>
+        <w:tc>
+          <w:tcPr>
+            <w:tcW w:type="dxa" w:w="1300"/>
+            <w:shd w:fill="ffffff" w:val="clear"/>
+            <w:tcMar>
+              <w:top w:type="dxa" w:w="70"/>
+              <w:left w:type="dxa" w:w="110"/>
+              <w:bottom w:type="dxa" w:w="70"/>
+              <w:right w:type="dxa" w:w="110"/>
+            </w:tcMar>
+          </w:tcPr>
+          <w:p>
+            <w:pPr>
+              <w:jc w:val="right"/>
+            </w:pPr>
+            <w:r>
+              <w:rPr>
+                <w:rFonts w:ascii="Calibri" w:cs="Calibri" w:eastAsia="Calibri" w:hAnsi="Calibri"/>
+                <w:b w:val="false"/>
+                <w:bCs w:val="false"/>
+                <w:color w:val="1a1a2e"/>
+                <w:sz w:val="19"/>
+                <w:szCs w:val="19"/>
+              </w:rPr>
+              <w:t xml:space="preserve">—</w:t>
+            </w:r>
+          </w:p>
+        </w:tc>
+        <w:tc>
+          <w:tcPr>
+            <w:tcW w:type="dxa" w:w="1200"/>
+            <w:shd w:fill="ffffff" w:val="clear"/>
+            <w:tcMar>
+              <w:top w:type="dxa" w:w="70"/>
+              <w:left w:type="dxa" w:w="110"/>
+              <w:bottom w:type="dxa" w:w="70"/>
+              <w:right w:type="dxa" w:w="110"/>
+            </w:tcMar>
+          </w:tcPr>
+          <w:p>
+            <w:pPr>
+              <w:jc w:val="right"/>
+            </w:pPr>
+            <w:r>
+              <w:rPr>
+                <w:rFonts w:ascii="Calibri" w:cs="Calibri" w:eastAsia="Calibri" w:hAnsi="Calibri"/>
+                <w:b w:val="false"/>
+                <w:bCs w:val="false"/>
+                <w:color w:val="1a1a2e"/>
+                <w:sz w:val="19"/>
+                <w:szCs w:val="19"/>
+              </w:rPr>
+              <w:t xml:space="preserve">~104%</w:t>
+            </w:r>
+          </w:p>
+        </w:tc>
+        <w:tc>
+          <w:tcPr>
+            <w:tcW w:type="dxa" w:w="3100"/>
+            <w:shd w:fill="ffffff" w:val="clear"/>
+            <w:tcMar>
+              <w:top w:type="dxa" w:w="70"/>
+              <w:left w:type="dxa" w:w="110"/>
+              <w:bottom w:type="dxa" w:w="70"/>
+              <w:right w:type="dxa" w:w="110"/>
+            </w:tcMar>
+          </w:tcPr>
+          <w:p>
+            <w:pPr>
+              <w:jc w:val="right"/>
+            </w:pPr>
+            <w:r>
+              <w:rPr>
+                <w:rFonts w:ascii="Calibri" w:cs="Calibri" w:eastAsia="Calibri" w:hAnsi="Calibri"/>
+                <w:b w:val="false"/>
+                <w:bCs w:val="false"/>
+                <w:color w:val="1a1a2e"/>
+                <w:sz w:val="19"/>
+                <w:szCs w:val="19"/>
+              </w:rPr>
+              <w:t xml:space="preserve">sanction register must actually build</w:t>
+            </w:r>
+          </w:p>
+        </w:tc>
+      </w:tr>
+    </w:tbl>
+    <w:p>
+      <w:pPr>
+        <w:spacing w:after="120" w:before="0"/>
+      </w:pPr>
+      <w:r>
+        <w:rPr>
+          <w:rFonts w:ascii="Calibri" w:cs="Calibri" w:eastAsia="Calibri" w:hAnsi="Calibri"/>
+          <w:color w:val="1a1a2e"/>
+          <w:sz w:val="21"/>
+          <w:szCs w:val="21"/>
+        </w:rPr>
+        <w:t xml:space="preserve"/>
+      </w:r>
+    </w:p>
+    <w:p>
+      <w:pPr>
+        <w:spacing w:after="160" w:before="0"/>
+      </w:pPr>
+      <w:r>
+        <w:rPr>
+          <w:rFonts w:ascii="Calibri" w:cs="Calibri" w:eastAsia="Calibri" w:hAnsi="Calibri"/>
+          <w:color w:val="1a1a2e"/>
+          <w:sz w:val="21"/>
+          <w:szCs w:val="21"/>
+        </w:rPr>
+        <w:t xml:space="preserve">Two subsidiary findings. First, the cooperative-sugar-mill 'wave' is a working-capital rescue, not a capacity wave: of the ₹10,005 crore the NCDC disbursed to 56 cooperative sugar mills, 96.5% (₹9,657 crore) went to working capital, ₹97 crore to cogeneration, and only ₹251 crore to ethanol plants — which at the DFPD scheme's average intensity (₹96.8 crore of loan per 113-KLPD project) buys roughly 293 KLPD ≈ 9.7 crore litres a year, 0.5% of installed capacity. India's 229 functional cooperative mills (~30% of sugar output) remain marginal to an ethanol build-out that is in fact a private, grain-based wave (Uttar Pradesh alone added ~50 crore litres of capacity in 2025). Second, the Food Corporation of India rice leg is small and politically fragile: ~211 crore litres effective (at a 65% lifting assumption against the 7.2-million-tonne allocation), about 3.9 blending points, and it carries the July-2023 precedent when rice-to-ethanol was suspended outright — so the E27/E30 increment leans on open-market maize, which is also the dearest procurement slab (₹71.86/L). Feedstock, not distillation steel, is the binding constraint.</w:t>
+      </w:r>
+    </w:p>
+    <w:p>
+      <w:pPr>
+        <w:spacing w:after="160" w:before="0"/>
+      </w:pPr>
+      <w:r>
+        <w:rPr>
+          <w:rFonts w:ascii="Calibri" w:cs="Calibri" w:eastAsia="Calibri" w:hAnsi="Calibri"/>
+          <w:i/>
+          <w:iCs/>
+          <w:color w:val="5a5a6e"/>
+          <w:sz w:val="18"/>
+          <w:szCs w:val="18"/>
+        </w:rPr>
+        <w:t xml:space="preserve">Assumptions and caveats: capacity figures are nameplate, not effective (maintenance, feedstock switching and working-capital stress reduce them); the 65% FCI lifting rate is a lever (FY26 all-channel offtake experience, band 55–75%); non-fuel demand is held flat at the CareEdge midpoint (325 cr L); the FY30-31 row uses this repo's petrol-demand forecast base case (5.0% CAGR, moderating on electric-vehicle penetration); and CareEdge's infrastructure caveat transfers intact — a single-grade retail network of ~1.03 lakh outlets, ~77.8 crore litres of storage and ~300 blending depots suits one national blend stepped E20→E27, but not a multi-grade E85/flex-fuel world.</w:t>
+      </w:r>
+    </w:p>
+    <w:p>
+      <w:pPr>
+        <w:pStyle w:val="Heading1"/>
+        <w:spacing w:after="160" w:before="320"/>
+      </w:pPr>
+      <w:r>
+        <w:rPr>
+          <w:rFonts w:ascii="Calibri" w:cs="Calibri" w:eastAsia="Calibri" w:hAnsi="Calibri"/>
+          <w:b/>
+          <w:bCs/>
+          <w:color w:val="0f4c81"/>
+          <w:sz w:val="28"/>
+          <w:szCs w:val="28"/>
+        </w:rPr>
+        <w:t xml:space="preserve">9. The RON95 octane dividend: the credit the consumer never sees</w:t>
+      </w:r>
+    </w:p>
+    <w:p>
+      <w:pPr>
+        <w:spacing w:after="160" w:before="0"/>
+      </w:pPr>
+      <w:r>
+        <w:rPr>
+          <w:rFonts w:ascii="Calibri" w:cs="Calibri" w:eastAsia="Calibri" w:hAnsi="Calibri"/>
+          <w:color w:val="1a1a2e"/>
+          <w:sz w:val="21"/>
+          <w:szCs w:val="21"/>
+        </w:rPr>
+        <w:t xml:space="preserve">RON — the Research Octane Number — measures a fuel's resistance to knock (uncontrolled combustion), which is what limits an engine's compression ratio and therefore its thermal efficiency. Indian regular petrol is specified at RON 91 (Bureau of Indian Standards IS 2796); premium grades (XP95, Speed 95) at RON 95 sell for roughly ₹8–10/L more. Ethanol is a poor energy carrier but an excellent octane carrier: its blending RON is ~112 (neat RON ~108; the blending value is higher because ethanol's effect in a mixture is super-linear). Every blend step therefore delivers an octane credit alongside its energy debit — and where that credit lands is a policy choice.</w:t>
+      </w:r>
+    </w:p>
+    <w:p>
+      <w:pPr>
+        <w:spacing w:after="160" w:before="0"/>
+      </w:pPr>
+      <w:r>
+        <w:rPr>
+          <w:rFonts w:ascii="Calibri" w:cs="Calibri" w:eastAsia="Calibri" w:hAnsi="Calibri"/>
+          <w:color w:val="1a1a2e"/>
+          <w:sz w:val="21"/>
+          <w:szCs w:val="21"/>
+        </w:rPr>
+        <w:t xml:space="preserve">Methodology. We evaluate the two limiting routes with a linear blending model: route (a), today's practice, holds the finished pump fuel at RON 91 and solves for the blendstock-for-oxygenate-blending (BOB — the petrol base the refinery actually makes) the refiner needs; route (b) holds the BOB at RON 91 and computes the pump RON the blend delivers. The octane credit is priced two ways: at the retail premium-grade spread (~₹2.25 per RON point, an upper bound reflecting willingness to pay) and, as the caveat notes, at refining cost (₹0.3–0.8/L per 4–5 points, the resource-cost lower bound).</w:t>
+      </w:r>
+    </w:p>
+    <w:tbl>
+      <w:tblPr>
+        <w:tblW w:type="dxa" w:w="9800"/>
+        <w:tblBorders>
+          <w:top w:val="single" w:color="c8d2dc" w:sz="2"/>
+          <w:left w:val="single" w:color="c8d2dc" w:sz="2"/>
+          <w:bottom w:val="single" w:color="c8d2dc" w:sz="2"/>
+          <w:right w:val="single" w:color="c8d2dc" w:sz="2"/>
+          <w:insideH w:val="single" w:color="c8d2dc" w:sz="2"/>
+          <w:insideV w:val="single" w:color="c8d2dc" w:sz="2"/>
+        </w:tblBorders>
+      </w:tblPr>
+      <w:tblGrid>
+        <w:gridCol w:w="1200"/>
+        <w:gridCol w:w="3200"/>
+        <w:gridCol w:w="2700"/>
+        <w:gridCol w:w="2700"/>
+      </w:tblGrid>
+      <w:tr>
+        <w:trPr>
+          <w:tblHeader/>
+        </w:trPr>
+        <w:tc>
+          <w:tcPr>
+            <w:tcW w:type="dxa" w:w="1200"/>
+            <w:shd w:fill="0f4c81" w:val="clear"/>
+            <w:tcMar>
+              <w:top w:type="dxa" w:w="70"/>
+              <w:left w:type="dxa" w:w="110"/>
+              <w:bottom w:type="dxa" w:w="70"/>
+              <w:right w:type="dxa" w:w="110"/>
+            </w:tcMar>
+          </w:tcPr>
+          <w:p>
+            <w:pPr>
+              <w:jc w:val="left"/>
+            </w:pPr>
+            <w:r>
+              <w:rPr>
+                <w:rFonts w:ascii="Calibri" w:cs="Calibri" w:eastAsia="Calibri" w:hAnsi="Calibri"/>
+                <w:b/>
+                <w:bCs/>
+                <w:color w:val="ffffff"/>
+                <w:sz w:val="19"/>
+                <w:szCs w:val="19"/>
+              </w:rPr>
+              <w:t xml:space="preserve">Blend</w:t>
+            </w:r>
+          </w:p>
+        </w:tc>
+        <w:tc>
+          <w:tcPr>
+            <w:tcW w:type="dxa" w:w="3200"/>
+            <w:shd w:fill="0f4c81" w:val="clear"/>
+            <w:tcMar>
+              <w:top w:type="dxa" w:w="70"/>
+              <w:left w:type="dxa" w:w="110"/>
+              <w:bottom w:type="dxa" w:w="70"/>
+              <w:right w:type="dxa" w:w="110"/>
+            </w:tcMar>
+          </w:tcPr>
+          <w:p>
+            <w:pPr>
+              <w:jc w:val="right"/>
+            </w:pPr>
+            <w:r>
+              <w:rPr>
+                <w:rFonts w:ascii="Calibri" w:cs="Calibri" w:eastAsia="Calibri" w:hAnsi="Calibri"/>
+                <w:b/>
+                <w:bCs/>
+                <w:color w:val="ffffff"/>
+                <w:sz w:val="19"/>
+                <w:szCs w:val="19"/>
+              </w:rPr>
+              <w:t xml:space="preserve">(a) BOB needed if pump stays RON 91</w:t>
+            </w:r>
+          </w:p>
+        </w:tc>
+        <w:tc>
+          <w:tcPr>
+            <w:tcW w:type="dxa" w:w="2700"/>
+            <w:shd w:fill="0f4c81" w:val="clear"/>
+            <w:tcMar>
+              <w:top w:type="dxa" w:w="70"/>
+              <w:left w:type="dxa" w:w="110"/>
+              <w:bottom w:type="dxa" w:w="70"/>
+              <w:right w:type="dxa" w:w="110"/>
+            </w:tcMar>
+          </w:tcPr>
+          <w:p>
+            <w:pPr>
+              <w:jc w:val="right"/>
+            </w:pPr>
+            <w:r>
+              <w:rPr>
+                <w:rFonts w:ascii="Calibri" w:cs="Calibri" w:eastAsia="Calibri" w:hAnsi="Calibri"/>
+                <w:b/>
+                <w:bCs/>
+                <w:color w:val="ffffff"/>
+                <w:sz w:val="19"/>
+                <w:szCs w:val="19"/>
+              </w:rPr>
+              <w:t xml:space="preserve">(b) Pump RON if BOB stays 91</w:t>
+            </w:r>
+          </w:p>
+        </w:tc>
+        <w:tc>
+          <w:tcPr>
+            <w:tcW w:type="dxa" w:w="2700"/>
+            <w:shd w:fill="0f4c81" w:val="clear"/>
+            <w:tcMar>
+              <w:top w:type="dxa" w:w="70"/>
+              <w:left w:type="dxa" w:w="110"/>
+              <w:bottom w:type="dxa" w:w="70"/>
+              <w:right w:type="dxa" w:w="110"/>
+            </w:tcMar>
+          </w:tcPr>
+          <w:p>
+            <w:pPr>
+              <w:jc w:val="right"/>
+            </w:pPr>
+            <w:r>
+              <w:rPr>
+                <w:rFonts w:ascii="Calibri" w:cs="Calibri" w:eastAsia="Calibri" w:hAnsi="Calibri"/>
+                <w:b/>
+                <w:bCs/>
+                <w:color w:val="ffffff"/>
+                <w:sz w:val="19"/>
+                <w:szCs w:val="19"/>
+              </w:rPr>
+              <w:t xml:space="preserve">Octane credit at retail spread (₹/L)</w:t>
+            </w:r>
+          </w:p>
+        </w:tc>
+      </w:tr>
+      <w:tr>
+        <w:tc>
+          <w:tcPr>
+            <w:tcW w:type="dxa" w:w="1200"/>
+            <w:shd w:fill="ffffff" w:val="clear"/>
+            <w:tcMar>
+              <w:top w:type="dxa" w:w="70"/>
+              <w:left w:type="dxa" w:w="110"/>
+              <w:bottom w:type="dxa" w:w="70"/>
+              <w:right w:type="dxa" w:w="110"/>
+            </w:tcMar>
+          </w:tcPr>
+          <w:p>
+            <w:pPr>
+              <w:jc w:val="left"/>
+            </w:pPr>
+            <w:r>
+              <w:rPr>
+                <w:rFonts w:ascii="Calibri" w:cs="Calibri" w:eastAsia="Calibri" w:hAnsi="Calibri"/>
+                <w:b w:val="false"/>
+                <w:bCs w:val="false"/>
+                <w:color w:val="1a1a2e"/>
+                <w:sz w:val="19"/>
+                <w:szCs w:val="19"/>
+              </w:rPr>
+              <w:t xml:space="preserve">E10</w:t>
+            </w:r>
+          </w:p>
+        </w:tc>
+        <w:tc>
+          <w:tcPr>
+            <w:tcW w:type="dxa" w:w="3200"/>
+            <w:shd w:fill="ffffff" w:val="clear"/>
+            <w:tcMar>
+              <w:top w:type="dxa" w:w="70"/>
+              <w:left w:type="dxa" w:w="110"/>
+              <w:bottom w:type="dxa" w:w="70"/>
+              <w:right w:type="dxa" w:w="110"/>
+            </w:tcMar>
+          </w:tcPr>
+          <w:p>
+            <w:pPr>
+              <w:jc w:val="right"/>
+            </w:pPr>
+            <w:r>
+              <w:rPr>
+                <w:rFonts w:ascii="Calibri" w:cs="Calibri" w:eastAsia="Calibri" w:hAnsi="Calibri"/>
+                <w:b w:val="false"/>
+                <w:bCs w:val="false"/>
+                <w:color w:val="1a1a2e"/>
+                <w:sz w:val="19"/>
+                <w:szCs w:val="19"/>
+              </w:rPr>
+              <w:t xml:space="preserve">88.7</w:t>
+            </w:r>
+          </w:p>
+        </w:tc>
+        <w:tc>
+          <w:tcPr>
+            <w:tcW w:type="dxa" w:w="2700"/>
+            <w:shd w:fill="ffffff" w:val="clear"/>
+            <w:tcMar>
+              <w:top w:type="dxa" w:w="70"/>
+              <w:left w:type="dxa" w:w="110"/>
+              <w:bottom w:type="dxa" w:w="70"/>
+              <w:right w:type="dxa" w:w="110"/>
+            </w:tcMar>
+          </w:tcPr>
+          <w:p>
+            <w:pPr>
+              <w:jc w:val="right"/>
+            </w:pPr>
+            <w:r>
+              <w:rPr>
+                <w:rFonts w:ascii="Calibri" w:cs="Calibri" w:eastAsia="Calibri" w:hAnsi="Calibri"/>
+                <w:b w:val="false"/>
+                <w:bCs w:val="false"/>
+                <w:color w:val="1a1a2e"/>
+                <w:sz w:val="19"/>
+                <w:szCs w:val="19"/>
+              </w:rPr>
+              <w:t xml:space="preserve">93.1</w:t>
+            </w:r>
+          </w:p>
+        </w:tc>
+        <w:tc>
+          <w:tcPr>
+            <w:tcW w:type="dxa" w:w="2700"/>
+            <w:shd w:fill="ffffff" w:val="clear"/>
+            <w:tcMar>
+              <w:top w:type="dxa" w:w="70"/>
+              <w:left w:type="dxa" w:w="110"/>
+              <w:bottom w:type="dxa" w:w="70"/>
+              <w:right w:type="dxa" w:w="110"/>
+            </w:tcMar>
+          </w:tcPr>
+          <w:p>
+            <w:pPr>
+              <w:jc w:val="right"/>
+            </w:pPr>
+            <w:r>
+              <w:rPr>
+                <w:rFonts w:ascii="Calibri" w:cs="Calibri" w:eastAsia="Calibri" w:hAnsi="Calibri"/>
+                <w:b w:val="false"/>
+                <w:bCs w:val="false"/>
+                <w:color w:val="1a1a2e"/>
+                <w:sz w:val="19"/>
+                <w:szCs w:val="19"/>
+              </w:rPr>
+              <w:t xml:space="preserve">4.7</w:t>
+            </w:r>
+          </w:p>
+        </w:tc>
+      </w:tr>
+      <w:tr>
+        <w:tc>
+          <w:tcPr>
+            <w:tcW w:type="dxa" w:w="1200"/>
+            <w:shd w:fill="eef3f8" w:val="clear"/>
+            <w:tcMar>
+              <w:top w:type="dxa" w:w="70"/>
+              <w:left w:type="dxa" w:w="110"/>
+              <w:bottom w:type="dxa" w:w="70"/>
+              <w:right w:type="dxa" w:w="110"/>
+            </w:tcMar>
+          </w:tcPr>
+          <w:p>
+            <w:pPr>
+              <w:jc w:val="left"/>
+            </w:pPr>
+            <w:r>
+              <w:rPr>
+                <w:rFonts w:ascii="Calibri" w:cs="Calibri" w:eastAsia="Calibri" w:hAnsi="Calibri"/>
+                <w:b w:val="false"/>
+                <w:bCs w:val="false"/>
+                <w:color w:val="1a1a2e"/>
+                <w:sz w:val="19"/>
+                <w:szCs w:val="19"/>
+              </w:rPr>
+              <w:t xml:space="preserve">E20</w:t>
+            </w:r>
+          </w:p>
+        </w:tc>
+        <w:tc>
+          <w:tcPr>
+            <w:tcW w:type="dxa" w:w="3200"/>
+            <w:shd w:fill="eef3f8" w:val="clear"/>
+            <w:tcMar>
+              <w:top w:type="dxa" w:w="70"/>
+              <w:left w:type="dxa" w:w="110"/>
+              <w:bottom w:type="dxa" w:w="70"/>
+              <w:right w:type="dxa" w:w="110"/>
+            </w:tcMar>
+          </w:tcPr>
+          <w:p>
+            <w:pPr>
+              <w:jc w:val="right"/>
+            </w:pPr>
+            <w:r>
+              <w:rPr>
+                <w:rFonts w:ascii="Calibri" w:cs="Calibri" w:eastAsia="Calibri" w:hAnsi="Calibri"/>
+                <w:b w:val="false"/>
+                <w:bCs w:val="false"/>
+                <w:color w:val="1a1a2e"/>
+                <w:sz w:val="19"/>
+                <w:szCs w:val="19"/>
+              </w:rPr>
+              <w:t xml:space="preserve">85.7</w:t>
+            </w:r>
+          </w:p>
+        </w:tc>
+        <w:tc>
+          <w:tcPr>
+            <w:tcW w:type="dxa" w:w="2700"/>
+            <w:shd w:fill="eef3f8" w:val="clear"/>
+            <w:tcMar>
+              <w:top w:type="dxa" w:w="70"/>
+              <w:left w:type="dxa" w:w="110"/>
+              <w:bottom w:type="dxa" w:w="70"/>
+              <w:right w:type="dxa" w:w="110"/>
+            </w:tcMar>
+          </w:tcPr>
+          <w:p>
+            <w:pPr>
+              <w:jc w:val="right"/>
+            </w:pPr>
+            <w:r>
+              <w:rPr>
+                <w:rFonts w:ascii="Calibri" w:cs="Calibri" w:eastAsia="Calibri" w:hAnsi="Calibri"/>
+                <w:b w:val="false"/>
+                <w:bCs w:val="false"/>
+                <w:color w:val="1a1a2e"/>
+                <w:sz w:val="19"/>
+                <w:szCs w:val="19"/>
+              </w:rPr>
+              <w:t xml:space="preserve">95.2</w:t>
+            </w:r>
+          </w:p>
+        </w:tc>
+        <w:tc>
+          <w:tcPr>
+            <w:tcW w:type="dxa" w:w="2700"/>
+            <w:shd w:fill="eef3f8" w:val="clear"/>
+            <w:tcMar>
+              <w:top w:type="dxa" w:w="70"/>
+              <w:left w:type="dxa" w:w="110"/>
+              <w:bottom w:type="dxa" w:w="70"/>
+              <w:right w:type="dxa" w:w="110"/>
+            </w:tcMar>
+          </w:tcPr>
+          <w:p>
+            <w:pPr>
+              <w:jc w:val="right"/>
+            </w:pPr>
+            <w:r>
+              <w:rPr>
+                <w:rFonts w:ascii="Calibri" w:cs="Calibri" w:eastAsia="Calibri" w:hAnsi="Calibri"/>
+                <w:b w:val="false"/>
+                <w:bCs w:val="false"/>
+                <w:color w:val="1a1a2e"/>
+                <w:sz w:val="19"/>
+                <w:szCs w:val="19"/>
+              </w:rPr>
+              <w:t xml:space="preserve">9.5</w:t>
+            </w:r>
+          </w:p>
+        </w:tc>
+      </w:tr>
+      <w:tr>
+        <w:tc>
+          <w:tcPr>
+            <w:tcW w:type="dxa" w:w="1200"/>
+            <w:shd w:fill="ffffff" w:val="clear"/>
+            <w:tcMar>
+              <w:top w:type="dxa" w:w="70"/>
+              <w:left w:type="dxa" w:w="110"/>
+              <w:bottom w:type="dxa" w:w="70"/>
+              <w:right w:type="dxa" w:w="110"/>
+            </w:tcMar>
+          </w:tcPr>
+          <w:p>
+            <w:pPr>
+              <w:jc w:val="left"/>
+            </w:pPr>
+            <w:r>
+              <w:rPr>
+                <w:rFonts w:ascii="Calibri" w:cs="Calibri" w:eastAsia="Calibri" w:hAnsi="Calibri"/>
+                <w:b w:val="false"/>
+                <w:bCs w:val="false"/>
+                <w:color w:val="1a1a2e"/>
+                <w:sz w:val="19"/>
+                <w:szCs w:val="19"/>
+              </w:rPr>
+              <w:t xml:space="preserve">E25</w:t>
+            </w:r>
+          </w:p>
+        </w:tc>
+        <w:tc>
+          <w:tcPr>
+            <w:tcW w:type="dxa" w:w="3200"/>
+            <w:shd w:fill="ffffff" w:val="clear"/>
+            <w:tcMar>
+              <w:top w:type="dxa" w:w="70"/>
+              <w:left w:type="dxa" w:w="110"/>
+              <w:bottom w:type="dxa" w:w="70"/>
+              <w:right w:type="dxa" w:w="110"/>
+            </w:tcMar>
+          </w:tcPr>
+          <w:p>
+            <w:pPr>
+              <w:jc w:val="right"/>
+            </w:pPr>
+            <w:r>
+              <w:rPr>
+                <w:rFonts w:ascii="Calibri" w:cs="Calibri" w:eastAsia="Calibri" w:hAnsi="Calibri"/>
+                <w:b w:val="false"/>
+                <w:bCs w:val="false"/>
+                <w:color w:val="1a1a2e"/>
+                <w:sz w:val="19"/>
+                <w:szCs w:val="19"/>
+              </w:rPr>
+              <w:t xml:space="preserve">84.0</w:t>
+            </w:r>
+          </w:p>
+        </w:tc>
+        <w:tc>
+          <w:tcPr>
+            <w:tcW w:type="dxa" w:w="2700"/>
+            <w:shd w:fill="ffffff" w:val="clear"/>
+            <w:tcMar>
+              <w:top w:type="dxa" w:w="70"/>
+              <w:left w:type="dxa" w:w="110"/>
+              <w:bottom w:type="dxa" w:w="70"/>
+              <w:right w:type="dxa" w:w="110"/>
+            </w:tcMar>
+          </w:tcPr>
+          <w:p>
+            <w:pPr>
+              <w:jc w:val="right"/>
+            </w:pPr>
+            <w:r>
+              <w:rPr>
+                <w:rFonts w:ascii="Calibri" w:cs="Calibri" w:eastAsia="Calibri" w:hAnsi="Calibri"/>
+                <w:b w:val="false"/>
+                <w:bCs w:val="false"/>
+                <w:color w:val="1a1a2e"/>
+                <w:sz w:val="19"/>
+                <w:szCs w:val="19"/>
+              </w:rPr>
+              <w:t xml:space="preserve">96.2</w:t>
+            </w:r>
+          </w:p>
+        </w:tc>
+        <w:tc>
+          <w:tcPr>
+            <w:tcW w:type="dxa" w:w="2700"/>
+            <w:shd w:fill="ffffff" w:val="clear"/>
+            <w:tcMar>
+              <w:top w:type="dxa" w:w="70"/>
+              <w:left w:type="dxa" w:w="110"/>
+              <w:bottom w:type="dxa" w:w="70"/>
+              <w:right w:type="dxa" w:w="110"/>
+            </w:tcMar>
+          </w:tcPr>
+          <w:p>
+            <w:pPr>
+              <w:jc w:val="right"/>
+            </w:pPr>
+            <w:r>
+              <w:rPr>
+                <w:rFonts w:ascii="Calibri" w:cs="Calibri" w:eastAsia="Calibri" w:hAnsi="Calibri"/>
+                <w:b w:val="false"/>
+                <w:bCs w:val="false"/>
+                <w:color w:val="1a1a2e"/>
+                <w:sz w:val="19"/>
+                <w:szCs w:val="19"/>
+              </w:rPr>
+              <w:t xml:space="preserve">11.8</w:t>
+            </w:r>
+          </w:p>
+        </w:tc>
+      </w:tr>
+      <w:tr>
+        <w:tc>
+          <w:tcPr>
+            <w:tcW w:type="dxa" w:w="1200"/>
+            <w:shd w:fill="eef3f8" w:val="clear"/>
+            <w:tcMar>
+              <w:top w:type="dxa" w:w="70"/>
+              <w:left w:type="dxa" w:w="110"/>
+              <w:bottom w:type="dxa" w:w="70"/>
+              <w:right w:type="dxa" w:w="110"/>
+            </w:tcMar>
+          </w:tcPr>
+          <w:p>
+            <w:pPr>
+              <w:jc w:val="left"/>
+            </w:pPr>
+            <w:r>
+              <w:rPr>
+                <w:rFonts w:ascii="Calibri" w:cs="Calibri" w:eastAsia="Calibri" w:hAnsi="Calibri"/>
+                <w:b w:val="false"/>
+                <w:bCs w:val="false"/>
+                <w:color w:val="1a1a2e"/>
+                <w:sz w:val="19"/>
+                <w:szCs w:val="19"/>
+              </w:rPr>
+              <w:t xml:space="preserve">E27</w:t>
+            </w:r>
+          </w:p>
+        </w:tc>
+        <w:tc>
+          <w:tcPr>
+            <w:tcW w:type="dxa" w:w="3200"/>
+            <w:shd w:fill="eef3f8" w:val="clear"/>
+            <w:tcMar>
+              <w:top w:type="dxa" w:w="70"/>
+              <w:left w:type="dxa" w:w="110"/>
+              <w:bottom w:type="dxa" w:w="70"/>
+              <w:right w:type="dxa" w:w="110"/>
+            </w:tcMar>
+          </w:tcPr>
+          <w:p>
+            <w:pPr>
+              <w:jc w:val="right"/>
+            </w:pPr>
+            <w:r>
+              <w:rPr>
+                <w:rFonts w:ascii="Calibri" w:cs="Calibri" w:eastAsia="Calibri" w:hAnsi="Calibri"/>
+                <w:b w:val="false"/>
+                <w:bCs w:val="false"/>
+                <w:color w:val="1a1a2e"/>
+                <w:sz w:val="19"/>
+                <w:szCs w:val="19"/>
+              </w:rPr>
+              <w:t xml:space="preserve">83.2</w:t>
+            </w:r>
+          </w:p>
+        </w:tc>
+        <w:tc>
+          <w:tcPr>
+            <w:tcW w:type="dxa" w:w="2700"/>
+            <w:shd w:fill="eef3f8" w:val="clear"/>
+            <w:tcMar>
+              <w:top w:type="dxa" w:w="70"/>
+              <w:left w:type="dxa" w:w="110"/>
+              <w:bottom w:type="dxa" w:w="70"/>
+              <w:right w:type="dxa" w:w="110"/>
+            </w:tcMar>
+          </w:tcPr>
+          <w:p>
+            <w:pPr>
+              <w:jc w:val="right"/>
+            </w:pPr>
+            <w:r>
+              <w:rPr>
+                <w:rFonts w:ascii="Calibri" w:cs="Calibri" w:eastAsia="Calibri" w:hAnsi="Calibri"/>
+                <w:b w:val="false"/>
+                <w:bCs w:val="false"/>
+                <w:color w:val="1a1a2e"/>
+                <w:sz w:val="19"/>
+                <w:szCs w:val="19"/>
+              </w:rPr>
+              <w:t xml:space="preserve">96.7</w:t>
+            </w:r>
+          </w:p>
+        </w:tc>
+        <w:tc>
+          <w:tcPr>
+            <w:tcW w:type="dxa" w:w="2700"/>
+            <w:shd w:fill="eef3f8" w:val="clear"/>
+            <w:tcMar>
+              <w:top w:type="dxa" w:w="70"/>
+              <w:left w:type="dxa" w:w="110"/>
+              <w:bottom w:type="dxa" w:w="70"/>
+              <w:right w:type="dxa" w:w="110"/>
+            </w:tcMar>
+          </w:tcPr>
+          <w:p>
+            <w:pPr>
+              <w:jc w:val="right"/>
+            </w:pPr>
+            <w:r>
+              <w:rPr>
+                <w:rFonts w:ascii="Calibri" w:cs="Calibri" w:eastAsia="Calibri" w:hAnsi="Calibri"/>
+                <w:b w:val="false"/>
+                <w:bCs w:val="false"/>
+                <w:color w:val="1a1a2e"/>
+                <w:sz w:val="19"/>
+                <w:szCs w:val="19"/>
+              </w:rPr>
+              <w:t xml:space="preserve">12.8</w:t>
+            </w:r>
+          </w:p>
+        </w:tc>
+      </w:tr>
+      <w:tr>
+        <w:tc>
+          <w:tcPr>
+            <w:tcW w:type="dxa" w:w="1200"/>
+            <w:shd w:fill="ffffff" w:val="clear"/>
+            <w:tcMar>
+              <w:top w:type="dxa" w:w="70"/>
+              <w:left w:type="dxa" w:w="110"/>
+              <w:bottom w:type="dxa" w:w="70"/>
+              <w:right w:type="dxa" w:w="110"/>
+            </w:tcMar>
+          </w:tcPr>
+          <w:p>
+            <w:pPr>
+              <w:jc w:val="left"/>
+            </w:pPr>
+            <w:r>
+              <w:rPr>
+                <w:rFonts w:ascii="Calibri" w:cs="Calibri" w:eastAsia="Calibri" w:hAnsi="Calibri"/>
+                <w:b w:val="false"/>
+                <w:bCs w:val="false"/>
+                <w:color w:val="1a1a2e"/>
+                <w:sz w:val="19"/>
+                <w:szCs w:val="19"/>
+              </w:rPr>
+              <w:t xml:space="preserve">E30</w:t>
+            </w:r>
+          </w:p>
+        </w:tc>
+        <w:tc>
+          <w:tcPr>
+            <w:tcW w:type="dxa" w:w="3200"/>
+            <w:shd w:fill="ffffff" w:val="clear"/>
+            <w:tcMar>
+              <w:top w:type="dxa" w:w="70"/>
+              <w:left w:type="dxa" w:w="110"/>
+              <w:bottom w:type="dxa" w:w="70"/>
+              <w:right w:type="dxa" w:w="110"/>
+            </w:tcMar>
+          </w:tcPr>
+          <w:p>
+            <w:pPr>
+              <w:jc w:val="right"/>
+            </w:pPr>
+            <w:r>
+              <w:rPr>
+                <w:rFonts w:ascii="Calibri" w:cs="Calibri" w:eastAsia="Calibri" w:hAnsi="Calibri"/>
+                <w:b w:val="false"/>
+                <w:bCs w:val="false"/>
+                <w:color w:val="1a1a2e"/>
+                <w:sz w:val="19"/>
+                <w:szCs w:val="19"/>
+              </w:rPr>
+              <w:t xml:space="preserve">82.0</w:t>
+            </w:r>
+          </w:p>
+        </w:tc>
+        <w:tc>
+          <w:tcPr>
+            <w:tcW w:type="dxa" w:w="2700"/>
+            <w:shd w:fill="ffffff" w:val="clear"/>
+            <w:tcMar>
+              <w:top w:type="dxa" w:w="70"/>
+              <w:left w:type="dxa" w:w="110"/>
+              <w:bottom w:type="dxa" w:w="70"/>
+              <w:right w:type="dxa" w:w="110"/>
+            </w:tcMar>
+          </w:tcPr>
+          <w:p>
+            <w:pPr>
+              <w:jc w:val="right"/>
+            </w:pPr>
+            <w:r>
+              <w:rPr>
+                <w:rFonts w:ascii="Calibri" w:cs="Calibri" w:eastAsia="Calibri" w:hAnsi="Calibri"/>
+                <w:b w:val="false"/>
+                <w:bCs w:val="false"/>
+                <w:color w:val="1a1a2e"/>
+                <w:sz w:val="19"/>
+                <w:szCs w:val="19"/>
+              </w:rPr>
+              <w:t xml:space="preserve">97.3</w:t>
+            </w:r>
+          </w:p>
+        </w:tc>
+        <w:tc>
+          <w:tcPr>
+            <w:tcW w:type="dxa" w:w="2700"/>
+            <w:shd w:fill="ffffff" w:val="clear"/>
+            <w:tcMar>
+              <w:top w:type="dxa" w:w="70"/>
+              <w:left w:type="dxa" w:w="110"/>
+              <w:bottom w:type="dxa" w:w="70"/>
+              <w:right w:type="dxa" w:w="110"/>
+            </w:tcMar>
+          </w:tcPr>
+          <w:p>
+            <w:pPr>
+              <w:jc w:val="right"/>
+            </w:pPr>
+            <w:r>
+              <w:rPr>
+                <w:rFonts w:ascii="Calibri" w:cs="Calibri" w:eastAsia="Calibri" w:hAnsi="Calibri"/>
+                <w:b w:val="false"/>
+                <w:bCs w:val="false"/>
+                <w:color w:val="1a1a2e"/>
+                <w:sz w:val="19"/>
+                <w:szCs w:val="19"/>
+              </w:rPr>
+              <w:t xml:space="preserve">14.2</w:t>
+            </w:r>
+          </w:p>
+        </w:tc>
+      </w:tr>
+    </w:tbl>
+    <w:p>
+      <w:pPr>
+        <w:spacing w:after="120" w:before="0"/>
+      </w:pPr>
+      <w:r>
+        <w:rPr>
+          <w:rFonts w:ascii="Calibri" w:cs="Calibri" w:eastAsia="Calibri" w:hAnsi="Calibri"/>
+          <w:color w:val="1a1a2e"/>
+          <w:sz w:val="21"/>
+          <w:szCs w:val="21"/>
+        </w:rPr>
+        <w:t xml:space="preserve"/>
+      </w:r>
+    </w:p>
+    <w:p>
+      <w:pPr>
+        <w:spacing w:after="160" w:before="0"/>
+      </w:pPr>
+      <w:r>
+        <w:rPr>
+          <w:rFonts w:ascii="Calibri" w:cs="Calibri" w:eastAsia="Calibri" w:hAnsi="Calibri"/>
+          <w:color w:val="1a1a2e"/>
+          <w:sz w:val="21"/>
+          <w:szCs w:val="21"/>
+        </w:rPr>
+        <w:t xml:space="preserve">Route (a) — today — means that at E20 the refinery only has to make ~85.7-RON blendstock, five points below the old specification: lower reforming severity, more cheap naphtha in the pool, a saving retained upstream on top of the tax headroom of Section 6. Route (b) is the opportunity: the identical E20 on an unchanged 91-RON base is a RON-95 fuel — premium-grade octane, nationally, at zero incremental refining cost, and the blend walk carries it to RON 97.3 at E30.</w:t>
+      </w:r>
+    </w:p>
+    <w:p>
+      <w:pPr>
+        <w:spacing w:after="160" w:before="0"/>
+      </w:pPr>
+      <w:r>
+        <w:rPr>
+          <w:rFonts w:ascii="Calibri" w:cs="Calibri" w:eastAsia="Calibri" w:hAnsi="Calibri"/>
+          <w:color w:val="1a1a2e"/>
+          <w:sz w:val="21"/>
+          <w:szCs w:val="21"/>
+        </w:rPr>
+        <w:t xml:space="preserve">Why this matters for mileage: a RON95-labelled E20 lets manufacturers raise compression ratios (about 10.5 → 12, feasible within the knock limit at RON 95). At the standard ~1.5% thermal-efficiency gain per compression-ratio point, that is +2.2% efficiency against E20's −4% energy drop — a net penalty of ≈ −1.8% on an engine designed for the fuel. This is Brazil's actual playbook: E27 regular petrol at ~RON 95+, high-compression engines, no headline mileage complaint. It composes cleanly with Section 7: parity pricing compensates the existing fleet immediately, while RON95 labelling plus E20-plus engines make the penalty physically shrink as the fleet turns over (~2.9 crore new registrations a year; the Vahan registry already tracks PETROL(E20) as its own fuel type, 21% of CY2025 registrations).</w:t>
+      </w:r>
+    </w:p>
+    <w:p>
+      <w:pPr>
+        <w:spacing w:after="160" w:before="0"/>
+      </w:pPr>
+      <w:r>
+        <w:rPr>
+          <w:rFonts w:ascii="Calibri" w:cs="Calibri" w:eastAsia="Calibri" w:hAnsi="Calibri"/>
+          <w:i/>
+          <w:iCs/>
+          <w:color w:val="5a5a6e"/>
+          <w:sz w:val="18"/>
+          <w:szCs w:val="18"/>
+        </w:rPr>
+        <w:t xml:space="preserve">Assumptions and caveats: octane blending is non-linear and blendstock-dependent — 112 is a central literature value (range 108–115) and the linear model is an estimate; the retail-spread valuation of the credit is a willingness-to-pay ceiling, not a refining cost; the compression-ratio gain arrives only with new, RON95-calibrated engines, not by relabelling the fuel for the existing parc; and compressed biogas needs no octane accounting at all — methane's octane rating is ~120+, and CNG engines already run compression ratios above 12.</w:t>
+      </w:r>
+    </w:p>
+    <w:p>
+      <w:pPr>
+        <w:pStyle w:val="Heading1"/>
+        <w:spacing w:after="160" w:before="320"/>
+      </w:pPr>
+      <w:r>
+        <w:rPr>
+          <w:rFonts w:ascii="Calibri" w:cs="Calibri" w:eastAsia="Calibri" w:hAnsi="Calibri"/>
+          <w:b/>
+          <w:bCs/>
+          <w:color w:val="0f4c81"/>
+          <w:sz w:val="28"/>
+          <w:szCs w:val="28"/>
+        </w:rPr>
+        <w:t xml:space="preserve">10. Caveats and sources</w:t>
       </w:r>
     </w:p>
     <w:p>
@@ -11029,9 +13710,1070 @@
           <w:sz w:val="21"/>
           <w:szCs w:val="21"/>
         </w:rPr>
-        <w:t xml:space="preserve">Generated by build_energy_doc.js from energy_blend_comparison.py outputs; do not hand-edit. Repository: github.com/herrrickshaw/india-omc-fuel-fleet-model.</w:t>
+        <w:t xml:space="preserve">Supply side: CareEdge Ratings, 'E85 Impact: Ethanol Overcapacity to Persist as Flex-fuel Transition to Remain Gradual', 14 May 2026; DFPD Ethanol Interest Subvention Scheme annexures (via the E20→E30 stakeholder workbook); NCDC/Ministry of Cooperation CSM-scheme disbursements (Rajya Sabha reply); FCI rice allocations from the FCI-warehouse repo (OMSS(D) 2024-25/2025-26 orders); Uttar Pradesh capacity from the PARIVESH environmental-clearance register (digital-twin layer 24d).</w:t>
       </w:r>
     </w:p>
+    <w:p>
+      <w:pPr>
+        <w:pStyle w:val="ListParagraph"/>
+        <w:numPr>
+          <w:ilvl w:val="0"/>
+          <w:numId w:val="2"/>
+        </w:numPr>
+        <w:spacing w:after="100"/>
+      </w:pPr>
+      <w:r>
+        <w:rPr>
+          <w:rFonts w:ascii="Calibri" w:cs="Calibri" w:eastAsia="Calibri" w:hAnsi="Calibri"/>
+          <w:color w:val="1a1a2e"/>
+          <w:sz w:val="21"/>
+          <w:szCs w:val="21"/>
+        </w:rPr>
+        <w:t xml:space="preserve">RON side: BIS IS 2796 fuel specification; ethanol blending-RON literature (108–115, central 112); retail XP95/Speed-95 price spreads; compression-ratio/efficiency literature (~1.5% per CR point).</w:t>
+      </w:r>
+    </w:p>
+    <w:p>
+      <w:pPr>
+        <w:pStyle w:val="ListParagraph"/>
+        <w:numPr>
+          <w:ilvl w:val="0"/>
+          <w:numId w:val="2"/>
+        </w:numPr>
+        <w:spacing w:after="100"/>
+      </w:pPr>
+      <w:r>
+        <w:rPr>
+          <w:rFonts w:ascii="Calibri" w:cs="Calibri" w:eastAsia="Calibri" w:hAnsi="Calibri"/>
+          <w:color w:val="1a1a2e"/>
+          <w:sz w:val="21"/>
+          <w:szCs w:val="21"/>
+        </w:rPr>
+        <w:t xml:space="preserve">Generated by build_energy_doc.js from energy_blend_comparison.py / price_parity_scenarios.py / cbg_satat_economics.py / ethanol_supply_match.py / ron_octane_analysis.py outputs; do not hand-edit. Repository: github.com/herrrickshaw/india-omc-fuel-fleet-model.</w:t>
+      </w:r>
+    </w:p>
+    <w:p>
+      <w:pPr>
+        <w:pStyle w:val="Heading2"/>
+        <w:spacing w:after="120" w:before="240"/>
+      </w:pPr>
+      <w:r>
+        <w:rPr>
+          <w:rFonts w:ascii="Calibri" w:cs="Calibri" w:eastAsia="Calibri" w:hAnsi="Calibri"/>
+          <w:b/>
+          <w:bCs/>
+          <w:color w:val="1a1a2e"/>
+          <w:sz w:val="24"/>
+          <w:szCs w:val="24"/>
+        </w:rPr>
+        <w:t xml:space="preserve">Glossary of abbreviations</w:t>
+      </w:r>
+    </w:p>
+    <w:tbl>
+      <w:tblPr>
+        <w:tblW w:type="dxa" w:w="9800"/>
+        <w:tblBorders>
+          <w:top w:val="single" w:color="c8d2dc" w:sz="2"/>
+          <w:left w:val="single" w:color="c8d2dc" w:sz="2"/>
+          <w:bottom w:val="single" w:color="c8d2dc" w:sz="2"/>
+          <w:right w:val="single" w:color="c8d2dc" w:sz="2"/>
+          <w:insideH w:val="single" w:color="c8d2dc" w:sz="2"/>
+          <w:insideV w:val="single" w:color="c8d2dc" w:sz="2"/>
+        </w:tblBorders>
+      </w:tblPr>
+      <w:tblGrid>
+        <w:gridCol w:w="2300"/>
+        <w:gridCol w:w="7500"/>
+      </w:tblGrid>
+      <w:tr>
+        <w:trPr>
+          <w:tblHeader/>
+        </w:trPr>
+        <w:tc>
+          <w:tcPr>
+            <w:tcW w:type="dxa" w:w="2300"/>
+            <w:shd w:fill="0f4c81" w:val="clear"/>
+            <w:tcMar>
+              <w:top w:type="dxa" w:w="70"/>
+              <w:left w:type="dxa" w:w="110"/>
+              <w:bottom w:type="dxa" w:w="70"/>
+              <w:right w:type="dxa" w:w="110"/>
+            </w:tcMar>
+          </w:tcPr>
+          <w:p>
+            <w:pPr>
+              <w:jc w:val="left"/>
+            </w:pPr>
+            <w:r>
+              <w:rPr>
+                <w:rFonts w:ascii="Calibri" w:cs="Calibri" w:eastAsia="Calibri" w:hAnsi="Calibri"/>
+                <w:b/>
+                <w:bCs/>
+                <w:color w:val="ffffff"/>
+                <w:sz w:val="19"/>
+                <w:szCs w:val="19"/>
+              </w:rPr>
+              <w:t xml:space="preserve">Abbreviation</w:t>
+            </w:r>
+          </w:p>
+        </w:tc>
+        <w:tc>
+          <w:tcPr>
+            <w:tcW w:type="dxa" w:w="7500"/>
+            <w:shd w:fill="0f4c81" w:val="clear"/>
+            <w:tcMar>
+              <w:top w:type="dxa" w:w="70"/>
+              <w:left w:type="dxa" w:w="110"/>
+              <w:bottom w:type="dxa" w:w="70"/>
+              <w:right w:type="dxa" w:w="110"/>
+            </w:tcMar>
+          </w:tcPr>
+          <w:p>
+            <w:pPr>
+              <w:jc w:val="left"/>
+            </w:pPr>
+            <w:r>
+              <w:rPr>
+                <w:rFonts w:ascii="Calibri" w:cs="Calibri" w:eastAsia="Calibri" w:hAnsi="Calibri"/>
+                <w:b/>
+                <w:bCs/>
+                <w:color w:val="ffffff"/>
+                <w:sz w:val="19"/>
+                <w:szCs w:val="19"/>
+              </w:rPr>
+              <w:t xml:space="preserve">Meaning</w:t>
+            </w:r>
+          </w:p>
+        </w:tc>
+      </w:tr>
+      <w:tr>
+        <w:tc>
+          <w:tcPr>
+            <w:tcW w:type="dxa" w:w="2300"/>
+            <w:shd w:fill="ffffff" w:val="clear"/>
+            <w:tcMar>
+              <w:top w:type="dxa" w:w="70"/>
+              <w:left w:type="dxa" w:w="110"/>
+              <w:bottom w:type="dxa" w:w="70"/>
+              <w:right w:type="dxa" w:w="110"/>
+            </w:tcMar>
+          </w:tcPr>
+          <w:p>
+            <w:pPr>
+              <w:jc w:val="left"/>
+            </w:pPr>
+            <w:r>
+              <w:rPr>
+                <w:rFonts w:ascii="Calibri" w:cs="Calibri" w:eastAsia="Calibri" w:hAnsi="Calibri"/>
+                <w:b w:val="false"/>
+                <w:bCs w:val="false"/>
+                <w:color w:val="1a1a2e"/>
+                <w:sz w:val="19"/>
+                <w:szCs w:val="19"/>
+              </w:rPr>
+              <w:t xml:space="preserve">LHV</w:t>
+            </w:r>
+          </w:p>
+        </w:tc>
+        <w:tc>
+          <w:tcPr>
+            <w:tcW w:type="dxa" w:w="7500"/>
+            <w:shd w:fill="ffffff" w:val="clear"/>
+            <w:tcMar>
+              <w:top w:type="dxa" w:w="70"/>
+              <w:left w:type="dxa" w:w="110"/>
+              <w:bottom w:type="dxa" w:w="70"/>
+              <w:right w:type="dxa" w:w="110"/>
+            </w:tcMar>
+          </w:tcPr>
+          <w:p>
+            <w:pPr>
+              <w:jc w:val="left"/>
+            </w:pPr>
+            <w:r>
+              <w:rPr>
+                <w:rFonts w:ascii="Calibri" w:cs="Calibri" w:eastAsia="Calibri" w:hAnsi="Calibri"/>
+                <w:b w:val="false"/>
+                <w:bCs w:val="false"/>
+                <w:color w:val="1a1a2e"/>
+                <w:sz w:val="19"/>
+                <w:szCs w:val="19"/>
+              </w:rPr>
+              <w:t xml:space="preserve">Lower Heating Value — usable energy content of a fuel, excluding water-vapour condensation heat</w:t>
+            </w:r>
+          </w:p>
+        </w:tc>
+      </w:tr>
+      <w:tr>
+        <w:tc>
+          <w:tcPr>
+            <w:tcW w:type="dxa" w:w="2300"/>
+            <w:shd w:fill="eef3f8" w:val="clear"/>
+            <w:tcMar>
+              <w:top w:type="dxa" w:w="70"/>
+              <w:left w:type="dxa" w:w="110"/>
+              <w:bottom w:type="dxa" w:w="70"/>
+              <w:right w:type="dxa" w:w="110"/>
+            </w:tcMar>
+          </w:tcPr>
+          <w:p>
+            <w:pPr>
+              <w:jc w:val="left"/>
+            </w:pPr>
+            <w:r>
+              <w:rPr>
+                <w:rFonts w:ascii="Calibri" w:cs="Calibri" w:eastAsia="Calibri" w:hAnsi="Calibri"/>
+                <w:b w:val="false"/>
+                <w:bCs w:val="false"/>
+                <w:color w:val="1a1a2e"/>
+                <w:sz w:val="19"/>
+                <w:szCs w:val="19"/>
+              </w:rPr>
+              <w:t xml:space="preserve">RON / BOB</w:t>
+            </w:r>
+          </w:p>
+        </w:tc>
+        <w:tc>
+          <w:tcPr>
+            <w:tcW w:type="dxa" w:w="7500"/>
+            <w:shd w:fill="eef3f8" w:val="clear"/>
+            <w:tcMar>
+              <w:top w:type="dxa" w:w="70"/>
+              <w:left w:type="dxa" w:w="110"/>
+              <w:bottom w:type="dxa" w:w="70"/>
+              <w:right w:type="dxa" w:w="110"/>
+            </w:tcMar>
+          </w:tcPr>
+          <w:p>
+            <w:pPr>
+              <w:jc w:val="left"/>
+            </w:pPr>
+            <w:r>
+              <w:rPr>
+                <w:rFonts w:ascii="Calibri" w:cs="Calibri" w:eastAsia="Calibri" w:hAnsi="Calibri"/>
+                <w:b w:val="false"/>
+                <w:bCs w:val="false"/>
+                <w:color w:val="1a1a2e"/>
+                <w:sz w:val="19"/>
+                <w:szCs w:val="19"/>
+              </w:rPr>
+              <w:t xml:space="preserve">Research Octane Number (knock resistance) / Blendstock for Oxygenate Blending (the petrol base before ethanol is added)</w:t>
+            </w:r>
+          </w:p>
+        </w:tc>
+      </w:tr>
+      <w:tr>
+        <w:tc>
+          <w:tcPr>
+            <w:tcW w:type="dxa" w:w="2300"/>
+            <w:shd w:fill="ffffff" w:val="clear"/>
+            <w:tcMar>
+              <w:top w:type="dxa" w:w="70"/>
+              <w:left w:type="dxa" w:w="110"/>
+              <w:bottom w:type="dxa" w:w="70"/>
+              <w:right w:type="dxa" w:w="110"/>
+            </w:tcMar>
+          </w:tcPr>
+          <w:p>
+            <w:pPr>
+              <w:jc w:val="left"/>
+            </w:pPr>
+            <w:r>
+              <w:rPr>
+                <w:rFonts w:ascii="Calibri" w:cs="Calibri" w:eastAsia="Calibri" w:hAnsi="Calibri"/>
+                <w:b w:val="false"/>
+                <w:bCs w:val="false"/>
+                <w:color w:val="1a1a2e"/>
+                <w:sz w:val="19"/>
+                <w:szCs w:val="19"/>
+              </w:rPr>
+              <w:t xml:space="preserve">E20, E25, E27, E30</w:t>
+            </w:r>
+          </w:p>
+        </w:tc>
+        <w:tc>
+          <w:tcPr>
+            <w:tcW w:type="dxa" w:w="7500"/>
+            <w:shd w:fill="ffffff" w:val="clear"/>
+            <w:tcMar>
+              <w:top w:type="dxa" w:w="70"/>
+              <w:left w:type="dxa" w:w="110"/>
+              <w:bottom w:type="dxa" w:w="70"/>
+              <w:right w:type="dxa" w:w="110"/>
+            </w:tcMar>
+          </w:tcPr>
+          <w:p>
+            <w:pPr>
+              <w:jc w:val="left"/>
+            </w:pPr>
+            <w:r>
+              <w:rPr>
+                <w:rFonts w:ascii="Calibri" w:cs="Calibri" w:eastAsia="Calibri" w:hAnsi="Calibri"/>
+                <w:b w:val="false"/>
+                <w:bCs w:val="false"/>
+                <w:color w:val="1a1a2e"/>
+                <w:sz w:val="19"/>
+                <w:szCs w:val="19"/>
+              </w:rPr>
+              <w:t xml:space="preserve">Petrol blended with 20/25/27/30% ethanol by volume; B7–B20 likewise for biodiesel in diesel</w:t>
+            </w:r>
+          </w:p>
+        </w:tc>
+      </w:tr>
+      <w:tr>
+        <w:tc>
+          <w:tcPr>
+            <w:tcW w:type="dxa" w:w="2300"/>
+            <w:shd w:fill="eef3f8" w:val="clear"/>
+            <w:tcMar>
+              <w:top w:type="dxa" w:w="70"/>
+              <w:left w:type="dxa" w:w="110"/>
+              <w:bottom w:type="dxa" w:w="70"/>
+              <w:right w:type="dxa" w:w="110"/>
+            </w:tcMar>
+          </w:tcPr>
+          <w:p>
+            <w:pPr>
+              <w:jc w:val="left"/>
+            </w:pPr>
+            <w:r>
+              <w:rPr>
+                <w:rFonts w:ascii="Calibri" w:cs="Calibri" w:eastAsia="Calibri" w:hAnsi="Calibri"/>
+                <w:b w:val="false"/>
+                <w:bCs w:val="false"/>
+                <w:color w:val="1a1a2e"/>
+                <w:sz w:val="19"/>
+                <w:szCs w:val="19"/>
+              </w:rPr>
+              <w:t xml:space="preserve">FAME / HVO</w:t>
+            </w:r>
+          </w:p>
+        </w:tc>
+        <w:tc>
+          <w:tcPr>
+            <w:tcW w:type="dxa" w:w="7500"/>
+            <w:shd w:fill="eef3f8" w:val="clear"/>
+            <w:tcMar>
+              <w:top w:type="dxa" w:w="70"/>
+              <w:left w:type="dxa" w:w="110"/>
+              <w:bottom w:type="dxa" w:w="70"/>
+              <w:right w:type="dxa" w:w="110"/>
+            </w:tcMar>
+          </w:tcPr>
+          <w:p>
+            <w:pPr>
+              <w:jc w:val="left"/>
+            </w:pPr>
+            <w:r>
+              <w:rPr>
+                <w:rFonts w:ascii="Calibri" w:cs="Calibri" w:eastAsia="Calibri" w:hAnsi="Calibri"/>
+                <w:b w:val="false"/>
+                <w:bCs w:val="false"/>
+                <w:color w:val="1a1a2e"/>
+                <w:sz w:val="19"/>
+                <w:szCs w:val="19"/>
+              </w:rPr>
+              <w:t xml:space="preserve">Fatty-Acid Methyl Ester (conventional biodiesel) / Hydrotreated Vegetable Oil (drop-in renewable diesel)</w:t>
+            </w:r>
+          </w:p>
+        </w:tc>
+      </w:tr>
+      <w:tr>
+        <w:tc>
+          <w:tcPr>
+            <w:tcW w:type="dxa" w:w="2300"/>
+            <w:shd w:fill="ffffff" w:val="clear"/>
+            <w:tcMar>
+              <w:top w:type="dxa" w:w="70"/>
+              <w:left w:type="dxa" w:w="110"/>
+              <w:bottom w:type="dxa" w:w="70"/>
+              <w:right w:type="dxa" w:w="110"/>
+            </w:tcMar>
+          </w:tcPr>
+          <w:p>
+            <w:pPr>
+              <w:jc w:val="left"/>
+            </w:pPr>
+            <w:r>
+              <w:rPr>
+                <w:rFonts w:ascii="Calibri" w:cs="Calibri" w:eastAsia="Calibri" w:hAnsi="Calibri"/>
+                <w:b w:val="false"/>
+                <w:bCs w:val="false"/>
+                <w:color w:val="1a1a2e"/>
+                <w:sz w:val="19"/>
+                <w:szCs w:val="19"/>
+              </w:rPr>
+              <w:t xml:space="preserve">CNG / CBG / CBO</w:t>
+            </w:r>
+          </w:p>
+        </w:tc>
+        <w:tc>
+          <w:tcPr>
+            <w:tcW w:type="dxa" w:w="7500"/>
+            <w:shd w:fill="ffffff" w:val="clear"/>
+            <w:tcMar>
+              <w:top w:type="dxa" w:w="70"/>
+              <w:left w:type="dxa" w:w="110"/>
+              <w:bottom w:type="dxa" w:w="70"/>
+              <w:right w:type="dxa" w:w="110"/>
+            </w:tcMar>
+          </w:tcPr>
+          <w:p>
+            <w:pPr>
+              <w:jc w:val="left"/>
+            </w:pPr>
+            <w:r>
+              <w:rPr>
+                <w:rFonts w:ascii="Calibri" w:cs="Calibri" w:eastAsia="Calibri" w:hAnsi="Calibri"/>
+                <w:b w:val="false"/>
+                <w:bCs w:val="false"/>
+                <w:color w:val="1a1a2e"/>
+                <w:sz w:val="19"/>
+                <w:szCs w:val="19"/>
+              </w:rPr>
+              <w:t xml:space="preserve">Compressed Natural Gas / Compressed Biogas (purified to IS 16087) / CBG Blending Obligation on city-gas distributors</w:t>
+            </w:r>
+          </w:p>
+        </w:tc>
+      </w:tr>
+      <w:tr>
+        <w:tc>
+          <w:tcPr>
+            <w:tcW w:type="dxa" w:w="2300"/>
+            <w:shd w:fill="eef3f8" w:val="clear"/>
+            <w:tcMar>
+              <w:top w:type="dxa" w:w="70"/>
+              <w:left w:type="dxa" w:w="110"/>
+              <w:bottom w:type="dxa" w:w="70"/>
+              <w:right w:type="dxa" w:w="110"/>
+            </w:tcMar>
+          </w:tcPr>
+          <w:p>
+            <w:pPr>
+              <w:jc w:val="left"/>
+            </w:pPr>
+            <w:r>
+              <w:rPr>
+                <w:rFonts w:ascii="Calibri" w:cs="Calibri" w:eastAsia="Calibri" w:hAnsi="Calibri"/>
+                <w:b w:val="false"/>
+                <w:bCs w:val="false"/>
+                <w:color w:val="1a1a2e"/>
+                <w:sz w:val="19"/>
+                <w:szCs w:val="19"/>
+              </w:rPr>
+              <w:t xml:space="preserve">SATAT</w:t>
+            </w:r>
+          </w:p>
+        </w:tc>
+        <w:tc>
+          <w:tcPr>
+            <w:tcW w:type="dxa" w:w="7500"/>
+            <w:shd w:fill="eef3f8" w:val="clear"/>
+            <w:tcMar>
+              <w:top w:type="dxa" w:w="70"/>
+              <w:left w:type="dxa" w:w="110"/>
+              <w:bottom w:type="dxa" w:w="70"/>
+              <w:right w:type="dxa" w:w="110"/>
+            </w:tcMar>
+          </w:tcPr>
+          <w:p>
+            <w:pPr>
+              <w:jc w:val="left"/>
+            </w:pPr>
+            <w:r>
+              <w:rPr>
+                <w:rFonts w:ascii="Calibri" w:cs="Calibri" w:eastAsia="Calibri" w:hAnsi="Calibri"/>
+                <w:b w:val="false"/>
+                <w:bCs w:val="false"/>
+                <w:color w:val="1a1a2e"/>
+                <w:sz w:val="19"/>
+                <w:szCs w:val="19"/>
+              </w:rPr>
+              <w:t xml:space="preserve">Sustainable Alternative Towards Affordable Transportation — MoPNG scheme assuring CBG offtake at ₹54/kg ex-plant</w:t>
+            </w:r>
+          </w:p>
+        </w:tc>
+      </w:tr>
+      <w:tr>
+        <w:tc>
+          <w:tcPr>
+            <w:tcW w:type="dxa" w:w="2300"/>
+            <w:shd w:fill="ffffff" w:val="clear"/>
+            <w:tcMar>
+              <w:top w:type="dxa" w:w="70"/>
+              <w:left w:type="dxa" w:w="110"/>
+              <w:bottom w:type="dxa" w:w="70"/>
+              <w:right w:type="dxa" w:w="110"/>
+            </w:tcMar>
+          </w:tcPr>
+          <w:p>
+            <w:pPr>
+              <w:jc w:val="left"/>
+            </w:pPr>
+            <w:r>
+              <w:rPr>
+                <w:rFonts w:ascii="Calibri" w:cs="Calibri" w:eastAsia="Calibri" w:hAnsi="Calibri"/>
+                <w:b w:val="false"/>
+                <w:bCs w:val="false"/>
+                <w:color w:val="1a1a2e"/>
+                <w:sz w:val="19"/>
+                <w:szCs w:val="19"/>
+              </w:rPr>
+              <w:t xml:space="preserve">OMC / RO</w:t>
+            </w:r>
+          </w:p>
+        </w:tc>
+        <w:tc>
+          <w:tcPr>
+            <w:tcW w:type="dxa" w:w="7500"/>
+            <w:shd w:fill="ffffff" w:val="clear"/>
+            <w:tcMar>
+              <w:top w:type="dxa" w:w="70"/>
+              <w:left w:type="dxa" w:w="110"/>
+              <w:bottom w:type="dxa" w:w="70"/>
+              <w:right w:type="dxa" w:w="110"/>
+            </w:tcMar>
+          </w:tcPr>
+          <w:p>
+            <w:pPr>
+              <w:jc w:val="left"/>
+            </w:pPr>
+            <w:r>
+              <w:rPr>
+                <w:rFonts w:ascii="Calibri" w:cs="Calibri" w:eastAsia="Calibri" w:hAnsi="Calibri"/>
+                <w:b w:val="false"/>
+                <w:bCs w:val="false"/>
+                <w:color w:val="1a1a2e"/>
+                <w:sz w:val="19"/>
+                <w:szCs w:val="19"/>
+              </w:rPr>
+              <w:t xml:space="preserve">Oil Marketing Company (IOCL, BPCL, HPCL…) / Retail Outlet (petrol pump)</w:t>
+            </w:r>
+          </w:p>
+        </w:tc>
+      </w:tr>
+      <w:tr>
+        <w:tc>
+          <w:tcPr>
+            <w:tcW w:type="dxa" w:w="2300"/>
+            <w:shd w:fill="eef3f8" w:val="clear"/>
+            <w:tcMar>
+              <w:top w:type="dxa" w:w="70"/>
+              <w:left w:type="dxa" w:w="110"/>
+              <w:bottom w:type="dxa" w:w="70"/>
+              <w:right w:type="dxa" w:w="110"/>
+            </w:tcMar>
+          </w:tcPr>
+          <w:p>
+            <w:pPr>
+              <w:jc w:val="left"/>
+            </w:pPr>
+            <w:r>
+              <w:rPr>
+                <w:rFonts w:ascii="Calibri" w:cs="Calibri" w:eastAsia="Calibri" w:hAnsi="Calibri"/>
+                <w:b w:val="false"/>
+                <w:bCs w:val="false"/>
+                <w:color w:val="1a1a2e"/>
+                <w:sz w:val="19"/>
+                <w:szCs w:val="19"/>
+              </w:rPr>
+              <w:t xml:space="preserve">VAT / SGST / GST</w:t>
+            </w:r>
+          </w:p>
+        </w:tc>
+        <w:tc>
+          <w:tcPr>
+            <w:tcW w:type="dxa" w:w="7500"/>
+            <w:shd w:fill="eef3f8" w:val="clear"/>
+            <w:tcMar>
+              <w:top w:type="dxa" w:w="70"/>
+              <w:left w:type="dxa" w:w="110"/>
+              <w:bottom w:type="dxa" w:w="70"/>
+              <w:right w:type="dxa" w:w="110"/>
+            </w:tcMar>
+          </w:tcPr>
+          <w:p>
+            <w:pPr>
+              <w:jc w:val="left"/>
+            </w:pPr>
+            <w:r>
+              <w:rPr>
+                <w:rFonts w:ascii="Calibri" w:cs="Calibri" w:eastAsia="Calibri" w:hAnsi="Calibri"/>
+                <w:b w:val="false"/>
+                <w:bCs w:val="false"/>
+                <w:color w:val="1a1a2e"/>
+                <w:sz w:val="19"/>
+                <w:szCs w:val="19"/>
+              </w:rPr>
+              <w:t xml:space="preserve">state Value-Added Tax on petrol · State share of Goods &amp; Services Tax · Goods &amp; Services Tax (ethanol pays 5%)</w:t>
+            </w:r>
+          </w:p>
+        </w:tc>
+      </w:tr>
+      <w:tr>
+        <w:tc>
+          <w:tcPr>
+            <w:tcW w:type="dxa" w:w="2300"/>
+            <w:shd w:fill="ffffff" w:val="clear"/>
+            <w:tcMar>
+              <w:top w:type="dxa" w:w="70"/>
+              <w:left w:type="dxa" w:w="110"/>
+              <w:bottom w:type="dxa" w:w="70"/>
+              <w:right w:type="dxa" w:w="110"/>
+            </w:tcMar>
+          </w:tcPr>
+          <w:p>
+            <w:pPr>
+              <w:jc w:val="left"/>
+            </w:pPr>
+            <w:r>
+              <w:rPr>
+                <w:rFonts w:ascii="Calibri" w:cs="Calibri" w:eastAsia="Calibri" w:hAnsi="Calibri"/>
+                <w:b w:val="false"/>
+                <w:bCs w:val="false"/>
+                <w:color w:val="1a1a2e"/>
+                <w:sz w:val="19"/>
+                <w:szCs w:val="19"/>
+              </w:rPr>
+              <w:t xml:space="preserve">DFPD / ISS</w:t>
+            </w:r>
+          </w:p>
+        </w:tc>
+        <w:tc>
+          <w:tcPr>
+            <w:tcW w:type="dxa" w:w="7500"/>
+            <w:shd w:fill="ffffff" w:val="clear"/>
+            <w:tcMar>
+              <w:top w:type="dxa" w:w="70"/>
+              <w:left w:type="dxa" w:w="110"/>
+              <w:bottom w:type="dxa" w:w="70"/>
+              <w:right w:type="dxa" w:w="110"/>
+            </w:tcMar>
+          </w:tcPr>
+          <w:p>
+            <w:pPr>
+              <w:jc w:val="left"/>
+            </w:pPr>
+            <w:r>
+              <w:rPr>
+                <w:rFonts w:ascii="Calibri" w:cs="Calibri" w:eastAsia="Calibri" w:hAnsi="Calibri"/>
+                <w:b w:val="false"/>
+                <w:bCs w:val="false"/>
+                <w:color w:val="1a1a2e"/>
+                <w:sz w:val="19"/>
+                <w:szCs w:val="19"/>
+              </w:rPr>
+              <w:t xml:space="preserve">Department of Food &amp; Public Distribution / its Ethanol Interest Subvention Scheme (2018–22 windows)</w:t>
+            </w:r>
+          </w:p>
+        </w:tc>
+      </w:tr>
+      <w:tr>
+        <w:tc>
+          <w:tcPr>
+            <w:tcW w:type="dxa" w:w="2300"/>
+            <w:shd w:fill="eef3f8" w:val="clear"/>
+            <w:tcMar>
+              <w:top w:type="dxa" w:w="70"/>
+              <w:left w:type="dxa" w:w="110"/>
+              <w:bottom w:type="dxa" w:w="70"/>
+              <w:right w:type="dxa" w:w="110"/>
+            </w:tcMar>
+          </w:tcPr>
+          <w:p>
+            <w:pPr>
+              <w:jc w:val="left"/>
+            </w:pPr>
+            <w:r>
+              <w:rPr>
+                <w:rFonts w:ascii="Calibri" w:cs="Calibri" w:eastAsia="Calibri" w:hAnsi="Calibri"/>
+                <w:b w:val="false"/>
+                <w:bCs w:val="false"/>
+                <w:color w:val="1a1a2e"/>
+                <w:sz w:val="19"/>
+                <w:szCs w:val="19"/>
+              </w:rPr>
+              <w:t xml:space="preserve">NCDC / CSM</w:t>
+            </w:r>
+          </w:p>
+        </w:tc>
+        <w:tc>
+          <w:tcPr>
+            <w:tcW w:type="dxa" w:w="7500"/>
+            <w:shd w:fill="eef3f8" w:val="clear"/>
+            <w:tcMar>
+              <w:top w:type="dxa" w:w="70"/>
+              <w:left w:type="dxa" w:w="110"/>
+              <w:bottom w:type="dxa" w:w="70"/>
+              <w:right w:type="dxa" w:w="110"/>
+            </w:tcMar>
+          </w:tcPr>
+          <w:p>
+            <w:pPr>
+              <w:jc w:val="left"/>
+            </w:pPr>
+            <w:r>
+              <w:rPr>
+                <w:rFonts w:ascii="Calibri" w:cs="Calibri" w:eastAsia="Calibri" w:hAnsi="Calibri"/>
+                <w:b w:val="false"/>
+                <w:bCs w:val="false"/>
+                <w:color w:val="1a1a2e"/>
+                <w:sz w:val="19"/>
+                <w:szCs w:val="19"/>
+              </w:rPr>
+              <w:t xml:space="preserve">National Cooperative Development Corporation / Cooperative Sugar Mill</w:t>
+            </w:r>
+          </w:p>
+        </w:tc>
+      </w:tr>
+      <w:tr>
+        <w:tc>
+          <w:tcPr>
+            <w:tcW w:type="dxa" w:w="2300"/>
+            <w:shd w:fill="ffffff" w:val="clear"/>
+            <w:tcMar>
+              <w:top w:type="dxa" w:w="70"/>
+              <w:left w:type="dxa" w:w="110"/>
+              <w:bottom w:type="dxa" w:w="70"/>
+              <w:right w:type="dxa" w:w="110"/>
+            </w:tcMar>
+          </w:tcPr>
+          <w:p>
+            <w:pPr>
+              <w:jc w:val="left"/>
+            </w:pPr>
+            <w:r>
+              <w:rPr>
+                <w:rFonts w:ascii="Calibri" w:cs="Calibri" w:eastAsia="Calibri" w:hAnsi="Calibri"/>
+                <w:b w:val="false"/>
+                <w:bCs w:val="false"/>
+                <w:color w:val="1a1a2e"/>
+                <w:sz w:val="19"/>
+                <w:szCs w:val="19"/>
+              </w:rPr>
+              <w:t xml:space="preserve">FCI / OMSS(D)</w:t>
+            </w:r>
+          </w:p>
+        </w:tc>
+        <w:tc>
+          <w:tcPr>
+            <w:tcW w:type="dxa" w:w="7500"/>
+            <w:shd w:fill="ffffff" w:val="clear"/>
+            <w:tcMar>
+              <w:top w:type="dxa" w:w="70"/>
+              <w:left w:type="dxa" w:w="110"/>
+              <w:bottom w:type="dxa" w:w="70"/>
+              <w:right w:type="dxa" w:w="110"/>
+            </w:tcMar>
+          </w:tcPr>
+          <w:p>
+            <w:pPr>
+              <w:jc w:val="left"/>
+            </w:pPr>
+            <w:r>
+              <w:rPr>
+                <w:rFonts w:ascii="Calibri" w:cs="Calibri" w:eastAsia="Calibri" w:hAnsi="Calibri"/>
+                <w:b w:val="false"/>
+                <w:bCs w:val="false"/>
+                <w:color w:val="1a1a2e"/>
+                <w:sz w:val="19"/>
+                <w:szCs w:val="19"/>
+              </w:rPr>
+              <w:t xml:space="preserve">Food Corporation of India / Open Market Sale Scheme (Domestic) under which FCI rice reaches distilleries</w:t>
+            </w:r>
+          </w:p>
+        </w:tc>
+      </w:tr>
+      <w:tr>
+        <w:tc>
+          <w:tcPr>
+            <w:tcW w:type="dxa" w:w="2300"/>
+            <w:shd w:fill="eef3f8" w:val="clear"/>
+            <w:tcMar>
+              <w:top w:type="dxa" w:w="70"/>
+              <w:left w:type="dxa" w:w="110"/>
+              <w:bottom w:type="dxa" w:w="70"/>
+              <w:right w:type="dxa" w:w="110"/>
+            </w:tcMar>
+          </w:tcPr>
+          <w:p>
+            <w:pPr>
+              <w:jc w:val="left"/>
+            </w:pPr>
+            <w:r>
+              <w:rPr>
+                <w:rFonts w:ascii="Calibri" w:cs="Calibri" w:eastAsia="Calibri" w:hAnsi="Calibri"/>
+                <w:b w:val="false"/>
+                <w:bCs w:val="false"/>
+                <w:color w:val="1a1a2e"/>
+                <w:sz w:val="19"/>
+                <w:szCs w:val="19"/>
+              </w:rPr>
+              <w:t xml:space="preserve">KLPD / cr L / MMT / ESY</w:t>
+            </w:r>
+          </w:p>
+        </w:tc>
+        <w:tc>
+          <w:tcPr>
+            <w:tcW w:type="dxa" w:w="7500"/>
+            <w:shd w:fill="eef3f8" w:val="clear"/>
+            <w:tcMar>
+              <w:top w:type="dxa" w:w="70"/>
+              <w:left w:type="dxa" w:w="110"/>
+              <w:bottom w:type="dxa" w:w="70"/>
+              <w:right w:type="dxa" w:w="110"/>
+            </w:tcMar>
+          </w:tcPr>
+          <w:p>
+            <w:pPr>
+              <w:jc w:val="left"/>
+            </w:pPr>
+            <w:r>
+              <w:rPr>
+                <w:rFonts w:ascii="Calibri" w:cs="Calibri" w:eastAsia="Calibri" w:hAnsi="Calibri"/>
+                <w:b w:val="false"/>
+                <w:bCs w:val="false"/>
+                <w:color w:val="1a1a2e"/>
+                <w:sz w:val="19"/>
+                <w:szCs w:val="19"/>
+              </w:rPr>
+              <w:t xml:space="preserve">Kilolitres per day · crore litres (10 million L) · million metric tonnes · Ethanol Supply Year (Nov–Oct)</w:t>
+            </w:r>
+          </w:p>
+        </w:tc>
+      </w:tr>
+      <w:tr>
+        <w:tc>
+          <w:tcPr>
+            <w:tcW w:type="dxa" w:w="2300"/>
+            <w:shd w:fill="ffffff" w:val="clear"/>
+            <w:tcMar>
+              <w:top w:type="dxa" w:w="70"/>
+              <w:left w:type="dxa" w:w="110"/>
+              <w:bottom w:type="dxa" w:w="70"/>
+              <w:right w:type="dxa" w:w="110"/>
+            </w:tcMar>
+          </w:tcPr>
+          <w:p>
+            <w:pPr>
+              <w:jc w:val="left"/>
+            </w:pPr>
+            <w:r>
+              <w:rPr>
+                <w:rFonts w:ascii="Calibri" w:cs="Calibri" w:eastAsia="Calibri" w:hAnsi="Calibri"/>
+                <w:b w:val="false"/>
+                <w:bCs w:val="false"/>
+                <w:color w:val="1a1a2e"/>
+                <w:sz w:val="19"/>
+                <w:szCs w:val="19"/>
+              </w:rPr>
+              <w:t xml:space="preserve">SIAM / ARAI / FE</w:t>
+            </w:r>
+          </w:p>
+        </w:tc>
+        <w:tc>
+          <w:tcPr>
+            <w:tcW w:type="dxa" w:w="7500"/>
+            <w:shd w:fill="ffffff" w:val="clear"/>
+            <w:tcMar>
+              <w:top w:type="dxa" w:w="70"/>
+              <w:left w:type="dxa" w:w="110"/>
+              <w:bottom w:type="dxa" w:w="70"/>
+              <w:right w:type="dxa" w:w="110"/>
+            </w:tcMar>
+          </w:tcPr>
+          <w:p>
+            <w:pPr>
+              <w:jc w:val="left"/>
+            </w:pPr>
+            <w:r>
+              <w:rPr>
+                <w:rFonts w:ascii="Calibri" w:cs="Calibri" w:eastAsia="Calibri" w:hAnsi="Calibri"/>
+                <w:b w:val="false"/>
+                <w:bCs w:val="false"/>
+                <w:color w:val="1a1a2e"/>
+                <w:sz w:val="19"/>
+                <w:szCs w:val="19"/>
+              </w:rPr>
+              <w:t xml:space="preserve">Society of Indian Automobile Manufacturers / Automotive Research Association of India / Fuel Efficiency</w:t>
+            </w:r>
+          </w:p>
+        </w:tc>
+      </w:tr>
+      <w:tr>
+        <w:tc>
+          <w:tcPr>
+            <w:tcW w:type="dxa" w:w="2300"/>
+            <w:shd w:fill="eef3f8" w:val="clear"/>
+            <w:tcMar>
+              <w:top w:type="dxa" w:w="70"/>
+              <w:left w:type="dxa" w:w="110"/>
+              <w:bottom w:type="dxa" w:w="70"/>
+              <w:right w:type="dxa" w:w="110"/>
+            </w:tcMar>
+          </w:tcPr>
+          <w:p>
+            <w:pPr>
+              <w:jc w:val="left"/>
+            </w:pPr>
+            <w:r>
+              <w:rPr>
+                <w:rFonts w:ascii="Calibri" w:cs="Calibri" w:eastAsia="Calibri" w:hAnsi="Calibri"/>
+                <w:b w:val="false"/>
+                <w:bCs w:val="false"/>
+                <w:color w:val="1a1a2e"/>
+                <w:sz w:val="19"/>
+                <w:szCs w:val="19"/>
+              </w:rPr>
+              <w:t xml:space="preserve">PPAC / RR</w:t>
+            </w:r>
+          </w:p>
+        </w:tc>
+        <w:tc>
+          <w:tcPr>
+            <w:tcW w:type="dxa" w:w="7500"/>
+            <w:shd w:fill="eef3f8" w:val="clear"/>
+            <w:tcMar>
+              <w:top w:type="dxa" w:w="70"/>
+              <w:left w:type="dxa" w:w="110"/>
+              <w:bottom w:type="dxa" w:w="70"/>
+              <w:right w:type="dxa" w:w="110"/>
+            </w:tcMar>
+          </w:tcPr>
+          <w:p>
+            <w:pPr>
+              <w:jc w:val="left"/>
+            </w:pPr>
+            <w:r>
+              <w:rPr>
+                <w:rFonts w:ascii="Calibri" w:cs="Calibri" w:eastAsia="Calibri" w:hAnsi="Calibri"/>
+                <w:b w:val="false"/>
+                <w:bCs w:val="false"/>
+                <w:color w:val="1a1a2e"/>
+                <w:sz w:val="19"/>
+                <w:szCs w:val="19"/>
+              </w:rPr>
+              <w:t xml:space="preserve">Petroleum Planning &amp; Analysis Cell / its Ready Reckoner data book</w:t>
+            </w:r>
+          </w:p>
+        </w:tc>
+      </w:tr>
+      <w:tr>
+        <w:tc>
+          <w:tcPr>
+            <w:tcW w:type="dxa" w:w="2300"/>
+            <w:shd w:fill="ffffff" w:val="clear"/>
+            <w:tcMar>
+              <w:top w:type="dxa" w:w="70"/>
+              <w:left w:type="dxa" w:w="110"/>
+              <w:bottom w:type="dxa" w:w="70"/>
+              <w:right w:type="dxa" w:w="110"/>
+            </w:tcMar>
+          </w:tcPr>
+          <w:p>
+            <w:pPr>
+              <w:jc w:val="left"/>
+            </w:pPr>
+            <w:r>
+              <w:rPr>
+                <w:rFonts w:ascii="Calibri" w:cs="Calibri" w:eastAsia="Calibri" w:hAnsi="Calibri"/>
+                <w:b w:val="false"/>
+                <w:bCs w:val="false"/>
+                <w:color w:val="1a1a2e"/>
+                <w:sz w:val="19"/>
+                <w:szCs w:val="19"/>
+              </w:rPr>
+              <w:t xml:space="preserve">RLNG / APM / MMBtu</w:t>
+            </w:r>
+          </w:p>
+        </w:tc>
+        <w:tc>
+          <w:tcPr>
+            <w:tcW w:type="dxa" w:w="7500"/>
+            <w:shd w:fill="ffffff" w:val="clear"/>
+            <w:tcMar>
+              <w:top w:type="dxa" w:w="70"/>
+              <w:left w:type="dxa" w:w="110"/>
+              <w:bottom w:type="dxa" w:w="70"/>
+              <w:right w:type="dxa" w:w="110"/>
+            </w:tcMar>
+          </w:tcPr>
+          <w:p>
+            <w:pPr>
+              <w:jc w:val="left"/>
+            </w:pPr>
+            <w:r>
+              <w:rPr>
+                <w:rFonts w:ascii="Calibri" w:cs="Calibri" w:eastAsia="Calibri" w:hAnsi="Calibri"/>
+                <w:b w:val="false"/>
+                <w:bCs w:val="false"/>
+                <w:color w:val="1a1a2e"/>
+                <w:sz w:val="19"/>
+                <w:szCs w:val="19"/>
+              </w:rPr>
+              <w:t xml:space="preserve">Regasified Liquefied Natural Gas · Administered Price Mechanism (domestic gas) · Million British thermal units</w:t>
+            </w:r>
+          </w:p>
+        </w:tc>
+      </w:tr>
+      <w:tr>
+        <w:tc>
+          <w:tcPr>
+            <w:tcW w:type="dxa" w:w="2300"/>
+            <w:shd w:fill="eef3f8" w:val="clear"/>
+            <w:tcMar>
+              <w:top w:type="dxa" w:w="70"/>
+              <w:left w:type="dxa" w:w="110"/>
+              <w:bottom w:type="dxa" w:w="70"/>
+              <w:right w:type="dxa" w:w="110"/>
+            </w:tcMar>
+          </w:tcPr>
+          <w:p>
+            <w:pPr>
+              <w:jc w:val="left"/>
+            </w:pPr>
+            <w:r>
+              <w:rPr>
+                <w:rFonts w:ascii="Calibri" w:cs="Calibri" w:eastAsia="Calibri" w:hAnsi="Calibri"/>
+                <w:b w:val="false"/>
+                <w:bCs w:val="false"/>
+                <w:color w:val="1a1a2e"/>
+                <w:sz w:val="19"/>
+                <w:szCs w:val="19"/>
+              </w:rPr>
+              <w:t xml:space="preserve">FFV / CR / NBP</w:t>
+            </w:r>
+          </w:p>
+        </w:tc>
+        <w:tc>
+          <w:tcPr>
+            <w:tcW w:type="dxa" w:w="7500"/>
+            <w:shd w:fill="eef3f8" w:val="clear"/>
+            <w:tcMar>
+              <w:top w:type="dxa" w:w="70"/>
+              <w:left w:type="dxa" w:w="110"/>
+              <w:bottom w:type="dxa" w:w="70"/>
+              <w:right w:type="dxa" w:w="110"/>
+            </w:tcMar>
+          </w:tcPr>
+          <w:p>
+            <w:pPr>
+              <w:jc w:val="left"/>
+            </w:pPr>
+            <w:r>
+              <w:rPr>
+                <w:rFonts w:ascii="Calibri" w:cs="Calibri" w:eastAsia="Calibri" w:hAnsi="Calibri"/>
+                <w:b w:val="false"/>
+                <w:bCs w:val="false"/>
+                <w:color w:val="1a1a2e"/>
+                <w:sz w:val="19"/>
+                <w:szCs w:val="19"/>
+              </w:rPr>
+              <w:t xml:space="preserve">Flex-Fuel Vehicle · Compression Ratio · National Biofuel Policy</w:t>
+            </w:r>
+          </w:p>
+        </w:tc>
+      </w:tr>
+    </w:tbl>
     <w:sectPr>
       <w:pgSz w:w="11906" w:h="16838" w:orient="portrait"/>
       <w:pgMar w:top="1080" w:right="1180" w:bottom="1080" w:left="1180" w:header="708" w:footer="708" w:gutter="0"/>

</xml_diff>

<commit_message>
docs: Annex A — CBG incentive stack from the GOBARdhan circular register
19-row annex grouped by lever (offtake/capital/infra/fertiliser/finance/
tax-carbon/standards/state), compiled from the 70-circular register at
gobardhan.eil.co.in, gazette-checked fertiliser leg (CG-DL-E-29032025-
262118), with revision caveats.

Co-Authored-By: Claude Fable 5 <noreply@anthropic.com>
</commit_message>
<xml_diff>
--- a/docs/Energy_Blend_Volume_Dividend.docx
+++ b/docs/Energy_Blend_Volume_Dividend.docx
@@ -13749,6 +13749,1808 @@
           <w:szCs w:val="21"/>
         </w:rPr>
         <w:t xml:space="preserve">Generated by build_energy_doc.js from energy_blend_comparison.py / price_parity_scenarios.py / cbg_satat_economics.py / ethanol_supply_match.py / ron_octane_analysis.py outputs; do not hand-edit. Repository: github.com/herrrickshaw/india-omc-fuel-fleet-model.</w:t>
+      </w:r>
+    </w:p>
+    <w:p>
+      <w:pPr>
+        <w:pStyle w:val="Heading1"/>
+        <w:spacing w:after="160" w:before="320"/>
+      </w:pPr>
+      <w:r>
+        <w:rPr>
+          <w:rFonts w:ascii="Calibri" w:cs="Calibri" w:eastAsia="Calibri" w:hAnsi="Calibri"/>
+          <w:b/>
+          <w:bCs/>
+          <w:color w:val="0f4c81"/>
+          <w:sz w:val="28"/>
+          <w:szCs w:val="28"/>
+        </w:rPr>
+        <w:t xml:space="preserve">Annex A — The CBG incentive stack</w:t>
+      </w:r>
+    </w:p>
+    <w:p>
+      <w:pPr>
+        <w:spacing w:after="160" w:before="0"/>
+      </w:pPr>
+      <w:r>
+        <w:rPr>
+          <w:rFonts w:ascii="Calibri" w:cs="Calibri" w:eastAsia="Calibri" w:hAnsi="Calibri"/>
+          <w:color w:val="1a1a2e"/>
+          <w:sz w:val="21"/>
+          <w:szCs w:val="21"/>
+        </w:rPr>
+        <w:t xml:space="preserve">Compiled from the official GOBARdhan important-circulars register (gobardhan.eil.co.in, 70 circulars as of July 2026), cross-checked against the primary gazette for the fertiliser leg (CG-DL-E-29032025-262118). The stack de-risks every leg of the CBG business model — feedstock, capital, debt, gas revenue, digestate revenue, carbon revenue — and every rupee of it sits on-budget and ex-plant, the structural contrast with ethanol's hidden consumer-side funding documented in this paper. Roughly half the register is dated 2025-26: the policy cadence is accelerating.</w:t>
+      </w:r>
+    </w:p>
+    <w:tbl>
+      <w:tblPr>
+        <w:tblW w:type="dxa" w:w="9800"/>
+        <w:tblBorders>
+          <w:top w:val="single" w:color="c8d2dc" w:sz="2"/>
+          <w:left w:val="single" w:color="c8d2dc" w:sz="2"/>
+          <w:bottom w:val="single" w:color="c8d2dc" w:sz="2"/>
+          <w:right w:val="single" w:color="c8d2dc" w:sz="2"/>
+          <w:insideH w:val="single" w:color="c8d2dc" w:sz="2"/>
+          <w:insideV w:val="single" w:color="c8d2dc" w:sz="2"/>
+        </w:tblBorders>
+      </w:tblPr>
+      <w:tblGrid>
+        <w:gridCol w:w="1900"/>
+        <w:gridCol w:w="4300"/>
+        <w:gridCol w:w="3600"/>
+      </w:tblGrid>
+      <w:tr>
+        <w:trPr>
+          <w:tblHeader/>
+        </w:trPr>
+        <w:tc>
+          <w:tcPr>
+            <w:tcW w:type="dxa" w:w="1900"/>
+            <w:shd w:fill="0f4c81" w:val="clear"/>
+            <w:tcMar>
+              <w:top w:type="dxa" w:w="70"/>
+              <w:left w:type="dxa" w:w="110"/>
+              <w:bottom w:type="dxa" w:w="70"/>
+              <w:right w:type="dxa" w:w="110"/>
+            </w:tcMar>
+          </w:tcPr>
+          <w:p>
+            <w:pPr>
+              <w:jc w:val="left"/>
+            </w:pPr>
+            <w:r>
+              <w:rPr>
+                <w:rFonts w:ascii="Calibri" w:cs="Calibri" w:eastAsia="Calibri" w:hAnsi="Calibri"/>
+                <w:b/>
+                <w:bCs/>
+                <w:color w:val="ffffff"/>
+                <w:sz w:val="19"/>
+                <w:szCs w:val="19"/>
+              </w:rPr>
+              <w:t xml:space="preserve">Lever</w:t>
+            </w:r>
+          </w:p>
+        </w:tc>
+        <w:tc>
+          <w:tcPr>
+            <w:tcW w:type="dxa" w:w="4300"/>
+            <w:shd w:fill="0f4c81" w:val="clear"/>
+            <w:tcMar>
+              <w:top w:type="dxa" w:w="70"/>
+              <w:left w:type="dxa" w:w="110"/>
+              <w:bottom w:type="dxa" w:w="70"/>
+              <w:right w:type="dxa" w:w="110"/>
+            </w:tcMar>
+          </w:tcPr>
+          <w:p>
+            <w:pPr>
+              <w:jc w:val="left"/>
+            </w:pPr>
+            <w:r>
+              <w:rPr>
+                <w:rFonts w:ascii="Calibri" w:cs="Calibri" w:eastAsia="Calibri" w:hAnsi="Calibri"/>
+                <w:b/>
+                <w:bCs/>
+                <w:color w:val="ffffff"/>
+                <w:sz w:val="19"/>
+                <w:szCs w:val="19"/>
+              </w:rPr>
+              <w:t xml:space="preserve">Instrument (issuer, date)</w:t>
+            </w:r>
+          </w:p>
+        </w:tc>
+        <w:tc>
+          <w:tcPr>
+            <w:tcW w:type="dxa" w:w="3600"/>
+            <w:shd w:fill="0f4c81" w:val="clear"/>
+            <w:tcMar>
+              <w:top w:type="dxa" w:w="70"/>
+              <w:left w:type="dxa" w:w="110"/>
+              <w:bottom w:type="dxa" w:w="70"/>
+              <w:right w:type="dxa" w:w="110"/>
+            </w:tcMar>
+          </w:tcPr>
+          <w:p>
+            <w:pPr>
+              <w:jc w:val="left"/>
+            </w:pPr>
+            <w:r>
+              <w:rPr>
+                <w:rFonts w:ascii="Calibri" w:cs="Calibri" w:eastAsia="Calibri" w:hAnsi="Calibri"/>
+                <w:b/>
+                <w:bCs/>
+                <w:color w:val="ffffff"/>
+                <w:sz w:val="19"/>
+                <w:szCs w:val="19"/>
+              </w:rPr>
+              <w:t xml:space="preserve">What it provides</w:t>
+            </w:r>
+          </w:p>
+        </w:tc>
+      </w:tr>
+      <w:tr>
+        <w:tc>
+          <w:tcPr>
+            <w:tcW w:type="dxa" w:w="1900"/>
+            <w:shd w:fill="ffffff" w:val="clear"/>
+            <w:tcMar>
+              <w:top w:type="dxa" w:w="70"/>
+              <w:left w:type="dxa" w:w="110"/>
+              <w:bottom w:type="dxa" w:w="70"/>
+              <w:right w:type="dxa" w:w="110"/>
+            </w:tcMar>
+          </w:tcPr>
+          <w:p>
+            <w:pPr>
+              <w:jc w:val="left"/>
+            </w:pPr>
+            <w:r>
+              <w:rPr>
+                <w:rFonts w:ascii="Calibri" w:cs="Calibri" w:eastAsia="Calibri" w:hAnsi="Calibri"/>
+                <w:b w:val="false"/>
+                <w:bCs w:val="false"/>
+                <w:color w:val="1a1a2e"/>
+                <w:sz w:val="19"/>
+                <w:szCs w:val="19"/>
+              </w:rPr>
+              <w:t xml:space="preserve">Offtake &amp; pricing</w:t>
+            </w:r>
+          </w:p>
+        </w:tc>
+        <w:tc>
+          <w:tcPr>
+            <w:tcW w:type="dxa" w:w="4300"/>
+            <w:shd w:fill="ffffff" w:val="clear"/>
+            <w:tcMar>
+              <w:top w:type="dxa" w:w="70"/>
+              <w:left w:type="dxa" w:w="110"/>
+              <w:bottom w:type="dxa" w:w="70"/>
+              <w:right w:type="dxa" w:w="110"/>
+            </w:tcMar>
+          </w:tcPr>
+          <w:p>
+            <w:pPr>
+              <w:jc w:val="left"/>
+            </w:pPr>
+            <w:r>
+              <w:rPr>
+                <w:rFonts w:ascii="Calibri" w:cs="Calibri" w:eastAsia="Calibri" w:hAnsi="Calibri"/>
+                <w:b w:val="false"/>
+                <w:bCs w:val="false"/>
+                <w:color w:val="1a1a2e"/>
+                <w:sz w:val="19"/>
+                <w:szCs w:val="19"/>
+              </w:rPr>
+              <w:t xml:space="preserve">SATAT assured procurement (MoPNG, May-2022; methodology &amp; price revision May-2025)</w:t>
+            </w:r>
+          </w:p>
+        </w:tc>
+        <w:tc>
+          <w:tcPr>
+            <w:tcW w:type="dxa" w:w="3600"/>
+            <w:shd w:fill="ffffff" w:val="clear"/>
+            <w:tcMar>
+              <w:top w:type="dxa" w:w="70"/>
+              <w:left w:type="dxa" w:w="110"/>
+              <w:bottom w:type="dxa" w:w="70"/>
+              <w:right w:type="dxa" w:w="110"/>
+            </w:tcMar>
+          </w:tcPr>
+          <w:p>
+            <w:pPr>
+              <w:jc w:val="left"/>
+            </w:pPr>
+            <w:r>
+              <w:rPr>
+                <w:rFonts w:ascii="Calibri" w:cs="Calibri" w:eastAsia="Calibri" w:hAnsi="Calibri"/>
+                <w:b w:val="false"/>
+                <w:bCs w:val="false"/>
+                <w:color w:val="1a1a2e"/>
+                <w:sz w:val="19"/>
+                <w:szCs w:val="19"/>
+              </w:rPr>
+              <w:t xml:space="preserve">OMCs guarantee CBG offtake at an assured ex-plant price (₹54/kg basis, excl. 5% GST) under long-term agreements</w:t>
+            </w:r>
+          </w:p>
+        </w:tc>
+      </w:tr>
+      <w:tr>
+        <w:tc>
+          <w:tcPr>
+            <w:tcW w:type="dxa" w:w="1900"/>
+            <w:shd w:fill="eef3f8" w:val="clear"/>
+            <w:tcMar>
+              <w:top w:type="dxa" w:w="70"/>
+              <w:left w:type="dxa" w:w="110"/>
+              <w:bottom w:type="dxa" w:w="70"/>
+              <w:right w:type="dxa" w:w="110"/>
+            </w:tcMar>
+          </w:tcPr>
+          <w:p>
+            <w:pPr>
+              <w:jc w:val="left"/>
+            </w:pPr>
+            <w:r>
+              <w:rPr>
+                <w:rFonts w:ascii="Calibri" w:cs="Calibri" w:eastAsia="Calibri" w:hAnsi="Calibri"/>
+                <w:b w:val="false"/>
+                <w:bCs w:val="false"/>
+                <w:color w:val="1a1a2e"/>
+                <w:sz w:val="19"/>
+                <w:szCs w:val="19"/>
+              </w:rPr>
+              <w:t xml:space="preserve"/>
+            </w:r>
+          </w:p>
+        </w:tc>
+        <w:tc>
+          <w:tcPr>
+            <w:tcW w:type="dxa" w:w="4300"/>
+            <w:shd w:fill="eef3f8" w:val="clear"/>
+            <w:tcMar>
+              <w:top w:type="dxa" w:w="70"/>
+              <w:left w:type="dxa" w:w="110"/>
+              <w:bottom w:type="dxa" w:w="70"/>
+              <w:right w:type="dxa" w:w="110"/>
+            </w:tcMar>
+          </w:tcPr>
+          <w:p>
+            <w:pPr>
+              <w:jc w:val="left"/>
+            </w:pPr>
+            <w:r>
+              <w:rPr>
+                <w:rFonts w:ascii="Calibri" w:cs="Calibri" w:eastAsia="Calibri" w:hAnsi="Calibri"/>
+                <w:b w:val="false"/>
+                <w:bCs w:val="false"/>
+                <w:color w:val="1a1a2e"/>
+                <w:sz w:val="19"/>
+                <w:szCs w:val="19"/>
+              </w:rPr>
+              <w:t xml:space="preserve">CBG–CGD Synchronization Scheme (MoPNG, Apr-2021; extended Oct-2023, Mar-2026)</w:t>
+            </w:r>
+          </w:p>
+        </w:tc>
+        <w:tc>
+          <w:tcPr>
+            <w:tcW w:type="dxa" w:w="3600"/>
+            <w:shd w:fill="eef3f8" w:val="clear"/>
+            <w:tcMar>
+              <w:top w:type="dxa" w:w="70"/>
+              <w:left w:type="dxa" w:w="110"/>
+              <w:bottom w:type="dxa" w:w="70"/>
+              <w:right w:type="dxa" w:w="110"/>
+            </w:tcMar>
+          </w:tcPr>
+          <w:p>
+            <w:pPr>
+              <w:jc w:val="left"/>
+            </w:pPr>
+            <w:r>
+              <w:rPr>
+                <w:rFonts w:ascii="Calibri" w:cs="Calibri" w:eastAsia="Calibri" w:hAnsi="Calibri"/>
+                <w:b w:val="false"/>
+                <w:bCs w:val="false"/>
+                <w:color w:val="1a1a2e"/>
+                <w:sz w:val="19"/>
+                <w:szCs w:val="19"/>
+              </w:rPr>
+              <w:t xml:space="preserve">CBG injected into city-gas networks, fungible with natural gas — grid sale instead of trucking</w:t>
+            </w:r>
+          </w:p>
+        </w:tc>
+      </w:tr>
+      <w:tr>
+        <w:tc>
+          <w:tcPr>
+            <w:tcW w:type="dxa" w:w="1900"/>
+            <w:shd w:fill="ffffff" w:val="clear"/>
+            <w:tcMar>
+              <w:top w:type="dxa" w:w="70"/>
+              <w:left w:type="dxa" w:w="110"/>
+              <w:bottom w:type="dxa" w:w="70"/>
+              <w:right w:type="dxa" w:w="110"/>
+            </w:tcMar>
+          </w:tcPr>
+          <w:p>
+            <w:pPr>
+              <w:jc w:val="left"/>
+            </w:pPr>
+            <w:r>
+              <w:rPr>
+                <w:rFonts w:ascii="Calibri" w:cs="Calibri" w:eastAsia="Calibri" w:hAnsi="Calibri"/>
+                <w:b w:val="false"/>
+                <w:bCs w:val="false"/>
+                <w:color w:val="1a1a2e"/>
+                <w:sz w:val="19"/>
+                <w:szCs w:val="19"/>
+              </w:rPr>
+              <w:t xml:space="preserve"/>
+            </w:r>
+          </w:p>
+        </w:tc>
+        <w:tc>
+          <w:tcPr>
+            <w:tcW w:type="dxa" w:w="4300"/>
+            <w:shd w:fill="ffffff" w:val="clear"/>
+            <w:tcMar>
+              <w:top w:type="dxa" w:w="70"/>
+              <w:left w:type="dxa" w:w="110"/>
+              <w:bottom w:type="dxa" w:w="70"/>
+              <w:right w:type="dxa" w:w="110"/>
+            </w:tcMar>
+          </w:tcPr>
+          <w:p>
+            <w:pPr>
+              <w:jc w:val="left"/>
+            </w:pPr>
+            <w:r>
+              <w:rPr>
+                <w:rFonts w:ascii="Calibri" w:cs="Calibri" w:eastAsia="Calibri" w:hAnsi="Calibri"/>
+                <w:b w:val="false"/>
+                <w:bCs w:val="false"/>
+                <w:color w:val="1a1a2e"/>
+                <w:sz w:val="19"/>
+                <w:szCs w:val="19"/>
+              </w:rPr>
+              <w:t xml:space="preserve">CBG Blending Obligation (MoPNG, Feb-2024)</w:t>
+            </w:r>
+          </w:p>
+        </w:tc>
+        <w:tc>
+          <w:tcPr>
+            <w:tcW w:type="dxa" w:w="3600"/>
+            <w:shd w:fill="ffffff" w:val="clear"/>
+            <w:tcMar>
+              <w:top w:type="dxa" w:w="70"/>
+              <w:left w:type="dxa" w:w="110"/>
+              <w:bottom w:type="dxa" w:w="70"/>
+              <w:right w:type="dxa" w:w="110"/>
+            </w:tcMar>
+          </w:tcPr>
+          <w:p>
+            <w:pPr>
+              <w:jc w:val="left"/>
+            </w:pPr>
+            <w:r>
+              <w:rPr>
+                <w:rFonts w:ascii="Calibri" w:cs="Calibri" w:eastAsia="Calibri" w:hAnsi="Calibri"/>
+                <w:b w:val="false"/>
+                <w:bCs w:val="false"/>
+                <w:color w:val="1a1a2e"/>
+                <w:sz w:val="19"/>
+                <w:szCs w:val="19"/>
+              </w:rPr>
+              <w:t xml:space="preserve">Mandatory 1% CBG in CNG(T)/PNG(D) from FY25-26, stepping toward ~5% by FY28-29 — demand by decree</w:t>
+            </w:r>
+          </w:p>
+        </w:tc>
+      </w:tr>
+      <w:tr>
+        <w:tc>
+          <w:tcPr>
+            <w:tcW w:type="dxa" w:w="1900"/>
+            <w:shd w:fill="eef3f8" w:val="clear"/>
+            <w:tcMar>
+              <w:top w:type="dxa" w:w="70"/>
+              <w:left w:type="dxa" w:w="110"/>
+              <w:bottom w:type="dxa" w:w="70"/>
+              <w:right w:type="dxa" w:w="110"/>
+            </w:tcMar>
+          </w:tcPr>
+          <w:p>
+            <w:pPr>
+              <w:jc w:val="left"/>
+            </w:pPr>
+            <w:r>
+              <w:rPr>
+                <w:rFonts w:ascii="Calibri" w:cs="Calibri" w:eastAsia="Calibri" w:hAnsi="Calibri"/>
+                <w:b w:val="false"/>
+                <w:bCs w:val="false"/>
+                <w:color w:val="1a1a2e"/>
+                <w:sz w:val="19"/>
+                <w:szCs w:val="19"/>
+              </w:rPr>
+              <w:t xml:space="preserve">Capital support</w:t>
+            </w:r>
+          </w:p>
+        </w:tc>
+        <w:tc>
+          <w:tcPr>
+            <w:tcW w:type="dxa" w:w="4300"/>
+            <w:shd w:fill="eef3f8" w:val="clear"/>
+            <w:tcMar>
+              <w:top w:type="dxa" w:w="70"/>
+              <w:left w:type="dxa" w:w="110"/>
+              <w:bottom w:type="dxa" w:w="70"/>
+              <w:right w:type="dxa" w:w="110"/>
+            </w:tcMar>
+          </w:tcPr>
+          <w:p>
+            <w:pPr>
+              <w:jc w:val="left"/>
+            </w:pPr>
+            <w:r>
+              <w:rPr>
+                <w:rFonts w:ascii="Calibri" w:cs="Calibri" w:eastAsia="Calibri" w:hAnsi="Calibri"/>
+                <w:b w:val="false"/>
+                <w:bCs w:val="false"/>
+                <w:color w:val="1a1a2e"/>
+                <w:sz w:val="19"/>
+                <w:szCs w:val="19"/>
+              </w:rPr>
+              <w:t xml:space="preserve">MNRE Waste-to-Energy / National Bioenergy Programme (Nov-2022; revised Jun-2025; suppl. budget Sep-2025)</w:t>
+            </w:r>
+          </w:p>
+        </w:tc>
+        <w:tc>
+          <w:tcPr>
+            <w:tcW w:type="dxa" w:w="3600"/>
+            <w:shd w:fill="eef3f8" w:val="clear"/>
+            <w:tcMar>
+              <w:top w:type="dxa" w:w="70"/>
+              <w:left w:type="dxa" w:w="110"/>
+              <w:bottom w:type="dxa" w:w="70"/>
+              <w:right w:type="dxa" w:w="110"/>
+            </w:tcMar>
+          </w:tcPr>
+          <w:p>
+            <w:pPr>
+              <w:jc w:val="left"/>
+            </w:pPr>
+            <w:r>
+              <w:rPr>
+                <w:rFonts w:ascii="Calibri" w:cs="Calibri" w:eastAsia="Calibri" w:hAnsi="Calibri"/>
+                <w:b w:val="false"/>
+                <w:bCs w:val="false"/>
+                <w:color w:val="1a1a2e"/>
+                <w:sz w:val="19"/>
+                <w:szCs w:val="19"/>
+              </w:rPr>
+              <w:t xml:space="preserve">Central financial assistance per unit of CBG capacity, capped per project</w:t>
+            </w:r>
+          </w:p>
+        </w:tc>
+      </w:tr>
+      <w:tr>
+        <w:tc>
+          <w:tcPr>
+            <w:tcW w:type="dxa" w:w="1900"/>
+            <w:shd w:fill="ffffff" w:val="clear"/>
+            <w:tcMar>
+              <w:top w:type="dxa" w:w="70"/>
+              <w:left w:type="dxa" w:w="110"/>
+              <w:bottom w:type="dxa" w:w="70"/>
+              <w:right w:type="dxa" w:w="110"/>
+            </w:tcMar>
+          </w:tcPr>
+          <w:p>
+            <w:pPr>
+              <w:jc w:val="left"/>
+            </w:pPr>
+            <w:r>
+              <w:rPr>
+                <w:rFonts w:ascii="Calibri" w:cs="Calibri" w:eastAsia="Calibri" w:hAnsi="Calibri"/>
+                <w:b w:val="false"/>
+                <w:bCs w:val="false"/>
+                <w:color w:val="1a1a2e"/>
+                <w:sz w:val="19"/>
+                <w:szCs w:val="19"/>
+              </w:rPr>
+              <w:t xml:space="preserve"/>
+            </w:r>
+          </w:p>
+        </w:tc>
+        <w:tc>
+          <w:tcPr>
+            <w:tcW w:type="dxa" w:w="4300"/>
+            <w:shd w:fill="ffffff" w:val="clear"/>
+            <w:tcMar>
+              <w:top w:type="dxa" w:w="70"/>
+              <w:left w:type="dxa" w:w="110"/>
+              <w:bottom w:type="dxa" w:w="70"/>
+              <w:right w:type="dxa" w:w="110"/>
+            </w:tcMar>
+          </w:tcPr>
+          <w:p>
+            <w:pPr>
+              <w:jc w:val="left"/>
+            </w:pPr>
+            <w:r>
+              <w:rPr>
+                <w:rFonts w:ascii="Calibri" w:cs="Calibri" w:eastAsia="Calibri" w:hAnsi="Calibri"/>
+                <w:b w:val="false"/>
+                <w:bCs w:val="false"/>
+                <w:color w:val="1a1a2e"/>
+                <w:sz w:val="19"/>
+                <w:szCs w:val="19"/>
+              </w:rPr>
+              <w:t xml:space="preserve">SBM 2.0 bio-methanation VGF (MoHUA, cost norms revised Nov-2025)</w:t>
+            </w:r>
+          </w:p>
+        </w:tc>
+        <w:tc>
+          <w:tcPr>
+            <w:tcW w:type="dxa" w:w="3600"/>
+            <w:shd w:fill="ffffff" w:val="clear"/>
+            <w:tcMar>
+              <w:top w:type="dxa" w:w="70"/>
+              <w:left w:type="dxa" w:w="110"/>
+              <w:bottom w:type="dxa" w:w="70"/>
+              <w:right w:type="dxa" w:w="110"/>
+            </w:tcMar>
+          </w:tcPr>
+          <w:p>
+            <w:pPr>
+              <w:jc w:val="left"/>
+            </w:pPr>
+            <w:r>
+              <w:rPr>
+                <w:rFonts w:ascii="Calibri" w:cs="Calibri" w:eastAsia="Calibri" w:hAnsi="Calibri"/>
+                <w:b w:val="false"/>
+                <w:bCs w:val="false"/>
+                <w:color w:val="1a1a2e"/>
+                <w:sz w:val="19"/>
+                <w:szCs w:val="19"/>
+              </w:rPr>
+              <w:t xml:space="preserve">Viability-gap funding for municipal-waste CBG plants</w:t>
+            </w:r>
+          </w:p>
+        </w:tc>
+      </w:tr>
+      <w:tr>
+        <w:tc>
+          <w:tcPr>
+            <w:tcW w:type="dxa" w:w="1900"/>
+            <w:shd w:fill="eef3f8" w:val="clear"/>
+            <w:tcMar>
+              <w:top w:type="dxa" w:w="70"/>
+              <w:left w:type="dxa" w:w="110"/>
+              <w:bottom w:type="dxa" w:w="70"/>
+              <w:right w:type="dxa" w:w="110"/>
+            </w:tcMar>
+          </w:tcPr>
+          <w:p>
+            <w:pPr>
+              <w:jc w:val="left"/>
+            </w:pPr>
+            <w:r>
+              <w:rPr>
+                <w:rFonts w:ascii="Calibri" w:cs="Calibri" w:eastAsia="Calibri" w:hAnsi="Calibri"/>
+                <w:b w:val="false"/>
+                <w:bCs w:val="false"/>
+                <w:color w:val="1a1a2e"/>
+                <w:sz w:val="19"/>
+                <w:szCs w:val="19"/>
+              </w:rPr>
+              <w:t xml:space="preserve"/>
+            </w:r>
+          </w:p>
+        </w:tc>
+        <w:tc>
+          <w:tcPr>
+            <w:tcW w:type="dxa" w:w="4300"/>
+            <w:shd w:fill="eef3f8" w:val="clear"/>
+            <w:tcMar>
+              <w:top w:type="dxa" w:w="70"/>
+              <w:left w:type="dxa" w:w="110"/>
+              <w:bottom w:type="dxa" w:w="70"/>
+              <w:right w:type="dxa" w:w="110"/>
+            </w:tcMar>
+          </w:tcPr>
+          <w:p>
+            <w:pPr>
+              <w:jc w:val="left"/>
+            </w:pPr>
+            <w:r>
+              <w:rPr>
+                <w:rFonts w:ascii="Calibri" w:cs="Calibri" w:eastAsia="Calibri" w:hAnsi="Calibri"/>
+                <w:b w:val="false"/>
+                <w:bCs w:val="false"/>
+                <w:color w:val="1a1a2e"/>
+                <w:sz w:val="19"/>
+                <w:szCs w:val="19"/>
+              </w:rPr>
+              <w:t xml:space="preserve">SASCI 2026-27 (DoF Mar-2026; MoPNG guidelines May-2026)</w:t>
+            </w:r>
+          </w:p>
+        </w:tc>
+        <w:tc>
+          <w:tcPr>
+            <w:tcW w:type="dxa" w:w="3600"/>
+            <w:shd w:fill="eef3f8" w:val="clear"/>
+            <w:tcMar>
+              <w:top w:type="dxa" w:w="70"/>
+              <w:left w:type="dxa" w:w="110"/>
+              <w:bottom w:type="dxa" w:w="70"/>
+              <w:right w:type="dxa" w:w="110"/>
+            </w:tcMar>
+          </w:tcPr>
+          <w:p>
+            <w:pPr>
+              <w:jc w:val="left"/>
+            </w:pPr>
+            <w:r>
+              <w:rPr>
+                <w:rFonts w:ascii="Calibri" w:cs="Calibri" w:eastAsia="Calibri" w:hAnsi="Calibri"/>
+                <w:b w:val="false"/>
+                <w:bCs w:val="false"/>
+                <w:color w:val="1a1a2e"/>
+                <w:sz w:val="19"/>
+                <w:szCs w:val="19"/>
+              </w:rPr>
+              <w:t xml:space="preserve">Special capital assistance to states tied to CBG-sector reforms — the newest money in the register</w:t>
+            </w:r>
+          </w:p>
+        </w:tc>
+      </w:tr>
+      <w:tr>
+        <w:tc>
+          <w:tcPr>
+            <w:tcW w:type="dxa" w:w="1900"/>
+            <w:shd w:fill="ffffff" w:val="clear"/>
+            <w:tcMar>
+              <w:top w:type="dxa" w:w="70"/>
+              <w:left w:type="dxa" w:w="110"/>
+              <w:bottom w:type="dxa" w:w="70"/>
+              <w:right w:type="dxa" w:w="110"/>
+            </w:tcMar>
+          </w:tcPr>
+          <w:p>
+            <w:pPr>
+              <w:jc w:val="left"/>
+            </w:pPr>
+            <w:r>
+              <w:rPr>
+                <w:rFonts w:ascii="Calibri" w:cs="Calibri" w:eastAsia="Calibri" w:hAnsi="Calibri"/>
+                <w:b w:val="false"/>
+                <w:bCs w:val="false"/>
+                <w:color w:val="1a1a2e"/>
+                <w:sz w:val="19"/>
+                <w:szCs w:val="19"/>
+              </w:rPr>
+              <w:t xml:space="preserve">Infrastructure &amp; feedstock</w:t>
+            </w:r>
+          </w:p>
+        </w:tc>
+        <w:tc>
+          <w:tcPr>
+            <w:tcW w:type="dxa" w:w="4300"/>
+            <w:shd w:fill="ffffff" w:val="clear"/>
+            <w:tcMar>
+              <w:top w:type="dxa" w:w="70"/>
+              <w:left w:type="dxa" w:w="110"/>
+              <w:bottom w:type="dxa" w:w="70"/>
+              <w:right w:type="dxa" w:w="110"/>
+            </w:tcMar>
+          </w:tcPr>
+          <w:p>
+            <w:pPr>
+              <w:jc w:val="left"/>
+            </w:pPr>
+            <w:r>
+              <w:rPr>
+                <w:rFonts w:ascii="Calibri" w:cs="Calibri" w:eastAsia="Calibri" w:hAnsi="Calibri"/>
+                <w:b w:val="false"/>
+                <w:bCs w:val="false"/>
+                <w:color w:val="1a1a2e"/>
+                <w:sz w:val="19"/>
+                <w:szCs w:val="19"/>
+              </w:rPr>
+              <w:t xml:space="preserve">Pipeline Infrastructure (DPI) scheme (MoPNG, 2024; amended Jan-2025, revised Aug-2025, extended Feb-2026)</w:t>
+            </w:r>
+          </w:p>
+        </w:tc>
+        <w:tc>
+          <w:tcPr>
+            <w:tcW w:type="dxa" w:w="3600"/>
+            <w:shd w:fill="ffffff" w:val="clear"/>
+            <w:tcMar>
+              <w:top w:type="dxa" w:w="70"/>
+              <w:left w:type="dxa" w:w="110"/>
+              <w:bottom w:type="dxa" w:w="70"/>
+              <w:right w:type="dxa" w:w="110"/>
+            </w:tcMar>
+          </w:tcPr>
+          <w:p>
+            <w:pPr>
+              <w:jc w:val="left"/>
+            </w:pPr>
+            <w:r>
+              <w:rPr>
+                <w:rFonts w:ascii="Calibri" w:cs="Calibri" w:eastAsia="Calibri" w:hAnsi="Calibri"/>
+                <w:b w:val="false"/>
+                <w:bCs w:val="false"/>
+                <w:color w:val="1a1a2e"/>
+                <w:sz w:val="19"/>
+                <w:szCs w:val="19"/>
+              </w:rPr>
+              <w:t xml:space="preserve">Funds the connecting pipeline from plant to the CGD grid — the offtake bottleneck</w:t>
+            </w:r>
+          </w:p>
+        </w:tc>
+      </w:tr>
+      <w:tr>
+        <w:tc>
+          <w:tcPr>
+            <w:tcW w:type="dxa" w:w="1900"/>
+            <w:shd w:fill="eef3f8" w:val="clear"/>
+            <w:tcMar>
+              <w:top w:type="dxa" w:w="70"/>
+              <w:left w:type="dxa" w:w="110"/>
+              <w:bottom w:type="dxa" w:w="70"/>
+              <w:right w:type="dxa" w:w="110"/>
+            </w:tcMar>
+          </w:tcPr>
+          <w:p>
+            <w:pPr>
+              <w:jc w:val="left"/>
+            </w:pPr>
+            <w:r>
+              <w:rPr>
+                <w:rFonts w:ascii="Calibri" w:cs="Calibri" w:eastAsia="Calibri" w:hAnsi="Calibri"/>
+                <w:b w:val="false"/>
+                <w:bCs w:val="false"/>
+                <w:color w:val="1a1a2e"/>
+                <w:sz w:val="19"/>
+                <w:szCs w:val="19"/>
+              </w:rPr>
+              <w:t xml:space="preserve"/>
+            </w:r>
+          </w:p>
+        </w:tc>
+        <w:tc>
+          <w:tcPr>
+            <w:tcW w:type="dxa" w:w="4300"/>
+            <w:shd w:fill="eef3f8" w:val="clear"/>
+            <w:tcMar>
+              <w:top w:type="dxa" w:w="70"/>
+              <w:left w:type="dxa" w:w="110"/>
+              <w:bottom w:type="dxa" w:w="70"/>
+              <w:right w:type="dxa" w:w="110"/>
+            </w:tcMar>
+          </w:tcPr>
+          <w:p>
+            <w:pPr>
+              <w:jc w:val="left"/>
+            </w:pPr>
+            <w:r>
+              <w:rPr>
+                <w:rFonts w:ascii="Calibri" w:cs="Calibri" w:eastAsia="Calibri" w:hAnsi="Calibri"/>
+                <w:b w:val="false"/>
+                <w:bCs w:val="false"/>
+                <w:color w:val="1a1a2e"/>
+                <w:sz w:val="19"/>
+                <w:szCs w:val="19"/>
+              </w:rPr>
+              <w:t xml:space="preserve">Biomass Aggregation Machinery scheme (MoPNG, Feb-2024; revised Jul-2025)</w:t>
+            </w:r>
+          </w:p>
+        </w:tc>
+        <w:tc>
+          <w:tcPr>
+            <w:tcW w:type="dxa" w:w="3600"/>
+            <w:shd w:fill="eef3f8" w:val="clear"/>
+            <w:tcMar>
+              <w:top w:type="dxa" w:w="70"/>
+              <w:left w:type="dxa" w:w="110"/>
+              <w:bottom w:type="dxa" w:w="70"/>
+              <w:right w:type="dxa" w:w="110"/>
+            </w:tcMar>
+          </w:tcPr>
+          <w:p>
+            <w:pPr>
+              <w:jc w:val="left"/>
+            </w:pPr>
+            <w:r>
+              <w:rPr>
+                <w:rFonts w:ascii="Calibri" w:cs="Calibri" w:eastAsia="Calibri" w:hAnsi="Calibri"/>
+                <w:b w:val="false"/>
+                <w:bCs w:val="false"/>
+                <w:color w:val="1a1a2e"/>
+                <w:sz w:val="19"/>
+                <w:szCs w:val="19"/>
+              </w:rPr>
+              <w:t xml:space="preserve">Assistance for paddy-straw / biomass collection machinery</w:t>
+            </w:r>
+          </w:p>
+        </w:tc>
+      </w:tr>
+      <w:tr>
+        <w:tc>
+          <w:tcPr>
+            <w:tcW w:type="dxa" w:w="1900"/>
+            <w:shd w:fill="ffffff" w:val="clear"/>
+            <w:tcMar>
+              <w:top w:type="dxa" w:w="70"/>
+              <w:left w:type="dxa" w:w="110"/>
+              <w:bottom w:type="dxa" w:w="70"/>
+              <w:right w:type="dxa" w:w="110"/>
+            </w:tcMar>
+          </w:tcPr>
+          <w:p>
+            <w:pPr>
+              <w:jc w:val="left"/>
+            </w:pPr>
+            <w:r>
+              <w:rPr>
+                <w:rFonts w:ascii="Calibri" w:cs="Calibri" w:eastAsia="Calibri" w:hAnsi="Calibri"/>
+                <w:b w:val="false"/>
+                <w:bCs w:val="false"/>
+                <w:color w:val="1a1a2e"/>
+                <w:sz w:val="19"/>
+                <w:szCs w:val="19"/>
+              </w:rPr>
+              <w:t xml:space="preserve"/>
+            </w:r>
+          </w:p>
+        </w:tc>
+        <w:tc>
+          <w:tcPr>
+            <w:tcW w:type="dxa" w:w="4300"/>
+            <w:shd w:fill="ffffff" w:val="clear"/>
+            <w:tcMar>
+              <w:top w:type="dxa" w:w="70"/>
+              <w:left w:type="dxa" w:w="110"/>
+              <w:bottom w:type="dxa" w:w="70"/>
+              <w:right w:type="dxa" w:w="110"/>
+            </w:tcMar>
+          </w:tcPr>
+          <w:p>
+            <w:pPr>
+              <w:jc w:val="left"/>
+            </w:pPr>
+            <w:r>
+              <w:rPr>
+                <w:rFonts w:ascii="Calibri" w:cs="Calibri" w:eastAsia="Calibri" w:hAnsi="Calibri"/>
+                <w:b w:val="false"/>
+                <w:bCs w:val="false"/>
+                <w:color w:val="1a1a2e"/>
+                <w:sz w:val="19"/>
+                <w:szCs w:val="19"/>
+              </w:rPr>
+              <w:t xml:space="preserve">Crop Residue Management guidelines (DA&amp;FW, 2023-24)</w:t>
+            </w:r>
+          </w:p>
+        </w:tc>
+        <w:tc>
+          <w:tcPr>
+            <w:tcW w:type="dxa" w:w="3600"/>
+            <w:shd w:fill="ffffff" w:val="clear"/>
+            <w:tcMar>
+              <w:top w:type="dxa" w:w="70"/>
+              <w:left w:type="dxa" w:w="110"/>
+              <w:bottom w:type="dxa" w:w="70"/>
+              <w:right w:type="dxa" w:w="110"/>
+            </w:tcMar>
+          </w:tcPr>
+          <w:p>
+            <w:pPr>
+              <w:jc w:val="left"/>
+            </w:pPr>
+            <w:r>
+              <w:rPr>
+                <w:rFonts w:ascii="Calibri" w:cs="Calibri" w:eastAsia="Calibri" w:hAnsi="Calibri"/>
+                <w:b w:val="false"/>
+                <w:bCs w:val="false"/>
+                <w:color w:val="1a1a2e"/>
+                <w:sz w:val="19"/>
+                <w:szCs w:val="19"/>
+              </w:rPr>
+              <w:t xml:space="preserve">Channels crop stubble to CBG plants as feedstock</w:t>
+            </w:r>
+          </w:p>
+        </w:tc>
+      </w:tr>
+      <w:tr>
+        <w:tc>
+          <w:tcPr>
+            <w:tcW w:type="dxa" w:w="1900"/>
+            <w:shd w:fill="eef3f8" w:val="clear"/>
+            <w:tcMar>
+              <w:top w:type="dxa" w:w="70"/>
+              <w:left w:type="dxa" w:w="110"/>
+              <w:bottom w:type="dxa" w:w="70"/>
+              <w:right w:type="dxa" w:w="110"/>
+            </w:tcMar>
+          </w:tcPr>
+          <w:p>
+            <w:pPr>
+              <w:jc w:val="left"/>
+            </w:pPr>
+            <w:r>
+              <w:rPr>
+                <w:rFonts w:ascii="Calibri" w:cs="Calibri" w:eastAsia="Calibri" w:hAnsi="Calibri"/>
+                <w:b w:val="false"/>
+                <w:bCs w:val="false"/>
+                <w:color w:val="1a1a2e"/>
+                <w:sz w:val="19"/>
+                <w:szCs w:val="19"/>
+              </w:rPr>
+              <w:t xml:space="preserve">Fertiliser (digestate) leg</w:t>
+            </w:r>
+          </w:p>
+        </w:tc>
+        <w:tc>
+          <w:tcPr>
+            <w:tcW w:type="dxa" w:w="4300"/>
+            <w:shd w:fill="eef3f8" w:val="clear"/>
+            <w:tcMar>
+              <w:top w:type="dxa" w:w="70"/>
+              <w:left w:type="dxa" w:w="110"/>
+              <w:bottom w:type="dxa" w:w="70"/>
+              <w:right w:type="dxa" w:w="110"/>
+            </w:tcMar>
+          </w:tcPr>
+          <w:p>
+            <w:pPr>
+              <w:jc w:val="left"/>
+            </w:pPr>
+            <w:r>
+              <w:rPr>
+                <w:rFonts w:ascii="Calibri" w:cs="Calibri" w:eastAsia="Calibri" w:hAnsi="Calibri"/>
+                <w:b w:val="false"/>
+                <w:bCs w:val="false"/>
+                <w:color w:val="1a1a2e"/>
+                <w:sz w:val="19"/>
+                <w:szCs w:val="19"/>
+              </w:rPr>
+              <w:t xml:space="preserve">FCO amendments: FOM Jul-2020, LFOM May-2021, 2023 relaxations → Schedule VIII 'Organic Carbon Enhancer' (DA&amp;FW, Feb/Mar-2025)</w:t>
+            </w:r>
+          </w:p>
+        </w:tc>
+        <w:tc>
+          <w:tcPr>
+            <w:tcW w:type="dxa" w:w="3600"/>
+            <w:shd w:fill="eef3f8" w:val="clear"/>
+            <w:tcMar>
+              <w:top w:type="dxa" w:w="70"/>
+              <w:left w:type="dxa" w:w="110"/>
+              <w:bottom w:type="dxa" w:w="70"/>
+              <w:right w:type="dxa" w:w="110"/>
+            </w:tcMar>
+          </w:tcPr>
+          <w:p>
+            <w:pPr>
+              <w:jc w:val="left"/>
+            </w:pPr>
+            <w:r>
+              <w:rPr>
+                <w:rFonts w:ascii="Calibri" w:cs="Calibri" w:eastAsia="Calibri" w:hAnsi="Calibri"/>
+                <w:b w:val="false"/>
+                <w:bCs w:val="false"/>
+                <w:color w:val="1a1a2e"/>
+                <w:sz w:val="19"/>
+                <w:szCs w:val="19"/>
+              </w:rPr>
+              <w:t xml:space="preserve">Digestate becomes a notified fertiliser; Schedule VIII defined on organic carbon (12–14%) + heavy metals only — no NPK/C:N/sieve, built so CBG digestate passes</w:t>
+            </w:r>
+          </w:p>
+        </w:tc>
+      </w:tr>
+      <w:tr>
+        <w:tc>
+          <w:tcPr>
+            <w:tcW w:type="dxa" w:w="1900"/>
+            <w:shd w:fill="ffffff" w:val="clear"/>
+            <w:tcMar>
+              <w:top w:type="dxa" w:w="70"/>
+              <w:left w:type="dxa" w:w="110"/>
+              <w:bottom w:type="dxa" w:w="70"/>
+              <w:right w:type="dxa" w:w="110"/>
+            </w:tcMar>
+          </w:tcPr>
+          <w:p>
+            <w:pPr>
+              <w:jc w:val="left"/>
+            </w:pPr>
+            <w:r>
+              <w:rPr>
+                <w:rFonts w:ascii="Calibri" w:cs="Calibri" w:eastAsia="Calibri" w:hAnsi="Calibri"/>
+                <w:b w:val="false"/>
+                <w:bCs w:val="false"/>
+                <w:color w:val="1a1a2e"/>
+                <w:sz w:val="19"/>
+                <w:szCs w:val="19"/>
+              </w:rPr>
+              <w:t xml:space="preserve"/>
+            </w:r>
+          </w:p>
+        </w:tc>
+        <w:tc>
+          <w:tcPr>
+            <w:tcW w:type="dxa" w:w="4300"/>
+            <w:shd w:fill="ffffff" w:val="clear"/>
+            <w:tcMar>
+              <w:top w:type="dxa" w:w="70"/>
+              <w:left w:type="dxa" w:w="110"/>
+              <w:bottom w:type="dxa" w:w="70"/>
+              <w:right w:type="dxa" w:w="110"/>
+            </w:tcMar>
+          </w:tcPr>
+          <w:p>
+            <w:pPr>
+              <w:jc w:val="left"/>
+            </w:pPr>
+            <w:r>
+              <w:rPr>
+                <w:rFonts w:ascii="Calibri" w:cs="Calibri" w:eastAsia="Calibri" w:hAnsi="Calibri"/>
+                <w:b w:val="false"/>
+                <w:bCs w:val="false"/>
+                <w:color w:val="1a1a2e"/>
+                <w:sz w:val="19"/>
+                <w:szCs w:val="19"/>
+              </w:rPr>
+              <w:t xml:space="preserve">Bulk Sale Notifications I–VII (DA&amp;FW, Nov-2023 → Feb-2026)</w:t>
+            </w:r>
+          </w:p>
+        </w:tc>
+        <w:tc>
+          <w:tcPr>
+            <w:tcW w:type="dxa" w:w="3600"/>
+            <w:shd w:fill="ffffff" w:val="clear"/>
+            <w:tcMar>
+              <w:top w:type="dxa" w:w="70"/>
+              <w:left w:type="dxa" w:w="110"/>
+              <w:bottom w:type="dxa" w:w="70"/>
+              <w:right w:type="dxa" w:w="110"/>
+            </w:tcMar>
+          </w:tcPr>
+          <w:p>
+            <w:pPr>
+              <w:jc w:val="left"/>
+            </w:pPr>
+            <w:r>
+              <w:rPr>
+                <w:rFonts w:ascii="Calibri" w:cs="Calibri" w:eastAsia="Calibri" w:hAnsi="Calibri"/>
+                <w:b w:val="false"/>
+                <w:bCs w:val="false"/>
+                <w:color w:val="1a1a2e"/>
+                <w:sz w:val="19"/>
+                <w:szCs w:val="19"/>
+              </w:rPr>
+              <w:t xml:space="preserve">Named plants may sell FOM/LFOM in bulk directly to farmers for 3 years, bypassing dealer licensing</w:t>
+            </w:r>
+          </w:p>
+        </w:tc>
+      </w:tr>
+      <w:tr>
+        <w:tc>
+          <w:tcPr>
+            <w:tcW w:type="dxa" w:w="1900"/>
+            <w:shd w:fill="eef3f8" w:val="clear"/>
+            <w:tcMar>
+              <w:top w:type="dxa" w:w="70"/>
+              <w:left w:type="dxa" w:w="110"/>
+              <w:bottom w:type="dxa" w:w="70"/>
+              <w:right w:type="dxa" w:w="110"/>
+            </w:tcMar>
+          </w:tcPr>
+          <w:p>
+            <w:pPr>
+              <w:jc w:val="left"/>
+            </w:pPr>
+            <w:r>
+              <w:rPr>
+                <w:rFonts w:ascii="Calibri" w:cs="Calibri" w:eastAsia="Calibri" w:hAnsi="Calibri"/>
+                <w:b w:val="false"/>
+                <w:bCs w:val="false"/>
+                <w:color w:val="1a1a2e"/>
+                <w:sz w:val="19"/>
+                <w:szCs w:val="19"/>
+              </w:rPr>
+              <w:t xml:space="preserve"/>
+            </w:r>
+          </w:p>
+        </w:tc>
+        <w:tc>
+          <w:tcPr>
+            <w:tcW w:type="dxa" w:w="4300"/>
+            <w:shd w:fill="eef3f8" w:val="clear"/>
+            <w:tcMar>
+              <w:top w:type="dxa" w:w="70"/>
+              <w:left w:type="dxa" w:w="110"/>
+              <w:bottom w:type="dxa" w:w="70"/>
+              <w:right w:type="dxa" w:w="110"/>
+            </w:tcMar>
+          </w:tcPr>
+          <w:p>
+            <w:pPr>
+              <w:jc w:val="left"/>
+            </w:pPr>
+            <w:r>
+              <w:rPr>
+                <w:rFonts w:ascii="Calibri" w:cs="Calibri" w:eastAsia="Calibri" w:hAnsi="Calibri"/>
+                <w:b w:val="false"/>
+                <w:bCs w:val="false"/>
+                <w:color w:val="1a1a2e"/>
+                <w:sz w:val="19"/>
+                <w:szCs w:val="19"/>
+              </w:rPr>
+              <w:t xml:space="preserve">Market Development Assistance (DoF, Sep-2023 + SOP/iFMS/DBT machinery 2024-25)</w:t>
+            </w:r>
+          </w:p>
+        </w:tc>
+        <w:tc>
+          <w:tcPr>
+            <w:tcW w:type="dxa" w:w="3600"/>
+            <w:shd w:fill="eef3f8" w:val="clear"/>
+            <w:tcMar>
+              <w:top w:type="dxa" w:w="70"/>
+              <w:left w:type="dxa" w:w="110"/>
+              <w:bottom w:type="dxa" w:w="70"/>
+              <w:right w:type="dxa" w:w="110"/>
+            </w:tcMar>
+          </w:tcPr>
+          <w:p>
+            <w:pPr>
+              <w:jc w:val="left"/>
+            </w:pPr>
+            <w:r>
+              <w:rPr>
+                <w:rFonts w:ascii="Calibri" w:cs="Calibri" w:eastAsia="Calibri" w:hAnsi="Calibri"/>
+                <w:b w:val="false"/>
+                <w:bCs w:val="false"/>
+                <w:color w:val="1a1a2e"/>
+                <w:sz w:val="19"/>
+                <w:szCs w:val="19"/>
+              </w:rPr>
+              <w:t xml:space="preserve">~₹1,500/tonne support on FOM/LFOM/PROM sold — a per-tonne digestate subsidy</w:t>
+            </w:r>
+          </w:p>
+        </w:tc>
+      </w:tr>
+      <w:tr>
+        <w:tc>
+          <w:tcPr>
+            <w:tcW w:type="dxa" w:w="1900"/>
+            <w:shd w:fill="ffffff" w:val="clear"/>
+            <w:tcMar>
+              <w:top w:type="dxa" w:w="70"/>
+              <w:left w:type="dxa" w:w="110"/>
+              <w:bottom w:type="dxa" w:w="70"/>
+              <w:right w:type="dxa" w:w="110"/>
+            </w:tcMar>
+          </w:tcPr>
+          <w:p>
+            <w:pPr>
+              <w:jc w:val="left"/>
+            </w:pPr>
+            <w:r>
+              <w:rPr>
+                <w:rFonts w:ascii="Calibri" w:cs="Calibri" w:eastAsia="Calibri" w:hAnsi="Calibri"/>
+                <w:b w:val="false"/>
+                <w:bCs w:val="false"/>
+                <w:color w:val="1a1a2e"/>
+                <w:sz w:val="19"/>
+                <w:szCs w:val="19"/>
+              </w:rPr>
+              <w:t xml:space="preserve"/>
+            </w:r>
+          </w:p>
+        </w:tc>
+        <w:tc>
+          <w:tcPr>
+            <w:tcW w:type="dxa" w:w="4300"/>
+            <w:shd w:fill="ffffff" w:val="clear"/>
+            <w:tcMar>
+              <w:top w:type="dxa" w:w="70"/>
+              <w:left w:type="dxa" w:w="110"/>
+              <w:bottom w:type="dxa" w:w="70"/>
+              <w:right w:type="dxa" w:w="110"/>
+            </w:tcMar>
+          </w:tcPr>
+          <w:p>
+            <w:pPr>
+              <w:jc w:val="left"/>
+            </w:pPr>
+            <w:r>
+              <w:rPr>
+                <w:rFonts w:ascii="Calibri" w:cs="Calibri" w:eastAsia="Calibri" w:hAnsi="Calibri"/>
+                <w:b w:val="false"/>
+                <w:bCs w:val="false"/>
+                <w:color w:val="1a1a2e"/>
+                <w:sz w:val="19"/>
+                <w:szCs w:val="19"/>
+              </w:rPr>
+              <w:t xml:space="preserve">ICAR Package of Practice (DARE/ICAR, Jul-2024)</w:t>
+            </w:r>
+          </w:p>
+        </w:tc>
+        <w:tc>
+          <w:tcPr>
+            <w:tcW w:type="dxa" w:w="3600"/>
+            <w:shd w:fill="ffffff" w:val="clear"/>
+            <w:tcMar>
+              <w:top w:type="dxa" w:w="70"/>
+              <w:left w:type="dxa" w:w="110"/>
+              <w:bottom w:type="dxa" w:w="70"/>
+              <w:right w:type="dxa" w:w="110"/>
+            </w:tcMar>
+          </w:tcPr>
+          <w:p>
+            <w:pPr>
+              <w:jc w:val="left"/>
+            </w:pPr>
+            <w:r>
+              <w:rPr>
+                <w:rFonts w:ascii="Calibri" w:cs="Calibri" w:eastAsia="Calibri" w:hAnsi="Calibri"/>
+                <w:b w:val="false"/>
+                <w:bCs w:val="false"/>
+                <w:color w:val="1a1a2e"/>
+                <w:sz w:val="19"/>
+                <w:szCs w:val="19"/>
+              </w:rPr>
+              <w:t xml:space="preserve">Official agronomic guidance legitimising FOM/LFOM use on crops</w:t>
+            </w:r>
+          </w:p>
+        </w:tc>
+      </w:tr>
+      <w:tr>
+        <w:tc>
+          <w:tcPr>
+            <w:tcW w:type="dxa" w:w="1900"/>
+            <w:shd w:fill="eef3f8" w:val="clear"/>
+            <w:tcMar>
+              <w:top w:type="dxa" w:w="70"/>
+              <w:left w:type="dxa" w:w="110"/>
+              <w:bottom w:type="dxa" w:w="70"/>
+              <w:right w:type="dxa" w:w="110"/>
+            </w:tcMar>
+          </w:tcPr>
+          <w:p>
+            <w:pPr>
+              <w:jc w:val="left"/>
+            </w:pPr>
+            <w:r>
+              <w:rPr>
+                <w:rFonts w:ascii="Calibri" w:cs="Calibri" w:eastAsia="Calibri" w:hAnsi="Calibri"/>
+                <w:b w:val="false"/>
+                <w:bCs w:val="false"/>
+                <w:color w:val="1a1a2e"/>
+                <w:sz w:val="19"/>
+                <w:szCs w:val="19"/>
+              </w:rPr>
+              <w:t xml:space="preserve">Finance access</w:t>
+            </w:r>
+          </w:p>
+        </w:tc>
+        <w:tc>
+          <w:tcPr>
+            <w:tcW w:type="dxa" w:w="4300"/>
+            <w:shd w:fill="eef3f8" w:val="clear"/>
+            <w:tcMar>
+              <w:top w:type="dxa" w:w="70"/>
+              <w:left w:type="dxa" w:w="110"/>
+              <w:bottom w:type="dxa" w:w="70"/>
+              <w:right w:type="dxa" w:w="110"/>
+            </w:tcMar>
+          </w:tcPr>
+          <w:p>
+            <w:pPr>
+              <w:jc w:val="left"/>
+            </w:pPr>
+            <w:r>
+              <w:rPr>
+                <w:rFonts w:ascii="Calibri" w:cs="Calibri" w:eastAsia="Calibri" w:hAnsi="Calibri"/>
+                <w:b w:val="false"/>
+                <w:bCs w:val="false"/>
+                <w:color w:val="1a1a2e"/>
+                <w:sz w:val="19"/>
+                <w:szCs w:val="19"/>
+              </w:rPr>
+              <w:t xml:space="preserve">Priority Sector Lending (RBI, Sep-2020)</w:t>
+            </w:r>
+          </w:p>
+        </w:tc>
+        <w:tc>
+          <w:tcPr>
+            <w:tcW w:type="dxa" w:w="3600"/>
+            <w:shd w:fill="eef3f8" w:val="clear"/>
+            <w:tcMar>
+              <w:top w:type="dxa" w:w="70"/>
+              <w:left w:type="dxa" w:w="110"/>
+              <w:bottom w:type="dxa" w:w="70"/>
+              <w:right w:type="dxa" w:w="110"/>
+            </w:tcMar>
+          </w:tcPr>
+          <w:p>
+            <w:pPr>
+              <w:jc w:val="left"/>
+            </w:pPr>
+            <w:r>
+              <w:rPr>
+                <w:rFonts w:ascii="Calibri" w:cs="Calibri" w:eastAsia="Calibri" w:hAnsi="Calibri"/>
+                <w:b w:val="false"/>
+                <w:bCs w:val="false"/>
+                <w:color w:val="1a1a2e"/>
+                <w:sz w:val="19"/>
+                <w:szCs w:val="19"/>
+              </w:rPr>
+              <w:t xml:space="preserve">CBG plants qualify for mandated, cheaper bank credit</w:t>
+            </w:r>
+          </w:p>
+        </w:tc>
+      </w:tr>
+      <w:tr>
+        <w:tc>
+          <w:tcPr>
+            <w:tcW w:type="dxa" w:w="1900"/>
+            <w:shd w:fill="ffffff" w:val="clear"/>
+            <w:tcMar>
+              <w:top w:type="dxa" w:w="70"/>
+              <w:left w:type="dxa" w:w="110"/>
+              <w:bottom w:type="dxa" w:w="70"/>
+              <w:right w:type="dxa" w:w="110"/>
+            </w:tcMar>
+          </w:tcPr>
+          <w:p>
+            <w:pPr>
+              <w:jc w:val="left"/>
+            </w:pPr>
+            <w:r>
+              <w:rPr>
+                <w:rFonts w:ascii="Calibri" w:cs="Calibri" w:eastAsia="Calibri" w:hAnsi="Calibri"/>
+                <w:b w:val="false"/>
+                <w:bCs w:val="false"/>
+                <w:color w:val="1a1a2e"/>
+                <w:sz w:val="19"/>
+                <w:szCs w:val="19"/>
+              </w:rPr>
+              <w:t xml:space="preserve"/>
+            </w:r>
+          </w:p>
+        </w:tc>
+        <w:tc>
+          <w:tcPr>
+            <w:tcW w:type="dxa" w:w="4300"/>
+            <w:shd w:fill="ffffff" w:val="clear"/>
+            <w:tcMar>
+              <w:top w:type="dxa" w:w="70"/>
+              <w:left w:type="dxa" w:w="110"/>
+              <w:bottom w:type="dxa" w:w="70"/>
+              <w:right w:type="dxa" w:w="110"/>
+            </w:tcMar>
+          </w:tcPr>
+          <w:p>
+            <w:pPr>
+              <w:jc w:val="left"/>
+            </w:pPr>
+            <w:r>
+              <w:rPr>
+                <w:rFonts w:ascii="Calibri" w:cs="Calibri" w:eastAsia="Calibri" w:hAnsi="Calibri"/>
+                <w:b w:val="false"/>
+                <w:bCs w:val="false"/>
+                <w:color w:val="1a1a2e"/>
+                <w:sz w:val="19"/>
+                <w:szCs w:val="19"/>
+              </w:rPr>
+              <w:t xml:space="preserve">Agriculture Infrastructure Fund (Oct-2020; guidelines Jan-2023) · AHIDF (DAHD, Apr-2022)</w:t>
+            </w:r>
+          </w:p>
+        </w:tc>
+        <w:tc>
+          <w:tcPr>
+            <w:tcW w:type="dxa" w:w="3600"/>
+            <w:shd w:fill="ffffff" w:val="clear"/>
+            <w:tcMar>
+              <w:top w:type="dxa" w:w="70"/>
+              <w:left w:type="dxa" w:w="110"/>
+              <w:bottom w:type="dxa" w:w="70"/>
+              <w:right w:type="dxa" w:w="110"/>
+            </w:tcMar>
+          </w:tcPr>
+          <w:p>
+            <w:pPr>
+              <w:jc w:val="left"/>
+            </w:pPr>
+            <w:r>
+              <w:rPr>
+                <w:rFonts w:ascii="Calibri" w:cs="Calibri" w:eastAsia="Calibri" w:hAnsi="Calibri"/>
+                <w:b w:val="false"/>
+                <w:bCs w:val="false"/>
+                <w:color w:val="1a1a2e"/>
+                <w:sz w:val="19"/>
+                <w:szCs w:val="19"/>
+              </w:rPr>
+              <w:t xml:space="preserve">Interest subvention + credit guarantee; dung-based plants eligible under the animal-husbandry fund</w:t>
+            </w:r>
+          </w:p>
+        </w:tc>
+      </w:tr>
+      <w:tr>
+        <w:tc>
+          <w:tcPr>
+            <w:tcW w:type="dxa" w:w="1900"/>
+            <w:shd w:fill="eef3f8" w:val="clear"/>
+            <w:tcMar>
+              <w:top w:type="dxa" w:w="70"/>
+              <w:left w:type="dxa" w:w="110"/>
+              <w:bottom w:type="dxa" w:w="70"/>
+              <w:right w:type="dxa" w:w="110"/>
+            </w:tcMar>
+          </w:tcPr>
+          <w:p>
+            <w:pPr>
+              <w:jc w:val="left"/>
+            </w:pPr>
+            <w:r>
+              <w:rPr>
+                <w:rFonts w:ascii="Calibri" w:cs="Calibri" w:eastAsia="Calibri" w:hAnsi="Calibri"/>
+                <w:b w:val="false"/>
+                <w:bCs w:val="false"/>
+                <w:color w:val="1a1a2e"/>
+                <w:sz w:val="19"/>
+                <w:szCs w:val="19"/>
+              </w:rPr>
+              <w:t xml:space="preserve">Tax &amp; carbon</w:t>
+            </w:r>
+          </w:p>
+        </w:tc>
+        <w:tc>
+          <w:tcPr>
+            <w:tcW w:type="dxa" w:w="4300"/>
+            <w:shd w:fill="eef3f8" w:val="clear"/>
+            <w:tcMar>
+              <w:top w:type="dxa" w:w="70"/>
+              <w:left w:type="dxa" w:w="110"/>
+              <w:bottom w:type="dxa" w:w="70"/>
+              <w:right w:type="dxa" w:w="110"/>
+            </w:tcMar>
+          </w:tcPr>
+          <w:p>
+            <w:pPr>
+              <w:jc w:val="left"/>
+            </w:pPr>
+            <w:r>
+              <w:rPr>
+                <w:rFonts w:ascii="Calibri" w:cs="Calibri" w:eastAsia="Calibri" w:hAnsi="Calibri"/>
+                <w:b w:val="false"/>
+                <w:bCs w:val="false"/>
+                <w:color w:val="1a1a2e"/>
+                <w:sz w:val="19"/>
+                <w:szCs w:val="19"/>
+              </w:rPr>
+              <w:t xml:space="preserve">5% GST on CBG · excise exemption on CBG-blended CNG (Feb-2023 budget)</w:t>
+            </w:r>
+          </w:p>
+        </w:tc>
+        <w:tc>
+          <w:tcPr>
+            <w:tcW w:type="dxa" w:w="3600"/>
+            <w:shd w:fill="eef3f8" w:val="clear"/>
+            <w:tcMar>
+              <w:top w:type="dxa" w:w="70"/>
+              <w:left w:type="dxa" w:w="110"/>
+              <w:bottom w:type="dxa" w:w="70"/>
+              <w:right w:type="dxa" w:w="110"/>
+            </w:tcMar>
+          </w:tcPr>
+          <w:p>
+            <w:pPr>
+              <w:jc w:val="left"/>
+            </w:pPr>
+            <w:r>
+              <w:rPr>
+                <w:rFonts w:ascii="Calibri" w:cs="Calibri" w:eastAsia="Calibri" w:hAnsi="Calibri"/>
+                <w:b w:val="false"/>
+                <w:bCs w:val="false"/>
+                <w:color w:val="1a1a2e"/>
+                <w:sz w:val="19"/>
+                <w:szCs w:val="19"/>
+              </w:rPr>
+              <w:t xml:space="preserve">Light single tax; the blended portion is not taxed twice</w:t>
+            </w:r>
+          </w:p>
+        </w:tc>
+      </w:tr>
+      <w:tr>
+        <w:tc>
+          <w:tcPr>
+            <w:tcW w:type="dxa" w:w="1900"/>
+            <w:shd w:fill="ffffff" w:val="clear"/>
+            <w:tcMar>
+              <w:top w:type="dxa" w:w="70"/>
+              <w:left w:type="dxa" w:w="110"/>
+              <w:bottom w:type="dxa" w:w="70"/>
+              <w:right w:type="dxa" w:w="110"/>
+            </w:tcMar>
+          </w:tcPr>
+          <w:p>
+            <w:pPr>
+              <w:jc w:val="left"/>
+            </w:pPr>
+            <w:r>
+              <w:rPr>
+                <w:rFonts w:ascii="Calibri" w:cs="Calibri" w:eastAsia="Calibri" w:hAnsi="Calibri"/>
+                <w:b w:val="false"/>
+                <w:bCs w:val="false"/>
+                <w:color w:val="1a1a2e"/>
+                <w:sz w:val="19"/>
+                <w:szCs w:val="19"/>
+              </w:rPr>
+              <w:t xml:space="preserve"/>
+            </w:r>
+          </w:p>
+        </w:tc>
+        <w:tc>
+          <w:tcPr>
+            <w:tcW w:type="dxa" w:w="4300"/>
+            <w:shd w:fill="ffffff" w:val="clear"/>
+            <w:tcMar>
+              <w:top w:type="dxa" w:w="70"/>
+              <w:left w:type="dxa" w:w="110"/>
+              <w:bottom w:type="dxa" w:w="70"/>
+              <w:right w:type="dxa" w:w="110"/>
+            </w:tcMar>
+          </w:tcPr>
+          <w:p>
+            <w:pPr>
+              <w:jc w:val="left"/>
+            </w:pPr>
+            <w:r>
+              <w:rPr>
+                <w:rFonts w:ascii="Calibri" w:cs="Calibri" w:eastAsia="Calibri" w:hAnsi="Calibri"/>
+                <w:b w:val="false"/>
+                <w:bCs w:val="false"/>
+                <w:color w:val="1a1a2e"/>
+                <w:sz w:val="19"/>
+                <w:szCs w:val="19"/>
+              </w:rPr>
+              <w:t xml:space="preserve">Carbon-credit eligibility (MoEFCC, Feb-2023)</w:t>
+            </w:r>
+          </w:p>
+        </w:tc>
+        <w:tc>
+          <w:tcPr>
+            <w:tcW w:type="dxa" w:w="3600"/>
+            <w:shd w:fill="ffffff" w:val="clear"/>
+            <w:tcMar>
+              <w:top w:type="dxa" w:w="70"/>
+              <w:left w:type="dxa" w:w="110"/>
+              <w:bottom w:type="dxa" w:w="70"/>
+              <w:right w:type="dxa" w:w="110"/>
+            </w:tcMar>
+          </w:tcPr>
+          <w:p>
+            <w:pPr>
+              <w:jc w:val="left"/>
+            </w:pPr>
+            <w:r>
+              <w:rPr>
+                <w:rFonts w:ascii="Calibri" w:cs="Calibri" w:eastAsia="Calibri" w:hAnsi="Calibri"/>
+                <w:b w:val="false"/>
+                <w:bCs w:val="false"/>
+                <w:color w:val="1a1a2e"/>
+                <w:sz w:val="19"/>
+                <w:szCs w:val="19"/>
+              </w:rPr>
+              <w:t xml:space="preserve">CBG plants can monetise credits under the Paris-Agreement framework — a third revenue leg</w:t>
+            </w:r>
+          </w:p>
+        </w:tc>
+      </w:tr>
+      <w:tr>
+        <w:tc>
+          <w:tcPr>
+            <w:tcW w:type="dxa" w:w="1900"/>
+            <w:shd w:fill="eef3f8" w:val="clear"/>
+            <w:tcMar>
+              <w:top w:type="dxa" w:w="70"/>
+              <w:left w:type="dxa" w:w="110"/>
+              <w:bottom w:type="dxa" w:w="70"/>
+              <w:right w:type="dxa" w:w="110"/>
+            </w:tcMar>
+          </w:tcPr>
+          <w:p>
+            <w:pPr>
+              <w:jc w:val="left"/>
+            </w:pPr>
+            <w:r>
+              <w:rPr>
+                <w:rFonts w:ascii="Calibri" w:cs="Calibri" w:eastAsia="Calibri" w:hAnsi="Calibri"/>
+                <w:b w:val="false"/>
+                <w:bCs w:val="false"/>
+                <w:color w:val="1a1a2e"/>
+                <w:sz w:val="19"/>
+                <w:szCs w:val="19"/>
+              </w:rPr>
+              <w:t xml:space="preserve">Standards &amp; regulatory easing</w:t>
+            </w:r>
+          </w:p>
+        </w:tc>
+        <w:tc>
+          <w:tcPr>
+            <w:tcW w:type="dxa" w:w="4300"/>
+            <w:shd w:fill="eef3f8" w:val="clear"/>
+            <w:tcMar>
+              <w:top w:type="dxa" w:w="70"/>
+              <w:left w:type="dxa" w:w="110"/>
+              <w:bottom w:type="dxa" w:w="70"/>
+              <w:right w:type="dxa" w:w="110"/>
+            </w:tcMar>
+          </w:tcPr>
+          <w:p>
+            <w:pPr>
+              <w:jc w:val="left"/>
+            </w:pPr>
+            <w:r>
+              <w:rPr>
+                <w:rFonts w:ascii="Calibri" w:cs="Calibri" w:eastAsia="Calibri" w:hAnsi="Calibri"/>
+                <w:b w:val="false"/>
+                <w:bCs w:val="false"/>
+                <w:color w:val="1a1a2e"/>
+                <w:sz w:val="19"/>
+                <w:szCs w:val="19"/>
+              </w:rPr>
+              <w:t xml:space="preserve">IS 16087:2025 Bio-CNG specification (Aug-2025) · MoRTH bio-CNG fuel notification (Jun-2015) · CPCB re-categorisation (2021, 2025)</w:t>
+            </w:r>
+          </w:p>
+        </w:tc>
+        <w:tc>
+          <w:tcPr>
+            <w:tcW w:type="dxa" w:w="3600"/>
+            <w:shd w:fill="eef3f8" w:val="clear"/>
+            <w:tcMar>
+              <w:top w:type="dxa" w:w="70"/>
+              <w:left w:type="dxa" w:w="110"/>
+              <w:bottom w:type="dxa" w:w="70"/>
+              <w:right w:type="dxa" w:w="110"/>
+            </w:tcMar>
+          </w:tcPr>
+          <w:p>
+            <w:pPr>
+              <w:jc w:val="left"/>
+            </w:pPr>
+            <w:r>
+              <w:rPr>
+                <w:rFonts w:ascii="Calibri" w:cs="Calibri" w:eastAsia="Calibri" w:hAnsi="Calibri"/>
+                <w:b w:val="false"/>
+                <w:bCs w:val="false"/>
+                <w:color w:val="1a1a2e"/>
+                <w:sz w:val="19"/>
+                <w:szCs w:val="19"/>
+              </w:rPr>
+              <w:t xml:space="preserve">Legal fungibility with CNG (the basis of energy parity per kg), automotive-fuel authorisation, friendlier pollution-control classification</w:t>
+            </w:r>
+          </w:p>
+        </w:tc>
+      </w:tr>
+      <w:tr>
+        <w:tc>
+          <w:tcPr>
+            <w:tcW w:type="dxa" w:w="1900"/>
+            <w:shd w:fill="ffffff" w:val="clear"/>
+            <w:tcMar>
+              <w:top w:type="dxa" w:w="70"/>
+              <w:left w:type="dxa" w:w="110"/>
+              <w:bottom w:type="dxa" w:w="70"/>
+              <w:right w:type="dxa" w:w="110"/>
+            </w:tcMar>
+          </w:tcPr>
+          <w:p>
+            <w:pPr>
+              <w:jc w:val="left"/>
+            </w:pPr>
+            <w:r>
+              <w:rPr>
+                <w:rFonts w:ascii="Calibri" w:cs="Calibri" w:eastAsia="Calibri" w:hAnsi="Calibri"/>
+                <w:b w:val="false"/>
+                <w:bCs w:val="false"/>
+                <w:color w:val="1a1a2e"/>
+                <w:sz w:val="19"/>
+                <w:szCs w:val="19"/>
+              </w:rPr>
+              <w:t xml:space="preserve">State layer</w:t>
+            </w:r>
+          </w:p>
+        </w:tc>
+        <w:tc>
+          <w:tcPr>
+            <w:tcW w:type="dxa" w:w="4300"/>
+            <w:shd w:fill="ffffff" w:val="clear"/>
+            <w:tcMar>
+              <w:top w:type="dxa" w:w="70"/>
+              <w:left w:type="dxa" w:w="110"/>
+              <w:bottom w:type="dxa" w:w="70"/>
+              <w:right w:type="dxa" w:w="110"/>
+            </w:tcMar>
+          </w:tcPr>
+          <w:p>
+            <w:pPr>
+              <w:jc w:val="left"/>
+            </w:pPr>
+            <w:r>
+              <w:rPr>
+                <w:rFonts w:ascii="Calibri" w:cs="Calibri" w:eastAsia="Calibri" w:hAnsi="Calibri"/>
+                <w:b w:val="false"/>
+                <w:bCs w:val="false"/>
+                <w:color w:val="1a1a2e"/>
+                <w:sz w:val="19"/>
+                <w:szCs w:val="19"/>
+              </w:rPr>
+              <w:t xml:space="preserve">UP 2022 · Bihar 2023/2025 · Rajasthan &amp; AP 2024 · Assam 2025 · MP Apr-2025 · Chhattisgarh Jul-2026 · Model State CBG Policy (MoPNG, Apr-2026)</w:t>
+            </w:r>
+          </w:p>
+        </w:tc>
+        <w:tc>
+          <w:tcPr>
+            <w:tcW w:type="dxa" w:w="3600"/>
+            <w:shd w:fill="ffffff" w:val="clear"/>
+            <w:tcMar>
+              <w:top w:type="dxa" w:w="70"/>
+              <w:left w:type="dxa" w:w="110"/>
+              <w:bottom w:type="dxa" w:w="70"/>
+              <w:right w:type="dxa" w:w="110"/>
+            </w:tcMar>
+          </w:tcPr>
+          <w:p>
+            <w:pPr>
+              <w:jc w:val="left"/>
+            </w:pPr>
+            <w:r>
+              <w:rPr>
+                <w:rFonts w:ascii="Calibri" w:cs="Calibri" w:eastAsia="Calibri" w:hAnsi="Calibri"/>
+                <w:b w:val="false"/>
+                <w:bCs w:val="false"/>
+                <w:color w:val="1a1a2e"/>
+                <w:sz w:val="19"/>
+                <w:szCs w:val="19"/>
+              </w:rPr>
+              <w:t xml:space="preserve">Capital-subsidy top-ups, land, stamp-duty and electricity-duty waivers; the model policy gives states a template</w:t>
+            </w:r>
+          </w:p>
+        </w:tc>
+      </w:tr>
+    </w:tbl>
+    <w:p>
+      <w:pPr>
+        <w:spacing w:after="120" w:before="0"/>
+      </w:pPr>
+      <w:r>
+        <w:rPr>
+          <w:rFonts w:ascii="Calibri" w:cs="Calibri" w:eastAsia="Calibri" w:hAnsi="Calibri"/>
+          <w:color w:val="1a1a2e"/>
+          <w:sz w:val="21"/>
+          <w:szCs w:val="21"/>
+        </w:rPr>
+        <w:t xml:space="preserve"/>
+      </w:r>
+    </w:p>
+    <w:p>
+      <w:pPr>
+        <w:spacing w:after="160" w:before="0"/>
+      </w:pPr>
+      <w:r>
+        <w:rPr>
+          <w:rFonts w:ascii="Calibri" w:cs="Calibri" w:eastAsia="Calibri" w:hAnsi="Calibri"/>
+          <w:i/>
+          <w:iCs/>
+          <w:color w:val="5a5a6e"/>
+          <w:sz w:val="18"/>
+          <w:szCs w:val="18"/>
+        </w:rPr>
+        <w:t xml:space="preserve">Caveats: scheme amounts (capital-assistance rates, MDA quantum) are periodically revised — the register dates above identify the governing circular to check; the NCDC cooperative-mill route nominally covers biogas-adjacent assets but is 96.5% working capital in practice (Section 8); and state-policy benefits vary widely in generosity and actual disbursement.</w:t>
       </w:r>
     </w:p>
     <w:p>

</xml_diff>

<commit_message>
docs: paper section 10 (DME in LPG, LERC basis) + slide 13 — the fourth quadrant
Four-quadrant table completes the framework: ethanol (taxed, dilutes ->
exchequer gains), biodiesel (mild), CBG (parity, honest), DME (subsidised,
-37%/kg -> consumer AND exchequer pay). Glossary + sources extended.

Co-Authored-By: Claude Fable 5 <noreply@anthropic.com>
</commit_message>
<xml_diff>
--- a/docs/Energy_Blend_Volume_Dividend.docx
+++ b/docs/Energy_Blend_Volume_Dividend.docx
@@ -13577,7 +13577,1420 @@
           <w:sz w:val="28"/>
           <w:szCs w:val="28"/>
         </w:rPr>
-        <w:t xml:space="preserve">10. Caveats and sources</w:t>
+        <w:t xml:space="preserve">10. DME in LPG: the fourth quadrant</w:t>
+      </w:r>
+    </w:p>
+    <w:p>
+      <w:pPr>
+        <w:spacing w:after="160" w:before="0"/>
+      </w:pPr>
+      <w:r>
+        <w:rPr>
+          <w:rFonts w:ascii="Calibri" w:cs="Calibri" w:eastAsia="Calibri" w:hAnsi="Calibri"/>
+          <w:color w:val="1a1a2e"/>
+          <w:sz w:val="21"/>
+          <w:szCs w:val="21"/>
+        </w:rPr>
+        <w:t xml:space="preserve">Dimethyl ether (DME, CH₃-O-CH₃) is now blendable into LPG up to 20% under BIS standard IS 18698:2024, positioned as an import-substitution play for a fuel India imports ~60–65% of. The engineering evidence comes from LERC — the LPG Equipment Research Centre, Bengaluru, the oil-industry body that certifies LPG equipment: material compatibility cleared at 20% DME in the vapour phase, flex-fuel burner trials stable, and a measured thermal-efficiency decrease of 5.26% at DME20 on the IS 4246 burner protocol. That 5.26% is the cooking-gas analogue of SIAM's 4% E20 mileage figure — and, like it, runs below the pure energy arithmetic (−7.4%), because oxygenated DME burns cleaner and claws part of the deficit back.</w:t>
+      </w:r>
+    </w:p>
+    <w:p>
+      <w:pPr>
+        <w:spacing w:after="160" w:before="0"/>
+      </w:pPr>
+      <w:r>
+        <w:rPr>
+          <w:rFonts w:ascii="Calibri" w:cs="Calibri" w:eastAsia="Calibri" w:hAnsi="Calibri"/>
+          <w:color w:val="1a1a2e"/>
+          <w:sz w:val="21"/>
+          <w:szCs w:val="21"/>
+        </w:rPr>
+        <w:t xml:space="preserve">Methodology. DME carries 28.8 MJ/kg against LPG's 45.8 (Indian 60:40 butane:propane mix) — a 37% energy deficit per kilogram, deeper than ethanol's 34% per litre. We blend by mass, take LERC's measured drop as the central usable-energy case (scaled linearly to DME5/10), and apply the same constant-demand re-inflation as the petrol analysis: households cook the same, so they buy more kilograms. LPG's two structural differences drive the result: it is sold per kg in a fixed 14.2-kg cylinder, and domestic LPG is subsidised (PMUY, ₹300/cylinder to ~10.3 crore beneficiary households).</w:t>
+      </w:r>
+    </w:p>
+    <w:tbl>
+      <w:tblPr>
+        <w:tblW w:type="dxa" w:w="9800"/>
+        <w:tblBorders>
+          <w:top w:val="single" w:color="c8d2dc" w:sz="2"/>
+          <w:left w:val="single" w:color="c8d2dc" w:sz="2"/>
+          <w:bottom w:val="single" w:color="c8d2dc" w:sz="2"/>
+          <w:right w:val="single" w:color="c8d2dc" w:sz="2"/>
+          <w:insideH w:val="single" w:color="c8d2dc" w:sz="2"/>
+          <w:insideV w:val="single" w:color="c8d2dc" w:sz="2"/>
+        </w:tblBorders>
+      </w:tblPr>
+      <w:tblGrid>
+        <w:gridCol w:w="1200"/>
+        <w:gridCol w:w="1100"/>
+        <w:gridCol w:w="1500"/>
+        <w:gridCol w:w="1600"/>
+        <w:gridCol w:w="1900"/>
+        <w:gridCol w:w="2500"/>
+      </w:tblGrid>
+      <w:tr>
+        <w:trPr>
+          <w:tblHeader/>
+        </w:trPr>
+        <w:tc>
+          <w:tcPr>
+            <w:tcW w:type="dxa" w:w="1200"/>
+            <w:shd w:fill="0f4c81" w:val="clear"/>
+            <w:tcMar>
+              <w:top w:type="dxa" w:w="70"/>
+              <w:left w:type="dxa" w:w="110"/>
+              <w:bottom w:type="dxa" w:w="70"/>
+              <w:right w:type="dxa" w:w="110"/>
+            </w:tcMar>
+          </w:tcPr>
+          <w:p>
+            <w:pPr>
+              <w:jc w:val="left"/>
+            </w:pPr>
+            <w:r>
+              <w:rPr>
+                <w:rFonts w:ascii="Calibri" w:cs="Calibri" w:eastAsia="Calibri" w:hAnsi="Calibri"/>
+                <w:b/>
+                <w:bCs/>
+                <w:color w:val="ffffff"/>
+                <w:sz w:val="19"/>
+                <w:szCs w:val="19"/>
+              </w:rPr>
+              <w:t xml:space="preserve">Blend</w:t>
+            </w:r>
+          </w:p>
+        </w:tc>
+        <w:tc>
+          <w:tcPr>
+            <w:tcW w:type="dxa" w:w="1100"/>
+            <w:shd w:fill="0f4c81" w:val="clear"/>
+            <w:tcMar>
+              <w:top w:type="dxa" w:w="70"/>
+              <w:left w:type="dxa" w:w="110"/>
+              <w:bottom w:type="dxa" w:w="70"/>
+              <w:right w:type="dxa" w:w="110"/>
+            </w:tcMar>
+          </w:tcPr>
+          <w:p>
+            <w:pPr>
+              <w:jc w:val="right"/>
+            </w:pPr>
+            <w:r>
+              <w:rPr>
+                <w:rFonts w:ascii="Calibri" w:cs="Calibri" w:eastAsia="Calibri" w:hAnsi="Calibri"/>
+                <w:b/>
+                <w:bCs/>
+                <w:color w:val="ffffff"/>
+                <w:sz w:val="19"/>
+                <w:szCs w:val="19"/>
+              </w:rPr>
+              <w:t xml:space="preserve">MJ/kg</w:t>
+            </w:r>
+          </w:p>
+        </w:tc>
+        <w:tc>
+          <w:tcPr>
+            <w:tcW w:type="dxa" w:w="1500"/>
+            <w:shd w:fill="0f4c81" w:val="clear"/>
+            <w:tcMar>
+              <w:top w:type="dxa" w:w="70"/>
+              <w:left w:type="dxa" w:w="110"/>
+              <w:bottom w:type="dxa" w:w="70"/>
+              <w:right w:type="dxa" w:w="110"/>
+            </w:tcMar>
+          </w:tcPr>
+          <w:p>
+            <w:pPr>
+              <w:jc w:val="right"/>
+            </w:pPr>
+            <w:r>
+              <w:rPr>
+                <w:rFonts w:ascii="Calibri" w:cs="Calibri" w:eastAsia="Calibri" w:hAnsi="Calibri"/>
+                <w:b/>
+                <w:bCs/>
+                <w:color w:val="ffffff"/>
+                <w:sz w:val="19"/>
+                <w:szCs w:val="19"/>
+              </w:rPr>
+              <w:t xml:space="preserve">Energy vs LPG</w:t>
+            </w:r>
+          </w:p>
+        </w:tc>
+        <w:tc>
+          <w:tcPr>
+            <w:tcW w:type="dxa" w:w="1600"/>
+            <w:shd w:fill="0f4c81" w:val="clear"/>
+            <w:tcMar>
+              <w:top w:type="dxa" w:w="70"/>
+              <w:left w:type="dxa" w:w="110"/>
+              <w:bottom w:type="dxa" w:w="70"/>
+              <w:right w:type="dxa" w:w="110"/>
+            </w:tcMar>
+          </w:tcPr>
+          <w:p>
+            <w:pPr>
+              <w:jc w:val="right"/>
+            </w:pPr>
+            <w:r>
+              <w:rPr>
+                <w:rFonts w:ascii="Calibri" w:cs="Calibri" w:eastAsia="Calibri" w:hAnsi="Calibri"/>
+                <w:b/>
+                <w:bCs/>
+                <w:color w:val="ffffff"/>
+                <w:sz w:val="19"/>
+                <w:szCs w:val="19"/>
+              </w:rPr>
+              <w:t xml:space="preserve">LERC-basis drop</w:t>
+            </w:r>
+          </w:p>
+        </w:tc>
+        <w:tc>
+          <w:tcPr>
+            <w:tcW w:type="dxa" w:w="1900"/>
+            <w:shd w:fill="0f4c81" w:val="clear"/>
+            <w:tcMar>
+              <w:top w:type="dxa" w:w="70"/>
+              <w:left w:type="dxa" w:w="110"/>
+              <w:bottom w:type="dxa" w:w="70"/>
+              <w:right w:type="dxa" w:w="110"/>
+            </w:tcMar>
+          </w:tcPr>
+          <w:p>
+            <w:pPr>
+              <w:jc w:val="right"/>
+            </w:pPr>
+            <w:r>
+              <w:rPr>
+                <w:rFonts w:ascii="Calibri" w:cs="Calibri" w:eastAsia="Calibri" w:hAnsi="Calibri"/>
+                <w:b/>
+                <w:bCs/>
+                <w:color w:val="ffffff"/>
+                <w:sz w:val="19"/>
+                <w:szCs w:val="19"/>
+              </w:rPr>
+              <w:t xml:space="preserve">Cylinder energy (MJ)</w:t>
+            </w:r>
+          </w:p>
+        </w:tc>
+        <w:tc>
+          <w:tcPr>
+            <w:tcW w:type="dxa" w:w="2500"/>
+            <w:shd w:fill="0f4c81" w:val="clear"/>
+            <w:tcMar>
+              <w:top w:type="dxa" w:w="70"/>
+              <w:left w:type="dxa" w:w="110"/>
+              <w:bottom w:type="dxa" w:w="70"/>
+              <w:right w:type="dxa" w:w="110"/>
+            </w:tcMar>
+          </w:tcPr>
+          <w:p>
+            <w:pPr>
+              <w:jc w:val="right"/>
+            </w:pPr>
+            <w:r>
+              <w:rPr>
+                <w:rFonts w:ascii="Calibri" w:cs="Calibri" w:eastAsia="Calibri" w:hAnsi="Calibri"/>
+                <w:b/>
+                <w:bCs/>
+                <w:color w:val="ffffff"/>
+                <w:sz w:val="19"/>
+                <w:szCs w:val="19"/>
+              </w:rPr>
+              <w:t xml:space="preserve">Extra kg for same cooking</w:t>
+            </w:r>
+          </w:p>
+        </w:tc>
+      </w:tr>
+      <w:tr>
+        <w:tc>
+          <w:tcPr>
+            <w:tcW w:type="dxa" w:w="1200"/>
+            <w:shd w:fill="ffffff" w:val="clear"/>
+            <w:tcMar>
+              <w:top w:type="dxa" w:w="70"/>
+              <w:left w:type="dxa" w:w="110"/>
+              <w:bottom w:type="dxa" w:w="70"/>
+              <w:right w:type="dxa" w:w="110"/>
+            </w:tcMar>
+          </w:tcPr>
+          <w:p>
+            <w:pPr>
+              <w:jc w:val="left"/>
+            </w:pPr>
+            <w:r>
+              <w:rPr>
+                <w:rFonts w:ascii="Calibri" w:cs="Calibri" w:eastAsia="Calibri" w:hAnsi="Calibri"/>
+                <w:b w:val="false"/>
+                <w:bCs w:val="false"/>
+                <w:color w:val="1a1a2e"/>
+                <w:sz w:val="19"/>
+                <w:szCs w:val="19"/>
+              </w:rPr>
+              <w:t xml:space="preserve">DME5</w:t>
+            </w:r>
+          </w:p>
+        </w:tc>
+        <w:tc>
+          <w:tcPr>
+            <w:tcW w:type="dxa" w:w="1100"/>
+            <w:shd w:fill="ffffff" w:val="clear"/>
+            <w:tcMar>
+              <w:top w:type="dxa" w:w="70"/>
+              <w:left w:type="dxa" w:w="110"/>
+              <w:bottom w:type="dxa" w:w="70"/>
+              <w:right w:type="dxa" w:w="110"/>
+            </w:tcMar>
+          </w:tcPr>
+          <w:p>
+            <w:pPr>
+              <w:jc w:val="right"/>
+            </w:pPr>
+            <w:r>
+              <w:rPr>
+                <w:rFonts w:ascii="Calibri" w:cs="Calibri" w:eastAsia="Calibri" w:hAnsi="Calibri"/>
+                <w:b w:val="false"/>
+                <w:bCs w:val="false"/>
+                <w:color w:val="1a1a2e"/>
+                <w:sz w:val="19"/>
+                <w:szCs w:val="19"/>
+              </w:rPr>
+              <w:t xml:space="preserve">44.95</w:t>
+            </w:r>
+          </w:p>
+        </w:tc>
+        <w:tc>
+          <w:tcPr>
+            <w:tcW w:type="dxa" w:w="1500"/>
+            <w:shd w:fill="ffffff" w:val="clear"/>
+            <w:tcMar>
+              <w:top w:type="dxa" w:w="70"/>
+              <w:left w:type="dxa" w:w="110"/>
+              <w:bottom w:type="dxa" w:w="70"/>
+              <w:right w:type="dxa" w:w="110"/>
+            </w:tcMar>
+          </w:tcPr>
+          <w:p>
+            <w:pPr>
+              <w:jc w:val="right"/>
+            </w:pPr>
+            <w:r>
+              <w:rPr>
+                <w:rFonts w:ascii="Calibri" w:cs="Calibri" w:eastAsia="Calibri" w:hAnsi="Calibri"/>
+                <w:b w:val="false"/>
+                <w:bCs w:val="false"/>
+                <w:color w:val="1a1a2e"/>
+                <w:sz w:val="19"/>
+                <w:szCs w:val="19"/>
+              </w:rPr>
+              <w:t xml:space="preserve">−1.9%</w:t>
+            </w:r>
+          </w:p>
+        </w:tc>
+        <w:tc>
+          <w:tcPr>
+            <w:tcW w:type="dxa" w:w="1600"/>
+            <w:shd w:fill="ffffff" w:val="clear"/>
+            <w:tcMar>
+              <w:top w:type="dxa" w:w="70"/>
+              <w:left w:type="dxa" w:w="110"/>
+              <w:bottom w:type="dxa" w:w="70"/>
+              <w:right w:type="dxa" w:w="110"/>
+            </w:tcMar>
+          </w:tcPr>
+          <w:p>
+            <w:pPr>
+              <w:jc w:val="right"/>
+            </w:pPr>
+            <w:r>
+              <w:rPr>
+                <w:rFonts w:ascii="Calibri" w:cs="Calibri" w:eastAsia="Calibri" w:hAnsi="Calibri"/>
+                <w:b w:val="false"/>
+                <w:bCs w:val="false"/>
+                <w:color w:val="1a1a2e"/>
+                <w:sz w:val="19"/>
+                <w:szCs w:val="19"/>
+              </w:rPr>
+              <w:t xml:space="preserve">−1.3%</w:t>
+            </w:r>
+          </w:p>
+        </w:tc>
+        <w:tc>
+          <w:tcPr>
+            <w:tcW w:type="dxa" w:w="1900"/>
+            <w:shd w:fill="ffffff" w:val="clear"/>
+            <w:tcMar>
+              <w:top w:type="dxa" w:w="70"/>
+              <w:left w:type="dxa" w:w="110"/>
+              <w:bottom w:type="dxa" w:w="70"/>
+              <w:right w:type="dxa" w:w="110"/>
+            </w:tcMar>
+          </w:tcPr>
+          <w:p>
+            <w:pPr>
+              <w:jc w:val="right"/>
+            </w:pPr>
+            <w:r>
+              <w:rPr>
+                <w:rFonts w:ascii="Calibri" w:cs="Calibri" w:eastAsia="Calibri" w:hAnsi="Calibri"/>
+                <w:b w:val="false"/>
+                <w:bCs w:val="false"/>
+                <w:color w:val="1a1a2e"/>
+                <w:sz w:val="19"/>
+                <w:szCs w:val="19"/>
+              </w:rPr>
+              <w:t xml:space="preserve">638</w:t>
+            </w:r>
+          </w:p>
+        </w:tc>
+        <w:tc>
+          <w:tcPr>
+            <w:tcW w:type="dxa" w:w="2500"/>
+            <w:shd w:fill="ffffff" w:val="clear"/>
+            <w:tcMar>
+              <w:top w:type="dxa" w:w="70"/>
+              <w:left w:type="dxa" w:w="110"/>
+              <w:bottom w:type="dxa" w:w="70"/>
+              <w:right w:type="dxa" w:w="110"/>
+            </w:tcMar>
+          </w:tcPr>
+          <w:p>
+            <w:pPr>
+              <w:jc w:val="right"/>
+            </w:pPr>
+            <w:r>
+              <w:rPr>
+                <w:rFonts w:ascii="Calibri" w:cs="Calibri" w:eastAsia="Calibri" w:hAnsi="Calibri"/>
+                <w:b w:val="false"/>
+                <w:bCs w:val="false"/>
+                <w:color w:val="1a1a2e"/>
+                <w:sz w:val="19"/>
+                <w:szCs w:val="19"/>
+              </w:rPr>
+              <w:t xml:space="preserve">+1.3%</w:t>
+            </w:r>
+          </w:p>
+        </w:tc>
+      </w:tr>
+      <w:tr>
+        <w:tc>
+          <w:tcPr>
+            <w:tcW w:type="dxa" w:w="1200"/>
+            <w:shd w:fill="eef3f8" w:val="clear"/>
+            <w:tcMar>
+              <w:top w:type="dxa" w:w="70"/>
+              <w:left w:type="dxa" w:w="110"/>
+              <w:bottom w:type="dxa" w:w="70"/>
+              <w:right w:type="dxa" w:w="110"/>
+            </w:tcMar>
+          </w:tcPr>
+          <w:p>
+            <w:pPr>
+              <w:jc w:val="left"/>
+            </w:pPr>
+            <w:r>
+              <w:rPr>
+                <w:rFonts w:ascii="Calibri" w:cs="Calibri" w:eastAsia="Calibri" w:hAnsi="Calibri"/>
+                <w:b w:val="false"/>
+                <w:bCs w:val="false"/>
+                <w:color w:val="1a1a2e"/>
+                <w:sz w:val="19"/>
+                <w:szCs w:val="19"/>
+              </w:rPr>
+              <w:t xml:space="preserve">DME10</w:t>
+            </w:r>
+          </w:p>
+        </w:tc>
+        <w:tc>
+          <w:tcPr>
+            <w:tcW w:type="dxa" w:w="1100"/>
+            <w:shd w:fill="eef3f8" w:val="clear"/>
+            <w:tcMar>
+              <w:top w:type="dxa" w:w="70"/>
+              <w:left w:type="dxa" w:w="110"/>
+              <w:bottom w:type="dxa" w:w="70"/>
+              <w:right w:type="dxa" w:w="110"/>
+            </w:tcMar>
+          </w:tcPr>
+          <w:p>
+            <w:pPr>
+              <w:jc w:val="right"/>
+            </w:pPr>
+            <w:r>
+              <w:rPr>
+                <w:rFonts w:ascii="Calibri" w:cs="Calibri" w:eastAsia="Calibri" w:hAnsi="Calibri"/>
+                <w:b w:val="false"/>
+                <w:bCs w:val="false"/>
+                <w:color w:val="1a1a2e"/>
+                <w:sz w:val="19"/>
+                <w:szCs w:val="19"/>
+              </w:rPr>
+              <w:t xml:space="preserve">44.10</w:t>
+            </w:r>
+          </w:p>
+        </w:tc>
+        <w:tc>
+          <w:tcPr>
+            <w:tcW w:type="dxa" w:w="1500"/>
+            <w:shd w:fill="eef3f8" w:val="clear"/>
+            <w:tcMar>
+              <w:top w:type="dxa" w:w="70"/>
+              <w:left w:type="dxa" w:w="110"/>
+              <w:bottom w:type="dxa" w:w="70"/>
+              <w:right w:type="dxa" w:w="110"/>
+            </w:tcMar>
+          </w:tcPr>
+          <w:p>
+            <w:pPr>
+              <w:jc w:val="right"/>
+            </w:pPr>
+            <w:r>
+              <w:rPr>
+                <w:rFonts w:ascii="Calibri" w:cs="Calibri" w:eastAsia="Calibri" w:hAnsi="Calibri"/>
+                <w:b w:val="false"/>
+                <w:bCs w:val="false"/>
+                <w:color w:val="1a1a2e"/>
+                <w:sz w:val="19"/>
+                <w:szCs w:val="19"/>
+              </w:rPr>
+              <w:t xml:space="preserve">−3.7%</w:t>
+            </w:r>
+          </w:p>
+        </w:tc>
+        <w:tc>
+          <w:tcPr>
+            <w:tcW w:type="dxa" w:w="1600"/>
+            <w:shd w:fill="eef3f8" w:val="clear"/>
+            <w:tcMar>
+              <w:top w:type="dxa" w:w="70"/>
+              <w:left w:type="dxa" w:w="110"/>
+              <w:bottom w:type="dxa" w:w="70"/>
+              <w:right w:type="dxa" w:w="110"/>
+            </w:tcMar>
+          </w:tcPr>
+          <w:p>
+            <w:pPr>
+              <w:jc w:val="right"/>
+            </w:pPr>
+            <w:r>
+              <w:rPr>
+                <w:rFonts w:ascii="Calibri" w:cs="Calibri" w:eastAsia="Calibri" w:hAnsi="Calibri"/>
+                <w:b w:val="false"/>
+                <w:bCs w:val="false"/>
+                <w:color w:val="1a1a2e"/>
+                <w:sz w:val="19"/>
+                <w:szCs w:val="19"/>
+              </w:rPr>
+              <w:t xml:space="preserve">−2.6%</w:t>
+            </w:r>
+          </w:p>
+        </w:tc>
+        <w:tc>
+          <w:tcPr>
+            <w:tcW w:type="dxa" w:w="1900"/>
+            <w:shd w:fill="eef3f8" w:val="clear"/>
+            <w:tcMar>
+              <w:top w:type="dxa" w:w="70"/>
+              <w:left w:type="dxa" w:w="110"/>
+              <w:bottom w:type="dxa" w:w="70"/>
+              <w:right w:type="dxa" w:w="110"/>
+            </w:tcMar>
+          </w:tcPr>
+          <w:p>
+            <w:pPr>
+              <w:jc w:val="right"/>
+            </w:pPr>
+            <w:r>
+              <w:rPr>
+                <w:rFonts w:ascii="Calibri" w:cs="Calibri" w:eastAsia="Calibri" w:hAnsi="Calibri"/>
+                <w:b w:val="false"/>
+                <w:bCs w:val="false"/>
+                <w:color w:val="1a1a2e"/>
+                <w:sz w:val="19"/>
+                <w:szCs w:val="19"/>
+              </w:rPr>
+              <w:t xml:space="preserve">626</w:t>
+            </w:r>
+          </w:p>
+        </w:tc>
+        <w:tc>
+          <w:tcPr>
+            <w:tcW w:type="dxa" w:w="2500"/>
+            <w:shd w:fill="eef3f8" w:val="clear"/>
+            <w:tcMar>
+              <w:top w:type="dxa" w:w="70"/>
+              <w:left w:type="dxa" w:w="110"/>
+              <w:bottom w:type="dxa" w:w="70"/>
+              <w:right w:type="dxa" w:w="110"/>
+            </w:tcMar>
+          </w:tcPr>
+          <w:p>
+            <w:pPr>
+              <w:jc w:val="right"/>
+            </w:pPr>
+            <w:r>
+              <w:rPr>
+                <w:rFonts w:ascii="Calibri" w:cs="Calibri" w:eastAsia="Calibri" w:hAnsi="Calibri"/>
+                <w:b w:val="false"/>
+                <w:bCs w:val="false"/>
+                <w:color w:val="1a1a2e"/>
+                <w:sz w:val="19"/>
+                <w:szCs w:val="19"/>
+              </w:rPr>
+              <w:t xml:space="preserve">+2.7%</w:t>
+            </w:r>
+          </w:p>
+        </w:tc>
+      </w:tr>
+      <w:tr>
+        <w:tc>
+          <w:tcPr>
+            <w:tcW w:type="dxa" w:w="1200"/>
+            <w:shd w:fill="ffffff" w:val="clear"/>
+            <w:tcMar>
+              <w:top w:type="dxa" w:w="70"/>
+              <w:left w:type="dxa" w:w="110"/>
+              <w:bottom w:type="dxa" w:w="70"/>
+              <w:right w:type="dxa" w:w="110"/>
+            </w:tcMar>
+          </w:tcPr>
+          <w:p>
+            <w:pPr>
+              <w:jc w:val="left"/>
+            </w:pPr>
+            <w:r>
+              <w:rPr>
+                <w:rFonts w:ascii="Calibri" w:cs="Calibri" w:eastAsia="Calibri" w:hAnsi="Calibri"/>
+                <w:b w:val="false"/>
+                <w:bCs w:val="false"/>
+                <w:color w:val="1a1a2e"/>
+                <w:sz w:val="19"/>
+                <w:szCs w:val="19"/>
+              </w:rPr>
+              <w:t xml:space="preserve">DME20</w:t>
+            </w:r>
+          </w:p>
+        </w:tc>
+        <w:tc>
+          <w:tcPr>
+            <w:tcW w:type="dxa" w:w="1100"/>
+            <w:shd w:fill="ffffff" w:val="clear"/>
+            <w:tcMar>
+              <w:top w:type="dxa" w:w="70"/>
+              <w:left w:type="dxa" w:w="110"/>
+              <w:bottom w:type="dxa" w:w="70"/>
+              <w:right w:type="dxa" w:w="110"/>
+            </w:tcMar>
+          </w:tcPr>
+          <w:p>
+            <w:pPr>
+              <w:jc w:val="right"/>
+            </w:pPr>
+            <w:r>
+              <w:rPr>
+                <w:rFonts w:ascii="Calibri" w:cs="Calibri" w:eastAsia="Calibri" w:hAnsi="Calibri"/>
+                <w:b w:val="false"/>
+                <w:bCs w:val="false"/>
+                <w:color w:val="1a1a2e"/>
+                <w:sz w:val="19"/>
+                <w:szCs w:val="19"/>
+              </w:rPr>
+              <w:t xml:space="preserve">42.40</w:t>
+            </w:r>
+          </w:p>
+        </w:tc>
+        <w:tc>
+          <w:tcPr>
+            <w:tcW w:type="dxa" w:w="1500"/>
+            <w:shd w:fill="ffffff" w:val="clear"/>
+            <w:tcMar>
+              <w:top w:type="dxa" w:w="70"/>
+              <w:left w:type="dxa" w:w="110"/>
+              <w:bottom w:type="dxa" w:w="70"/>
+              <w:right w:type="dxa" w:w="110"/>
+            </w:tcMar>
+          </w:tcPr>
+          <w:p>
+            <w:pPr>
+              <w:jc w:val="right"/>
+            </w:pPr>
+            <w:r>
+              <w:rPr>
+                <w:rFonts w:ascii="Calibri" w:cs="Calibri" w:eastAsia="Calibri" w:hAnsi="Calibri"/>
+                <w:b w:val="false"/>
+                <w:bCs w:val="false"/>
+                <w:color w:val="1a1a2e"/>
+                <w:sz w:val="19"/>
+                <w:szCs w:val="19"/>
+              </w:rPr>
+              <w:t xml:space="preserve">−7.4%</w:t>
+            </w:r>
+          </w:p>
+        </w:tc>
+        <w:tc>
+          <w:tcPr>
+            <w:tcW w:type="dxa" w:w="1600"/>
+            <w:shd w:fill="ffffff" w:val="clear"/>
+            <w:tcMar>
+              <w:top w:type="dxa" w:w="70"/>
+              <w:left w:type="dxa" w:w="110"/>
+              <w:bottom w:type="dxa" w:w="70"/>
+              <w:right w:type="dxa" w:w="110"/>
+            </w:tcMar>
+          </w:tcPr>
+          <w:p>
+            <w:pPr>
+              <w:jc w:val="right"/>
+            </w:pPr>
+            <w:r>
+              <w:rPr>
+                <w:rFonts w:ascii="Calibri" w:cs="Calibri" w:eastAsia="Calibri" w:hAnsi="Calibri"/>
+                <w:b w:val="false"/>
+                <w:bCs w:val="false"/>
+                <w:color w:val="1a1a2e"/>
+                <w:sz w:val="19"/>
+                <w:szCs w:val="19"/>
+              </w:rPr>
+              <w:t xml:space="preserve">−5.3%</w:t>
+            </w:r>
+          </w:p>
+        </w:tc>
+        <w:tc>
+          <w:tcPr>
+            <w:tcW w:type="dxa" w:w="1900"/>
+            <w:shd w:fill="ffffff" w:val="clear"/>
+            <w:tcMar>
+              <w:top w:type="dxa" w:w="70"/>
+              <w:left w:type="dxa" w:w="110"/>
+              <w:bottom w:type="dxa" w:w="70"/>
+              <w:right w:type="dxa" w:w="110"/>
+            </w:tcMar>
+          </w:tcPr>
+          <w:p>
+            <w:pPr>
+              <w:jc w:val="right"/>
+            </w:pPr>
+            <w:r>
+              <w:rPr>
+                <w:rFonts w:ascii="Calibri" w:cs="Calibri" w:eastAsia="Calibri" w:hAnsi="Calibri"/>
+                <w:b w:val="false"/>
+                <w:bCs w:val="false"/>
+                <w:color w:val="1a1a2e"/>
+                <w:sz w:val="19"/>
+                <w:szCs w:val="19"/>
+              </w:rPr>
+              <w:t xml:space="preserve">602</w:t>
+            </w:r>
+          </w:p>
+        </w:tc>
+        <w:tc>
+          <w:tcPr>
+            <w:tcW w:type="dxa" w:w="2500"/>
+            <w:shd w:fill="ffffff" w:val="clear"/>
+            <w:tcMar>
+              <w:top w:type="dxa" w:w="70"/>
+              <w:left w:type="dxa" w:w="110"/>
+              <w:bottom w:type="dxa" w:w="70"/>
+              <w:right w:type="dxa" w:w="110"/>
+            </w:tcMar>
+          </w:tcPr>
+          <w:p>
+            <w:pPr>
+              <w:jc w:val="right"/>
+            </w:pPr>
+            <w:r>
+              <w:rPr>
+                <w:rFonts w:ascii="Calibri" w:cs="Calibri" w:eastAsia="Calibri" w:hAnsi="Calibri"/>
+                <w:b w:val="false"/>
+                <w:bCs w:val="false"/>
+                <w:color w:val="1a1a2e"/>
+                <w:sz w:val="19"/>
+                <w:szCs w:val="19"/>
+              </w:rPr>
+              <w:t xml:space="preserve">+5.6%</w:t>
+            </w:r>
+          </w:p>
+        </w:tc>
+      </w:tr>
+    </w:tbl>
+    <w:p>
+      <w:pPr>
+        <w:spacing w:after="120" w:before="0"/>
+      </w:pPr>
+      <w:r>
+        <w:rPr>
+          <w:rFonts w:ascii="Calibri" w:cs="Calibri" w:eastAsia="Calibri" w:hAnsi="Calibri"/>
+          <w:color w:val="1a1a2e"/>
+          <w:sz w:val="21"/>
+          <w:szCs w:val="21"/>
+        </w:rPr>
+        <w:t xml:space="preserve"/>
+      </w:r>
+    </w:p>
+    <w:p>
+      <w:pPr>
+        <w:spacing w:after="160" w:before="0"/>
+      </w:pPr>
+      <w:r>
+        <w:rPr>
+          <w:rFonts w:ascii="Calibri" w:cs="Calibri" w:eastAsia="Calibri" w:hAnsi="Calibri"/>
+          <w:color w:val="1a1a2e"/>
+          <w:sz w:val="21"/>
+          <w:szCs w:val="21"/>
+        </w:rPr>
+        <w:t xml:space="preserve">Who pays, at DME20 on the full 29.7-MMT pool: a 7-cylinder household buys +0.39 cylinders ≈ ₹312/yr at an unchanged ₹803 price; nationally ₹9,325 crore/yr of extra consumer spend — and, the inversion, ≈₹1,201 crore/yr of extra PMUY subsidy. Ethanol's dilution earns the exchequer excise on the extra volume; DME's dilution bills it, because the diluted fuel is subsidised. The four-quadrant summary of this paper's whole argument:</w:t>
+      </w:r>
+    </w:p>
+    <w:tbl>
+      <w:tblPr>
+        <w:tblW w:type="dxa" w:w="9800"/>
+        <w:tblBorders>
+          <w:top w:val="single" w:color="c8d2dc" w:sz="2"/>
+          <w:left w:val="single" w:color="c8d2dc" w:sz="2"/>
+          <w:bottom w:val="single" w:color="c8d2dc" w:sz="2"/>
+          <w:right w:val="single" w:color="c8d2dc" w:sz="2"/>
+          <w:insideH w:val="single" w:color="c8d2dc" w:sz="2"/>
+          <w:insideV w:val="single" w:color="c8d2dc" w:sz="2"/>
+        </w:tblBorders>
+      </w:tblPr>
+      <w:tblGrid>
+        <w:gridCol w:w="2000"/>
+        <w:gridCol w:w="1300"/>
+        <w:gridCol w:w="2200"/>
+        <w:gridCol w:w="4300"/>
+      </w:tblGrid>
+      <w:tr>
+        <w:trPr>
+          <w:tblHeader/>
+        </w:trPr>
+        <w:tc>
+          <w:tcPr>
+            <w:tcW w:type="dxa" w:w="2000"/>
+            <w:shd w:fill="0f4c81" w:val="clear"/>
+            <w:tcMar>
+              <w:top w:type="dxa" w:w="70"/>
+              <w:left w:type="dxa" w:w="110"/>
+              <w:bottom w:type="dxa" w:w="70"/>
+              <w:right w:type="dxa" w:w="110"/>
+            </w:tcMar>
+          </w:tcPr>
+          <w:p>
+            <w:pPr>
+              <w:jc w:val="left"/>
+            </w:pPr>
+            <w:r>
+              <w:rPr>
+                <w:rFonts w:ascii="Calibri" w:cs="Calibri" w:eastAsia="Calibri" w:hAnsi="Calibri"/>
+                <w:b/>
+                <w:bCs/>
+                <w:color w:val="ffffff"/>
+                <w:sz w:val="19"/>
+                <w:szCs w:val="19"/>
+              </w:rPr>
+              <w:t xml:space="preserve">Blend</w:t>
+            </w:r>
+          </w:p>
+        </w:tc>
+        <w:tc>
+          <w:tcPr>
+            <w:tcW w:type="dxa" w:w="1300"/>
+            <w:shd w:fill="0f4c81" w:val="clear"/>
+            <w:tcMar>
+              <w:top w:type="dxa" w:w="70"/>
+              <w:left w:type="dxa" w:w="110"/>
+              <w:bottom w:type="dxa" w:w="70"/>
+              <w:right w:type="dxa" w:w="110"/>
+            </w:tcMar>
+          </w:tcPr>
+          <w:p>
+            <w:pPr>
+              <w:jc w:val="left"/>
+            </w:pPr>
+            <w:r>
+              <w:rPr>
+                <w:rFonts w:ascii="Calibri" w:cs="Calibri" w:eastAsia="Calibri" w:hAnsi="Calibri"/>
+                <w:b/>
+                <w:bCs/>
+                <w:color w:val="ffffff"/>
+                <w:sz w:val="19"/>
+                <w:szCs w:val="19"/>
+              </w:rPr>
+              <w:t xml:space="preserve">Dilution</w:t>
+            </w:r>
+          </w:p>
+        </w:tc>
+        <w:tc>
+          <w:tcPr>
+            <w:tcW w:type="dxa" w:w="2200"/>
+            <w:shd w:fill="0f4c81" w:val="clear"/>
+            <w:tcMar>
+              <w:top w:type="dxa" w:w="70"/>
+              <w:left w:type="dxa" w:w="110"/>
+              <w:bottom w:type="dxa" w:w="70"/>
+              <w:right w:type="dxa" w:w="110"/>
+            </w:tcMar>
+          </w:tcPr>
+          <w:p>
+            <w:pPr>
+              <w:jc w:val="left"/>
+            </w:pPr>
+            <w:r>
+              <w:rPr>
+                <w:rFonts w:ascii="Calibri" w:cs="Calibri" w:eastAsia="Calibri" w:hAnsi="Calibri"/>
+                <w:b/>
+                <w:bCs/>
+                <w:color w:val="ffffff"/>
+                <w:sz w:val="19"/>
+                <w:szCs w:val="19"/>
+              </w:rPr>
+              <w:t xml:space="preserve">Fuel's fiscal status</w:t>
+            </w:r>
+          </w:p>
+        </w:tc>
+        <w:tc>
+          <w:tcPr>
+            <w:tcW w:type="dxa" w:w="4300"/>
+            <w:shd w:fill="0f4c81" w:val="clear"/>
+            <w:tcMar>
+              <w:top w:type="dxa" w:w="70"/>
+              <w:left w:type="dxa" w:w="110"/>
+              <w:bottom w:type="dxa" w:w="70"/>
+              <w:right w:type="dxa" w:w="110"/>
+            </w:tcMar>
+          </w:tcPr>
+          <w:p>
+            <w:pPr>
+              <w:jc w:val="left"/>
+            </w:pPr>
+            <w:r>
+              <w:rPr>
+                <w:rFonts w:ascii="Calibri" w:cs="Calibri" w:eastAsia="Calibri" w:hAnsi="Calibri"/>
+                <w:b/>
+                <w:bCs/>
+                <w:color w:val="ffffff"/>
+                <w:sz w:val="19"/>
+                <w:szCs w:val="19"/>
+              </w:rPr>
+              <w:t xml:space="preserve">The volume effect lands on</w:t>
+            </w:r>
+          </w:p>
+        </w:tc>
+      </w:tr>
+      <w:tr>
+        <w:tc>
+          <w:tcPr>
+            <w:tcW w:type="dxa" w:w="2000"/>
+            <w:shd w:fill="ffffff" w:val="clear"/>
+            <w:tcMar>
+              <w:top w:type="dxa" w:w="70"/>
+              <w:left w:type="dxa" w:w="110"/>
+              <w:bottom w:type="dxa" w:w="70"/>
+              <w:right w:type="dxa" w:w="110"/>
+            </w:tcMar>
+          </w:tcPr>
+          <w:p>
+            <w:pPr>
+              <w:jc w:val="left"/>
+            </w:pPr>
+            <w:r>
+              <w:rPr>
+                <w:rFonts w:ascii="Calibri" w:cs="Calibri" w:eastAsia="Calibri" w:hAnsi="Calibri"/>
+                <w:b w:val="false"/>
+                <w:bCs w:val="false"/>
+                <w:color w:val="1a1a2e"/>
+                <w:sz w:val="19"/>
+                <w:szCs w:val="19"/>
+              </w:rPr>
+              <w:t xml:space="preserve">Ethanol in petrol</w:t>
+            </w:r>
+          </w:p>
+        </w:tc>
+        <w:tc>
+          <w:tcPr>
+            <w:tcW w:type="dxa" w:w="1300"/>
+            <w:shd w:fill="ffffff" w:val="clear"/>
+            <w:tcMar>
+              <w:top w:type="dxa" w:w="70"/>
+              <w:left w:type="dxa" w:w="110"/>
+              <w:bottom w:type="dxa" w:w="70"/>
+              <w:right w:type="dxa" w:w="110"/>
+            </w:tcMar>
+          </w:tcPr>
+          <w:p>
+            <w:pPr>
+              <w:jc w:val="left"/>
+            </w:pPr>
+            <w:r>
+              <w:rPr>
+                <w:rFonts w:ascii="Calibri" w:cs="Calibri" w:eastAsia="Calibri" w:hAnsi="Calibri"/>
+                <w:b w:val="false"/>
+                <w:bCs w:val="false"/>
+                <w:color w:val="1a1a2e"/>
+                <w:sz w:val="19"/>
+                <w:szCs w:val="19"/>
+              </w:rPr>
+              <w:t xml:space="preserve">−34% /L</w:t>
+            </w:r>
+          </w:p>
+        </w:tc>
+        <w:tc>
+          <w:tcPr>
+            <w:tcW w:type="dxa" w:w="2200"/>
+            <w:shd w:fill="ffffff" w:val="clear"/>
+            <w:tcMar>
+              <w:top w:type="dxa" w:w="70"/>
+              <w:left w:type="dxa" w:w="110"/>
+              <w:bottom w:type="dxa" w:w="70"/>
+              <w:right w:type="dxa" w:w="110"/>
+            </w:tcMar>
+          </w:tcPr>
+          <w:p>
+            <w:pPr>
+              <w:jc w:val="left"/>
+            </w:pPr>
+            <w:r>
+              <w:rPr>
+                <w:rFonts w:ascii="Calibri" w:cs="Calibri" w:eastAsia="Calibri" w:hAnsi="Calibri"/>
+                <w:b w:val="false"/>
+                <w:bCs w:val="false"/>
+                <w:color w:val="1a1a2e"/>
+                <w:sz w:val="19"/>
+                <w:szCs w:val="19"/>
+              </w:rPr>
+              <w:t xml:space="preserve">heavily taxed</w:t>
+            </w:r>
+          </w:p>
+        </w:tc>
+        <w:tc>
+          <w:tcPr>
+            <w:tcW w:type="dxa" w:w="4300"/>
+            <w:shd w:fill="ffffff" w:val="clear"/>
+            <w:tcMar>
+              <w:top w:type="dxa" w:w="70"/>
+              <w:left w:type="dxa" w:w="110"/>
+              <w:bottom w:type="dxa" w:w="70"/>
+              <w:right w:type="dxa" w:w="110"/>
+            </w:tcMar>
+          </w:tcPr>
+          <w:p>
+            <w:pPr>
+              <w:jc w:val="left"/>
+            </w:pPr>
+            <w:r>
+              <w:rPr>
+                <w:rFonts w:ascii="Calibri" w:cs="Calibri" w:eastAsia="Calibri" w:hAnsi="Calibri"/>
+                <w:b w:val="false"/>
+                <w:bCs w:val="false"/>
+                <w:color w:val="1a1a2e"/>
+                <w:sz w:val="19"/>
+                <w:szCs w:val="19"/>
+              </w:rPr>
+              <w:t xml:space="preserve">consumer pays; exchequer + trade collect</w:t>
+            </w:r>
+          </w:p>
+        </w:tc>
+      </w:tr>
+      <w:tr>
+        <w:tc>
+          <w:tcPr>
+            <w:tcW w:type="dxa" w:w="2000"/>
+            <w:shd w:fill="eef3f8" w:val="clear"/>
+            <w:tcMar>
+              <w:top w:type="dxa" w:w="70"/>
+              <w:left w:type="dxa" w:w="110"/>
+              <w:bottom w:type="dxa" w:w="70"/>
+              <w:right w:type="dxa" w:w="110"/>
+            </w:tcMar>
+          </w:tcPr>
+          <w:p>
+            <w:pPr>
+              <w:jc w:val="left"/>
+            </w:pPr>
+            <w:r>
+              <w:rPr>
+                <w:rFonts w:ascii="Calibri" w:cs="Calibri" w:eastAsia="Calibri" w:hAnsi="Calibri"/>
+                <w:b w:val="false"/>
+                <w:bCs w:val="false"/>
+                <w:color w:val="1a1a2e"/>
+                <w:sz w:val="19"/>
+                <w:szCs w:val="19"/>
+              </w:rPr>
+              <w:t xml:space="preserve">Biodiesel in diesel</w:t>
+            </w:r>
+          </w:p>
+        </w:tc>
+        <w:tc>
+          <w:tcPr>
+            <w:tcW w:type="dxa" w:w="1300"/>
+            <w:shd w:fill="eef3f8" w:val="clear"/>
+            <w:tcMar>
+              <w:top w:type="dxa" w:w="70"/>
+              <w:left w:type="dxa" w:w="110"/>
+              <w:bottom w:type="dxa" w:w="70"/>
+              <w:right w:type="dxa" w:w="110"/>
+            </w:tcMar>
+          </w:tcPr>
+          <w:p>
+            <w:pPr>
+              <w:jc w:val="left"/>
+            </w:pPr>
+            <w:r>
+              <w:rPr>
+                <w:rFonts w:ascii="Calibri" w:cs="Calibri" w:eastAsia="Calibri" w:hAnsi="Calibri"/>
+                <w:b w:val="false"/>
+                <w:bCs w:val="false"/>
+                <w:color w:val="1a1a2e"/>
+                <w:sz w:val="19"/>
+                <w:szCs w:val="19"/>
+              </w:rPr>
+              <w:t xml:space="preserve">−8% /L</w:t>
+            </w:r>
+          </w:p>
+        </w:tc>
+        <w:tc>
+          <w:tcPr>
+            <w:tcW w:type="dxa" w:w="2200"/>
+            <w:shd w:fill="eef3f8" w:val="clear"/>
+            <w:tcMar>
+              <w:top w:type="dxa" w:w="70"/>
+              <w:left w:type="dxa" w:w="110"/>
+              <w:bottom w:type="dxa" w:w="70"/>
+              <w:right w:type="dxa" w:w="110"/>
+            </w:tcMar>
+          </w:tcPr>
+          <w:p>
+            <w:pPr>
+              <w:jc w:val="left"/>
+            </w:pPr>
+            <w:r>
+              <w:rPr>
+                <w:rFonts w:ascii="Calibri" w:cs="Calibri" w:eastAsia="Calibri" w:hAnsi="Calibri"/>
+                <w:b w:val="false"/>
+                <w:bCs w:val="false"/>
+                <w:color w:val="1a1a2e"/>
+                <w:sz w:val="19"/>
+                <w:szCs w:val="19"/>
+              </w:rPr>
+              <w:t xml:space="preserve">taxed</w:t>
+            </w:r>
+          </w:p>
+        </w:tc>
+        <w:tc>
+          <w:tcPr>
+            <w:tcW w:type="dxa" w:w="4300"/>
+            <w:shd w:fill="eef3f8" w:val="clear"/>
+            <w:tcMar>
+              <w:top w:type="dxa" w:w="70"/>
+              <w:left w:type="dxa" w:w="110"/>
+              <w:bottom w:type="dxa" w:w="70"/>
+              <w:right w:type="dxa" w:w="110"/>
+            </w:tcMar>
+          </w:tcPr>
+          <w:p>
+            <w:pPr>
+              <w:jc w:val="left"/>
+            </w:pPr>
+            <w:r>
+              <w:rPr>
+                <w:rFonts w:ascii="Calibri" w:cs="Calibri" w:eastAsia="Calibri" w:hAnsi="Calibri"/>
+                <w:b w:val="false"/>
+                <w:bCs w:val="false"/>
+                <w:color w:val="1a1a2e"/>
+                <w:sz w:val="19"/>
+                <w:szCs w:val="19"/>
+              </w:rPr>
+              <w:t xml:space="preserve">mild; cascades into freight</w:t>
+            </w:r>
+          </w:p>
+        </w:tc>
+      </w:tr>
+      <w:tr>
+        <w:tc>
+          <w:tcPr>
+            <w:tcW w:type="dxa" w:w="2000"/>
+            <w:shd w:fill="ffffff" w:val="clear"/>
+            <w:tcMar>
+              <w:top w:type="dxa" w:w="70"/>
+              <w:left w:type="dxa" w:w="110"/>
+              <w:bottom w:type="dxa" w:w="70"/>
+              <w:right w:type="dxa" w:w="110"/>
+            </w:tcMar>
+          </w:tcPr>
+          <w:p>
+            <w:pPr>
+              <w:jc w:val="left"/>
+            </w:pPr>
+            <w:r>
+              <w:rPr>
+                <w:rFonts w:ascii="Calibri" w:cs="Calibri" w:eastAsia="Calibri" w:hAnsi="Calibri"/>
+                <w:b w:val="false"/>
+                <w:bCs w:val="false"/>
+                <w:color w:val="1a1a2e"/>
+                <w:sz w:val="19"/>
+                <w:szCs w:val="19"/>
+              </w:rPr>
+              <w:t xml:space="preserve">CBG in CNG</w:t>
+            </w:r>
+          </w:p>
+        </w:tc>
+        <w:tc>
+          <w:tcPr>
+            <w:tcW w:type="dxa" w:w="1300"/>
+            <w:shd w:fill="ffffff" w:val="clear"/>
+            <w:tcMar>
+              <w:top w:type="dxa" w:w="70"/>
+              <w:left w:type="dxa" w:w="110"/>
+              <w:bottom w:type="dxa" w:w="70"/>
+              <w:right w:type="dxa" w:w="110"/>
+            </w:tcMar>
+          </w:tcPr>
+          <w:p>
+            <w:pPr>
+              <w:jc w:val="left"/>
+            </w:pPr>
+            <w:r>
+              <w:rPr>
+                <w:rFonts w:ascii="Calibri" w:cs="Calibri" w:eastAsia="Calibri" w:hAnsi="Calibri"/>
+                <w:b w:val="false"/>
+                <w:bCs w:val="false"/>
+                <w:color w:val="1a1a2e"/>
+                <w:sz w:val="19"/>
+                <w:szCs w:val="19"/>
+              </w:rPr>
+              <w:t xml:space="preserve">~0% /kg</w:t>
+            </w:r>
+          </w:p>
+        </w:tc>
+        <w:tc>
+          <w:tcPr>
+            <w:tcW w:type="dxa" w:w="2200"/>
+            <w:shd w:fill="ffffff" w:val="clear"/>
+            <w:tcMar>
+              <w:top w:type="dxa" w:w="70"/>
+              <w:left w:type="dxa" w:w="110"/>
+              <w:bottom w:type="dxa" w:w="70"/>
+              <w:right w:type="dxa" w:w="110"/>
+            </w:tcMar>
+          </w:tcPr>
+          <w:p>
+            <w:pPr>
+              <w:jc w:val="left"/>
+            </w:pPr>
+            <w:r>
+              <w:rPr>
+                <w:rFonts w:ascii="Calibri" w:cs="Calibri" w:eastAsia="Calibri" w:hAnsi="Calibri"/>
+                <w:b w:val="false"/>
+                <w:bCs w:val="false"/>
+                <w:color w:val="1a1a2e"/>
+                <w:sz w:val="19"/>
+                <w:szCs w:val="19"/>
+              </w:rPr>
+              <w:t xml:space="preserve">lightly taxed</w:t>
+            </w:r>
+          </w:p>
+        </w:tc>
+        <w:tc>
+          <w:tcPr>
+            <w:tcW w:type="dxa" w:w="4300"/>
+            <w:shd w:fill="ffffff" w:val="clear"/>
+            <w:tcMar>
+              <w:top w:type="dxa" w:w="70"/>
+              <w:left w:type="dxa" w:w="110"/>
+              <w:bottom w:type="dxa" w:w="70"/>
+              <w:right w:type="dxa" w:w="110"/>
+            </w:tcMar>
+          </w:tcPr>
+          <w:p>
+            <w:pPr>
+              <w:jc w:val="left"/>
+            </w:pPr>
+            <w:r>
+              <w:rPr>
+                <w:rFonts w:ascii="Calibri" w:cs="Calibri" w:eastAsia="Calibri" w:hAnsi="Calibri"/>
+                <w:b w:val="false"/>
+                <w:bCs w:val="false"/>
+                <w:color w:val="1a1a2e"/>
+                <w:sz w:val="19"/>
+                <w:szCs w:val="19"/>
+              </w:rPr>
+              <w:t xml:space="preserve">nobody — the honest blend</w:t>
+            </w:r>
+          </w:p>
+        </w:tc>
+      </w:tr>
+      <w:tr>
+        <w:tc>
+          <w:tcPr>
+            <w:tcW w:type="dxa" w:w="2000"/>
+            <w:shd w:fill="eef3f8" w:val="clear"/>
+            <w:tcMar>
+              <w:top w:type="dxa" w:w="70"/>
+              <w:left w:type="dxa" w:w="110"/>
+              <w:bottom w:type="dxa" w:w="70"/>
+              <w:right w:type="dxa" w:w="110"/>
+            </w:tcMar>
+          </w:tcPr>
+          <w:p>
+            <w:pPr>
+              <w:jc w:val="left"/>
+            </w:pPr>
+            <w:r>
+              <w:rPr>
+                <w:rFonts w:ascii="Calibri" w:cs="Calibri" w:eastAsia="Calibri" w:hAnsi="Calibri"/>
+                <w:b w:val="false"/>
+                <w:bCs w:val="false"/>
+                <w:color w:val="1a1a2e"/>
+                <w:sz w:val="19"/>
+                <w:szCs w:val="19"/>
+              </w:rPr>
+              <w:t xml:space="preserve">DME in LPG</w:t>
+            </w:r>
+          </w:p>
+        </w:tc>
+        <w:tc>
+          <w:tcPr>
+            <w:tcW w:type="dxa" w:w="1300"/>
+            <w:shd w:fill="eef3f8" w:val="clear"/>
+            <w:tcMar>
+              <w:top w:type="dxa" w:w="70"/>
+              <w:left w:type="dxa" w:w="110"/>
+              <w:bottom w:type="dxa" w:w="70"/>
+              <w:right w:type="dxa" w:w="110"/>
+            </w:tcMar>
+          </w:tcPr>
+          <w:p>
+            <w:pPr>
+              <w:jc w:val="left"/>
+            </w:pPr>
+            <w:r>
+              <w:rPr>
+                <w:rFonts w:ascii="Calibri" w:cs="Calibri" w:eastAsia="Calibri" w:hAnsi="Calibri"/>
+                <w:b w:val="false"/>
+                <w:bCs w:val="false"/>
+                <w:color w:val="1a1a2e"/>
+                <w:sz w:val="19"/>
+                <w:szCs w:val="19"/>
+              </w:rPr>
+              <w:t xml:space="preserve">−37% /kg</w:t>
+            </w:r>
+          </w:p>
+        </w:tc>
+        <w:tc>
+          <w:tcPr>
+            <w:tcW w:type="dxa" w:w="2200"/>
+            <w:shd w:fill="eef3f8" w:val="clear"/>
+            <w:tcMar>
+              <w:top w:type="dxa" w:w="70"/>
+              <w:left w:type="dxa" w:w="110"/>
+              <w:bottom w:type="dxa" w:w="70"/>
+              <w:right w:type="dxa" w:w="110"/>
+            </w:tcMar>
+          </w:tcPr>
+          <w:p>
+            <w:pPr>
+              <w:jc w:val="left"/>
+            </w:pPr>
+            <w:r>
+              <w:rPr>
+                <w:rFonts w:ascii="Calibri" w:cs="Calibri" w:eastAsia="Calibri" w:hAnsi="Calibri"/>
+                <w:b w:val="false"/>
+                <w:bCs w:val="false"/>
+                <w:color w:val="1a1a2e"/>
+                <w:sz w:val="19"/>
+                <w:szCs w:val="19"/>
+              </w:rPr>
+              <w:t xml:space="preserve">subsidised</w:t>
+            </w:r>
+          </w:p>
+        </w:tc>
+        <w:tc>
+          <w:tcPr>
+            <w:tcW w:type="dxa" w:w="4300"/>
+            <w:shd w:fill="eef3f8" w:val="clear"/>
+            <w:tcMar>
+              <w:top w:type="dxa" w:w="70"/>
+              <w:left w:type="dxa" w:w="110"/>
+              <w:bottom w:type="dxa" w:w="70"/>
+              <w:right w:type="dxa" w:w="110"/>
+            </w:tcMar>
+          </w:tcPr>
+          <w:p>
+            <w:pPr>
+              <w:jc w:val="left"/>
+            </w:pPr>
+            <w:r>
+              <w:rPr>
+                <w:rFonts w:ascii="Calibri" w:cs="Calibri" w:eastAsia="Calibri" w:hAnsi="Calibri"/>
+                <w:b w:val="false"/>
+                <w:bCs w:val="false"/>
+                <w:color w:val="1a1a2e"/>
+                <w:sz w:val="19"/>
+                <w:szCs w:val="19"/>
+              </w:rPr>
+              <w:t xml:space="preserve">consumer AND exchequer pay</w:t>
+            </w:r>
+          </w:p>
+        </w:tc>
+      </w:tr>
+    </w:tbl>
+    <w:p>
+      <w:pPr>
+        <w:spacing w:after="120" w:before="0"/>
+      </w:pPr>
+      <w:r>
+        <w:rPr>
+          <w:rFonts w:ascii="Calibri" w:cs="Calibri" w:eastAsia="Calibri" w:hAnsi="Calibri"/>
+          <w:color w:val="1a1a2e"/>
+          <w:sz w:val="21"/>
+          <w:szCs w:val="21"/>
+        </w:rPr>
+        <w:t xml:space="preserve"/>
+      </w:r>
+    </w:p>
+    <w:p>
+      <w:pPr>
+        <w:spacing w:after="160" w:before="0"/>
+      </w:pPr>
+      <w:r>
+        <w:rPr>
+          <w:rFonts w:ascii="Calibri" w:cs="Calibri" w:eastAsia="Calibri" w:hAnsi="Calibri"/>
+          <w:color w:val="1a1a2e"/>
+          <w:sz w:val="21"/>
+          <w:szCs w:val="21"/>
+        </w:rPr>
+        <w:t xml:space="preserve">The economics do not clear either: energy-neutral DME must price at ≤₹32.7/kg (LPG import parity ₹52 × the energy ratio), but methanol-route DME costs ₹33.6/kg in feedstock alone at imported methanol — swapping a propane import for a methanol import at a worse ₹/MJ. Import substitution is honest only on domestic-carbon routes (coal-gasification methanol at ₹15–18/kg, or bio-DME), and DME20 would need 6.3 MMT/yr of DME — roughly six times India's methanol output. If DME blending proceeds, two guardrails follow from this paper's framework: energy-parity cylinder pricing (₹761 for a DME20 cylinder at today's ₹803, or equivalently more kilograms per cylinder), and domestic-carbon DME only.</w:t>
+      </w:r>
+    </w:p>
+    <w:p>
+      <w:pPr>
+        <w:spacing w:after="160" w:before="0"/>
+      </w:pPr>
+      <w:r>
+        <w:rPr>
+          <w:rFonts w:ascii="Calibri" w:cs="Calibri" w:eastAsia="Calibri" w:hAnsi="Calibri"/>
+          <w:i/>
+          <w:iCs/>
+          <w:color w:val="5a5a6e"/>
+          <w:sz w:val="18"/>
+          <w:szCs w:val="18"/>
+        </w:rPr>
+        <w:t xml:space="preserve">Assumptions and caveats: LERC's 5.26% is a burner thermal-efficiency figure at DME20; field behaviour and older stoves may differ, and the linear scaling to DME5/10 is an estimate. IS 18698:2024 caps blends at 20% — beyond it, DME attacks conventional elastomer seals and LERC's compatibility work is the binding reference. The whole-pool blend is a ceiling scenario; a phased rollout scales linearly. Cylinder price (Delhi ₹803), PMUY parameters and LPG LHV (45.5–46.3 by season mix) are levers in dme_lpg_blending.py.</w:t>
+      </w:r>
+    </w:p>
+    <w:p>
+      <w:pPr>
+        <w:pStyle w:val="Heading1"/>
+        <w:spacing w:after="160" w:before="320"/>
+      </w:pPr>
+      <w:r>
+        <w:rPr>
+          <w:rFonts w:ascii="Calibri" w:cs="Calibri" w:eastAsia="Calibri" w:hAnsi="Calibri"/>
+          <w:b/>
+          <w:bCs/>
+          <w:color w:val="0f4c81"/>
+          <w:sz w:val="28"/>
+          <w:szCs w:val="28"/>
+        </w:rPr>
+        <w:t xml:space="preserve">11. Caveats and sources</w:t>
       </w:r>
     </w:p>
     <w:p>
@@ -13729,6 +15142,25 @@
           <w:sz w:val="21"/>
           <w:szCs w:val="21"/>
         </w:rPr>
+        <w:t xml:space="preserve">DME side: LERC (LPG Equipment Research Centre, Bengaluru) DME-LPG compatibility and IS 4246 thermal-efficiency work (−5.26% at DME20); BIS IS 18698:2024 (20% blend cap); PPAC LPG consumption; PMUY subsidy parameters.</w:t>
+      </w:r>
+    </w:p>
+    <w:p>
+      <w:pPr>
+        <w:pStyle w:val="ListParagraph"/>
+        <w:numPr>
+          <w:ilvl w:val="0"/>
+          <w:numId w:val="2"/>
+        </w:numPr>
+        <w:spacing w:after="100"/>
+      </w:pPr>
+      <w:r>
+        <w:rPr>
+          <w:rFonts w:ascii="Calibri" w:cs="Calibri" w:eastAsia="Calibri" w:hAnsi="Calibri"/>
+          <w:color w:val="1a1a2e"/>
+          <w:sz w:val="21"/>
+          <w:szCs w:val="21"/>
+        </w:rPr>
         <w:t xml:space="preserve">RON side: BIS IS 2796 fuel specification; ethanol blending-RON literature (108–115, central 112); retail XP95/Speed-95 price spreads; compression-ratio/efficiency literature (~1.5% per CR point).</w:t>
       </w:r>
     </w:p>
@@ -16571,6 +18003,122 @@
                 <w:szCs w:val="19"/>
               </w:rPr>
               <w:t xml:space="preserve">Flex-Fuel Vehicle · Compression Ratio · National Biofuel Policy</w:t>
+            </w:r>
+          </w:p>
+        </w:tc>
+      </w:tr>
+      <w:tr>
+        <w:tc>
+          <w:tcPr>
+            <w:tcW w:type="dxa" w:w="2300"/>
+            <w:shd w:fill="ffffff" w:val="clear"/>
+            <w:tcMar>
+              <w:top w:type="dxa" w:w="70"/>
+              <w:left w:type="dxa" w:w="110"/>
+              <w:bottom w:type="dxa" w:w="70"/>
+              <w:right w:type="dxa" w:w="110"/>
+            </w:tcMar>
+          </w:tcPr>
+          <w:p>
+            <w:pPr>
+              <w:jc w:val="left"/>
+            </w:pPr>
+            <w:r>
+              <w:rPr>
+                <w:rFonts w:ascii="Calibri" w:cs="Calibri" w:eastAsia="Calibri" w:hAnsi="Calibri"/>
+                <w:b w:val="false"/>
+                <w:bCs w:val="false"/>
+                <w:color w:val="1a1a2e"/>
+                <w:sz w:val="19"/>
+                <w:szCs w:val="19"/>
+              </w:rPr>
+              <w:t xml:space="preserve">DME / LERC</w:t>
+            </w:r>
+          </w:p>
+        </w:tc>
+        <w:tc>
+          <w:tcPr>
+            <w:tcW w:type="dxa" w:w="7500"/>
+            <w:shd w:fill="ffffff" w:val="clear"/>
+            <w:tcMar>
+              <w:top w:type="dxa" w:w="70"/>
+              <w:left w:type="dxa" w:w="110"/>
+              <w:bottom w:type="dxa" w:w="70"/>
+              <w:right w:type="dxa" w:w="110"/>
+            </w:tcMar>
+          </w:tcPr>
+          <w:p>
+            <w:pPr>
+              <w:jc w:val="left"/>
+            </w:pPr>
+            <w:r>
+              <w:rPr>
+                <w:rFonts w:ascii="Calibri" w:cs="Calibri" w:eastAsia="Calibri" w:hAnsi="Calibri"/>
+                <w:b w:val="false"/>
+                <w:bCs w:val="false"/>
+                <w:color w:val="1a1a2e"/>
+                <w:sz w:val="19"/>
+                <w:szCs w:val="19"/>
+              </w:rPr>
+              <w:t xml:space="preserve">Dimethyl Ether (blendable into LPG to 20% under IS 18698:2024) / LPG Equipment Research Centre, Bengaluru</w:t>
+            </w:r>
+          </w:p>
+        </w:tc>
+      </w:tr>
+      <w:tr>
+        <w:tc>
+          <w:tcPr>
+            <w:tcW w:type="dxa" w:w="2300"/>
+            <w:shd w:fill="eef3f8" w:val="clear"/>
+            <w:tcMar>
+              <w:top w:type="dxa" w:w="70"/>
+              <w:left w:type="dxa" w:w="110"/>
+              <w:bottom w:type="dxa" w:w="70"/>
+              <w:right w:type="dxa" w:w="110"/>
+            </w:tcMar>
+          </w:tcPr>
+          <w:p>
+            <w:pPr>
+              <w:jc w:val="left"/>
+            </w:pPr>
+            <w:r>
+              <w:rPr>
+                <w:rFonts w:ascii="Calibri" w:cs="Calibri" w:eastAsia="Calibri" w:hAnsi="Calibri"/>
+                <w:b w:val="false"/>
+                <w:bCs w:val="false"/>
+                <w:color w:val="1a1a2e"/>
+                <w:sz w:val="19"/>
+                <w:szCs w:val="19"/>
+              </w:rPr>
+              <w:t xml:space="preserve">LPG / PMUY</w:t>
+            </w:r>
+          </w:p>
+        </w:tc>
+        <w:tc>
+          <w:tcPr>
+            <w:tcW w:type="dxa" w:w="7500"/>
+            <w:shd w:fill="eef3f8" w:val="clear"/>
+            <w:tcMar>
+              <w:top w:type="dxa" w:w="70"/>
+              <w:left w:type="dxa" w:w="110"/>
+              <w:bottom w:type="dxa" w:w="70"/>
+              <w:right w:type="dxa" w:w="110"/>
+            </w:tcMar>
+          </w:tcPr>
+          <w:p>
+            <w:pPr>
+              <w:jc w:val="left"/>
+            </w:pPr>
+            <w:r>
+              <w:rPr>
+                <w:rFonts w:ascii="Calibri" w:cs="Calibri" w:eastAsia="Calibri" w:hAnsi="Calibri"/>
+                <w:b w:val="false"/>
+                <w:bCs w:val="false"/>
+                <w:color w:val="1a1a2e"/>
+                <w:sz w:val="19"/>
+                <w:szCs w:val="19"/>
+              </w:rPr>
+              <w:t xml:space="preserve">Liquefied Petroleum Gas / Pradhan Mantri Ujjwala Yojana (₹300-per-cylinder subsidy to ~10.3 cr households)</w:t>
             </w:r>
           </w:p>
         </w:tc>

</xml_diff>